<commit_message>
feat(report): update pdf and add damping sensitivity
</commit_message>
<xml_diff>
--- a/reports/2026-05-22-progress/FG_MEET_progress_report_2026-05-22.docx
+++ b/reports/2026-05-22-progress/FG_MEET_progress_report_2026-05-22.docx
@@ -21,7 +21,7 @@
         <w:jc w:val="center"/>
       </w:pPr>
       <w:r>
-        <w:t>模型目标、方法路线、问题排查、正确/错误结果与最终验证证据 | 2026-05-22</w:t>
+        <w:t>模型目标、方法路线、问题排查、正确/错误结果、动力补充与 PDF 版汇报 | 2026-05-22/23</w:t>
       </w:r>
     </w:p>
     <w:p/>
@@ -101,7 +101,7 @@
       <w:r>
         <w:drawing>
           <wp:inline xmlns:a="http://schemas.openxmlformats.org/drawingml/2006/main" xmlns:pic="http://schemas.openxmlformats.org/drawingml/2006/picture">
-            <wp:extent cx="6035040" cy="2792212"/>
+            <wp:extent cx="6035040" cy="3661258"/>
             <wp:docPr id="2" name="Picture 2"/>
             <wp:cNvGraphicFramePr>
               <a:graphicFrameLocks noChangeAspect="1"/>
@@ -122,7 +122,7 @@
                   <pic:spPr>
                     <a:xfrm>
                       <a:off x="0" y="0"/>
-                      <a:ext cx="6035040" cy="2792212"/>
+                      <a:ext cx="6035040" cy="3661258"/>
                     </a:xfrm>
                     <a:prstGeom prst="rect"/>
                   </pic:spPr>
@@ -467,7 +467,7 @@
       <w:r>
         <w:drawing>
           <wp:inline xmlns:a="http://schemas.openxmlformats.org/drawingml/2006/main" xmlns:pic="http://schemas.openxmlformats.org/drawingml/2006/picture">
-            <wp:extent cx="6035040" cy="2684819"/>
+            <wp:extent cx="6035040" cy="2893724"/>
             <wp:docPr id="4" name="Picture 4"/>
             <wp:cNvGraphicFramePr>
               <a:graphicFrameLocks noChangeAspect="1"/>
@@ -488,7 +488,7 @@
                   <pic:spPr>
                     <a:xfrm>
                       <a:off x="0" y="0"/>
-                      <a:ext cx="6035040" cy="2684819"/>
+                      <a:ext cx="6035040" cy="2893724"/>
                     </a:xfrm>
                     <a:prstGeom prst="rect"/>
                   </pic:spPr>
@@ -4411,7 +4411,2763 @@
           <w:color w:val="2E74B5"/>
           <w:sz w:val="32"/>
         </w:rPr>
-        <w:t>8. 下一步</w:t>
+        <w:t>8. 动力代表算例与 30x30 模态结果</w:t>
+      </w:r>
+    </w:p>
+    <w:tbl>
+      <w:tblPr>
+        <w:tblStyle w:val="TableGrid"/>
+        <w:tblW w:type="auto" w:w="0"/>
+        <w:jc w:val="center"/>
+        <w:tblLook w:firstColumn="1" w:firstRow="1" w:lastColumn="0" w:lastRow="0" w:noHBand="0" w:noVBand="1" w:val="04A0"/>
+      </w:tblPr>
+      <w:tblGrid>
+        <w:gridCol w:w="1694"/>
+        <w:gridCol w:w="1694"/>
+        <w:gridCol w:w="1694"/>
+        <w:gridCol w:w="1694"/>
+        <w:gridCol w:w="1694"/>
+        <w:gridCol w:w="1694"/>
+      </w:tblGrid>
+      <w:tr>
+        <w:tc>
+          <w:tcPr>
+            <w:tcW w:type="dxa" w:w="1694"/>
+            <w:vAlign w:val="center"/>
+            <w:shd w:fill="F2F4F7"/>
+          </w:tcPr>
+          <w:p>
+            <w:pPr>
+              <w:spacing w:after="0"/>
+            </w:pPr>
+            <w:r/>
+            <w:r>
+              <w:rPr>
+                <w:rFonts w:ascii="Calibri" w:hAnsi="Calibri" w:eastAsia="Microsoft YaHei"/>
+                <w:b/>
+                <w:sz w:val="16"/>
+              </w:rPr>
+              <w:t>方法</w:t>
+            </w:r>
+          </w:p>
+        </w:tc>
+        <w:tc>
+          <w:tcPr>
+            <w:tcW w:type="dxa" w:w="1694"/>
+            <w:vAlign w:val="center"/>
+            <w:shd w:fill="F2F4F7"/>
+          </w:tcPr>
+          <w:p>
+            <w:pPr>
+              <w:spacing w:after="0"/>
+            </w:pPr>
+            <w:r/>
+            <w:r>
+              <w:rPr>
+                <w:rFonts w:ascii="Calibri" w:hAnsi="Calibri" w:eastAsia="Microsoft YaHei"/>
+                <w:b/>
+                <w:sz w:val="16"/>
+              </w:rPr>
+              <w:t>静态中心 mm</w:t>
+            </w:r>
+          </w:p>
+        </w:tc>
+        <w:tc>
+          <w:tcPr>
+            <w:tcW w:type="dxa" w:w="1694"/>
+            <w:vAlign w:val="center"/>
+            <w:shd w:fill="F2F4F7"/>
+          </w:tcPr>
+          <w:p>
+            <w:pPr>
+              <w:spacing w:after="0"/>
+            </w:pPr>
+            <w:r/>
+            <w:r>
+              <w:rPr>
+                <w:rFonts w:ascii="Calibri" w:hAnsi="Calibri" w:eastAsia="Microsoft YaHei"/>
+                <w:b/>
+                <w:sz w:val="16"/>
+              </w:rPr>
+              <w:t>动力峰值 mm</w:t>
+            </w:r>
+          </w:p>
+        </w:tc>
+        <w:tc>
+          <w:tcPr>
+            <w:tcW w:type="dxa" w:w="1694"/>
+            <w:vAlign w:val="center"/>
+            <w:shd w:fill="F2F4F7"/>
+          </w:tcPr>
+          <w:p>
+            <w:pPr>
+              <w:spacing w:after="0"/>
+            </w:pPr>
+            <w:r/>
+            <w:r>
+              <w:rPr>
+                <w:rFonts w:ascii="Calibri" w:hAnsi="Calibri" w:eastAsia="Microsoft YaHei"/>
+                <w:b/>
+                <w:sz w:val="16"/>
+              </w:rPr>
+              <w:t>峰值时间 ms</w:t>
+            </w:r>
+          </w:p>
+        </w:tc>
+        <w:tc>
+          <w:tcPr>
+            <w:tcW w:type="dxa" w:w="1694"/>
+            <w:vAlign w:val="center"/>
+            <w:shd w:fill="F2F4F7"/>
+          </w:tcPr>
+          <w:p>
+            <w:pPr>
+              <w:spacing w:after="0"/>
+            </w:pPr>
+            <w:r/>
+            <w:r>
+              <w:rPr>
+                <w:rFonts w:ascii="Calibri" w:hAnsi="Calibri" w:eastAsia="Microsoft YaHei"/>
+                <w:b/>
+                <w:sz w:val="16"/>
+              </w:rPr>
+              <w:t>一阶频率 Hz</w:t>
+            </w:r>
+          </w:p>
+        </w:tc>
+        <w:tc>
+          <w:tcPr>
+            <w:tcW w:type="dxa" w:w="1694"/>
+            <w:vAlign w:val="center"/>
+            <w:shd w:fill="F2F4F7"/>
+          </w:tcPr>
+          <w:p>
+            <w:pPr>
+              <w:spacing w:after="0"/>
+            </w:pPr>
+            <w:r/>
+            <w:r>
+              <w:rPr>
+                <w:rFonts w:ascii="Calibri" w:hAnsi="Calibri" w:eastAsia="Microsoft YaHei"/>
+                <w:b/>
+                <w:sz w:val="16"/>
+              </w:rPr>
+              <w:t>最大 θ 跨度 K</w:t>
+            </w:r>
+          </w:p>
+        </w:tc>
+      </w:tr>
+      <w:tr>
+        <w:tc>
+          <w:tcPr>
+            <w:tcW w:type="dxa" w:w="1694"/>
+            <w:vAlign w:val="center"/>
+          </w:tcPr>
+          <w:p>
+            <w:pPr>
+              <w:spacing w:after="0"/>
+            </w:pPr>
+            <w:r/>
+            <w:r>
+              <w:rPr>
+                <w:rFonts w:ascii="Calibri" w:hAnsi="Calibri" w:eastAsia="Microsoft YaHei"/>
+                <w:b w:val="0"/>
+                <w:sz w:val="16"/>
+              </w:rPr>
+              <w:t>10x10 Newmark pilot</w:t>
+            </w:r>
+          </w:p>
+        </w:tc>
+        <w:tc>
+          <w:tcPr>
+            <w:tcW w:type="dxa" w:w="1694"/>
+            <w:vAlign w:val="center"/>
+          </w:tcPr>
+          <w:p>
+            <w:pPr>
+              <w:spacing w:after="0"/>
+            </w:pPr>
+            <w:r/>
+            <w:r>
+              <w:rPr>
+                <w:rFonts w:ascii="Calibri" w:hAnsi="Calibri" w:eastAsia="Microsoft YaHei"/>
+                <w:b w:val="0"/>
+                <w:sz w:val="16"/>
+              </w:rPr>
+              <w:t>-2.1284</w:t>
+            </w:r>
+          </w:p>
+        </w:tc>
+        <w:tc>
+          <w:tcPr>
+            <w:tcW w:type="dxa" w:w="1694"/>
+            <w:vAlign w:val="center"/>
+          </w:tcPr>
+          <w:p>
+            <w:pPr>
+              <w:spacing w:after="0"/>
+            </w:pPr>
+            <w:r/>
+            <w:r>
+              <w:rPr>
+                <w:rFonts w:ascii="Calibri" w:hAnsi="Calibri" w:eastAsia="Microsoft YaHei"/>
+                <w:b w:val="0"/>
+                <w:sz w:val="16"/>
+              </w:rPr>
+              <w:t>-4.4995</w:t>
+            </w:r>
+          </w:p>
+        </w:tc>
+        <w:tc>
+          <w:tcPr>
+            <w:tcW w:type="dxa" w:w="1694"/>
+            <w:vAlign w:val="center"/>
+          </w:tcPr>
+          <w:p>
+            <w:pPr>
+              <w:spacing w:after="0"/>
+            </w:pPr>
+            <w:r/>
+            <w:r>
+              <w:rPr>
+                <w:rFonts w:ascii="Calibri" w:hAnsi="Calibri" w:eastAsia="Microsoft YaHei"/>
+                <w:b w:val="0"/>
+                <w:sz w:val="16"/>
+              </w:rPr>
+              <w:t>28.90</w:t>
+            </w:r>
+          </w:p>
+        </w:tc>
+        <w:tc>
+          <w:tcPr>
+            <w:tcW w:type="dxa" w:w="1694"/>
+            <w:vAlign w:val="center"/>
+          </w:tcPr>
+          <w:p>
+            <w:pPr>
+              <w:spacing w:after="0"/>
+            </w:pPr>
+            <w:r/>
+            <w:r>
+              <w:rPr>
+                <w:rFonts w:ascii="Calibri" w:hAnsi="Calibri" w:eastAsia="Microsoft YaHei"/>
+                <w:b w:val="0"/>
+                <w:sz w:val="16"/>
+              </w:rPr>
+              <w:t>52.20</w:t>
+            </w:r>
+          </w:p>
+        </w:tc>
+        <w:tc>
+          <w:tcPr>
+            <w:tcW w:type="dxa" w:w="1694"/>
+            <w:vAlign w:val="center"/>
+          </w:tcPr>
+          <w:p>
+            <w:pPr>
+              <w:spacing w:after="0"/>
+            </w:pPr>
+            <w:r/>
+            <w:r>
+              <w:rPr>
+                <w:rFonts w:ascii="Calibri" w:hAnsi="Calibri" w:eastAsia="Microsoft YaHei"/>
+                <w:b w:val="0"/>
+                <w:sz w:val="16"/>
+              </w:rPr>
+              <w:t>5.1311</w:t>
+            </w:r>
+          </w:p>
+        </w:tc>
+      </w:tr>
+      <w:tr>
+        <w:tc>
+          <w:tcPr>
+            <w:tcW w:type="dxa" w:w="1694"/>
+            <w:vAlign w:val="center"/>
+          </w:tcPr>
+          <w:p>
+            <w:pPr>
+              <w:spacing w:after="0"/>
+            </w:pPr>
+            <w:r/>
+            <w:r>
+              <w:rPr>
+                <w:rFonts w:ascii="Calibri" w:hAnsi="Calibri" w:eastAsia="Microsoft YaHei"/>
+                <w:b w:val="0"/>
+                <w:sz w:val="16"/>
+              </w:rPr>
+              <w:t>30x30 8 阶模态</w:t>
+            </w:r>
+          </w:p>
+        </w:tc>
+        <w:tc>
+          <w:tcPr>
+            <w:tcW w:type="dxa" w:w="1694"/>
+            <w:vAlign w:val="center"/>
+          </w:tcPr>
+          <w:p>
+            <w:pPr>
+              <w:spacing w:after="0"/>
+            </w:pPr>
+            <w:r/>
+            <w:r>
+              <w:rPr>
+                <w:rFonts w:ascii="Calibri" w:hAnsi="Calibri" w:eastAsia="Microsoft YaHei"/>
+                <w:b w:val="0"/>
+                <w:sz w:val="16"/>
+              </w:rPr>
+              <w:t>-2.2947</w:t>
+            </w:r>
+          </w:p>
+        </w:tc>
+        <w:tc>
+          <w:tcPr>
+            <w:tcW w:type="dxa" w:w="1694"/>
+            <w:vAlign w:val="center"/>
+          </w:tcPr>
+          <w:p>
+            <w:pPr>
+              <w:spacing w:after="0"/>
+            </w:pPr>
+            <w:r/>
+            <w:r>
+              <w:rPr>
+                <w:rFonts w:ascii="Calibri" w:hAnsi="Calibri" w:eastAsia="Microsoft YaHei"/>
+                <w:b w:val="0"/>
+                <w:sz w:val="16"/>
+              </w:rPr>
+              <w:t>-4.4279</w:t>
+            </w:r>
+          </w:p>
+        </w:tc>
+        <w:tc>
+          <w:tcPr>
+            <w:tcW w:type="dxa" w:w="1694"/>
+            <w:vAlign w:val="center"/>
+          </w:tcPr>
+          <w:p>
+            <w:pPr>
+              <w:spacing w:after="0"/>
+            </w:pPr>
+            <w:r/>
+            <w:r>
+              <w:rPr>
+                <w:rFonts w:ascii="Calibri" w:hAnsi="Calibri" w:eastAsia="Microsoft YaHei"/>
+                <w:b w:val="0"/>
+                <w:sz w:val="16"/>
+              </w:rPr>
+              <w:t>9.50</w:t>
+            </w:r>
+          </w:p>
+        </w:tc>
+        <w:tc>
+          <w:tcPr>
+            <w:tcW w:type="dxa" w:w="1694"/>
+            <w:vAlign w:val="center"/>
+          </w:tcPr>
+          <w:p>
+            <w:pPr>
+              <w:spacing w:after="0"/>
+            </w:pPr>
+            <w:r/>
+            <w:r>
+              <w:rPr>
+                <w:rFonts w:ascii="Calibri" w:hAnsi="Calibri" w:eastAsia="Microsoft YaHei"/>
+                <w:b w:val="0"/>
+                <w:sz w:val="16"/>
+              </w:rPr>
+              <w:t>52.20</w:t>
+            </w:r>
+          </w:p>
+        </w:tc>
+        <w:tc>
+          <w:tcPr>
+            <w:tcW w:type="dxa" w:w="1694"/>
+            <w:vAlign w:val="center"/>
+          </w:tcPr>
+          <w:p>
+            <w:pPr>
+              <w:spacing w:after="0"/>
+            </w:pPr>
+            <w:r/>
+            <w:r>
+              <w:rPr>
+                <w:rFonts w:ascii="Calibri" w:hAnsi="Calibri" w:eastAsia="Microsoft YaHei"/>
+                <w:b w:val="0"/>
+                <w:sz w:val="16"/>
+              </w:rPr>
+              <w:t>5.0398</w:t>
+            </w:r>
+          </w:p>
+        </w:tc>
+      </w:tr>
+      <w:tr>
+        <w:tc>
+          <w:tcPr>
+            <w:tcW w:type="dxa" w:w="1694"/>
+            <w:vAlign w:val="center"/>
+          </w:tcPr>
+          <w:p>
+            <w:pPr>
+              <w:spacing w:after="0"/>
+            </w:pPr>
+            <w:r/>
+            <w:r>
+              <w:rPr>
+                <w:rFonts w:ascii="Calibri" w:hAnsi="Calibri" w:eastAsia="Microsoft YaHei"/>
+                <w:b w:val="0"/>
+                <w:sz w:val="16"/>
+              </w:rPr>
+              <w:t>30x30 16 阶模态</w:t>
+            </w:r>
+          </w:p>
+        </w:tc>
+        <w:tc>
+          <w:tcPr>
+            <w:tcW w:type="dxa" w:w="1694"/>
+            <w:vAlign w:val="center"/>
+          </w:tcPr>
+          <w:p>
+            <w:pPr>
+              <w:spacing w:after="0"/>
+            </w:pPr>
+            <w:r/>
+            <w:r>
+              <w:rPr>
+                <w:rFonts w:ascii="Calibri" w:hAnsi="Calibri" w:eastAsia="Microsoft YaHei"/>
+                <w:b w:val="0"/>
+                <w:sz w:val="16"/>
+              </w:rPr>
+              <w:t>-2.2947</w:t>
+            </w:r>
+          </w:p>
+        </w:tc>
+        <w:tc>
+          <w:tcPr>
+            <w:tcW w:type="dxa" w:w="1694"/>
+            <w:vAlign w:val="center"/>
+          </w:tcPr>
+          <w:p>
+            <w:pPr>
+              <w:spacing w:after="0"/>
+            </w:pPr>
+            <w:r/>
+            <w:r>
+              <w:rPr>
+                <w:rFonts w:ascii="Calibri" w:hAnsi="Calibri" w:eastAsia="Microsoft YaHei"/>
+                <w:b w:val="0"/>
+                <w:sz w:val="16"/>
+              </w:rPr>
+              <w:t>-4.4270</w:t>
+            </w:r>
+          </w:p>
+        </w:tc>
+        <w:tc>
+          <w:tcPr>
+            <w:tcW w:type="dxa" w:w="1694"/>
+            <w:vAlign w:val="center"/>
+          </w:tcPr>
+          <w:p>
+            <w:pPr>
+              <w:spacing w:after="0"/>
+            </w:pPr>
+            <w:r/>
+            <w:r>
+              <w:rPr>
+                <w:rFonts w:ascii="Calibri" w:hAnsi="Calibri" w:eastAsia="Microsoft YaHei"/>
+                <w:b w:val="0"/>
+                <w:sz w:val="16"/>
+              </w:rPr>
+              <w:t>9.60</w:t>
+            </w:r>
+          </w:p>
+        </w:tc>
+        <w:tc>
+          <w:tcPr>
+            <w:tcW w:type="dxa" w:w="1694"/>
+            <w:vAlign w:val="center"/>
+          </w:tcPr>
+          <w:p>
+            <w:pPr>
+              <w:spacing w:after="0"/>
+            </w:pPr>
+            <w:r/>
+            <w:r>
+              <w:rPr>
+                <w:rFonts w:ascii="Calibri" w:hAnsi="Calibri" w:eastAsia="Microsoft YaHei"/>
+                <w:b w:val="0"/>
+                <w:sz w:val="16"/>
+              </w:rPr>
+              <w:t>52.20</w:t>
+            </w:r>
+          </w:p>
+        </w:tc>
+        <w:tc>
+          <w:tcPr>
+            <w:tcW w:type="dxa" w:w="1694"/>
+            <w:vAlign w:val="center"/>
+          </w:tcPr>
+          <w:p>
+            <w:pPr>
+              <w:spacing w:after="0"/>
+            </w:pPr>
+            <w:r/>
+            <w:r>
+              <w:rPr>
+                <w:rFonts w:ascii="Calibri" w:hAnsi="Calibri" w:eastAsia="Microsoft YaHei"/>
+                <w:b w:val="0"/>
+                <w:sz w:val="16"/>
+              </w:rPr>
+              <w:t>5.0363</w:t>
+            </w:r>
+          </w:p>
+        </w:tc>
+      </w:tr>
+    </w:tbl>
+    <w:p/>
+    <w:p>
+      <w:pPr>
+        <w:spacing w:after="160"/>
+      </w:pPr>
+      <w:r>
+        <w:rPr>
+          <w:rFonts w:ascii="Calibri" w:hAnsi="Calibri" w:eastAsia="Microsoft YaHei"/>
+          <w:b/>
+          <w:color w:val="1F4D78"/>
+          <w:sz w:val="24"/>
+        </w:rPr>
+        <w:t>图 16 动力结果总览</w:t>
+      </w:r>
+    </w:p>
+    <w:p>
+      <w:pPr>
+        <w:spacing w:before="40" w:after="160"/>
+        <w:jc w:val="center"/>
+      </w:pPr>
+      <w:r>
+        <w:drawing>
+          <wp:inline xmlns:a="http://schemas.openxmlformats.org/drawingml/2006/main" xmlns:pic="http://schemas.openxmlformats.org/drawingml/2006/picture">
+            <wp:extent cx="6035040" cy="1705905"/>
+            <wp:docPr id="16" name="Picture 16"/>
+            <wp:cNvGraphicFramePr>
+              <a:graphicFrameLocks noChangeAspect="1"/>
+            </wp:cNvGraphicFramePr>
+            <a:graphic>
+              <a:graphicData uri="http://schemas.openxmlformats.org/drawingml/2006/picture">
+                <pic:pic>
+                  <pic:nvPicPr>
+                    <pic:cNvPr id="0" name="16_dynamic_overview_table.png"/>
+                    <pic:cNvPicPr/>
+                  </pic:nvPicPr>
+                  <pic:blipFill>
+                    <a:blip r:embed="rId24"/>
+                    <a:stretch>
+                      <a:fillRect/>
+                    </a:stretch>
+                  </pic:blipFill>
+                  <pic:spPr>
+                    <a:xfrm>
+                      <a:off x="0" y="0"/>
+                      <a:ext cx="6035040" cy="1705905"/>
+                    </a:xfrm>
+                    <a:prstGeom prst="rect"/>
+                  </pic:spPr>
+                </pic:pic>
+              </a:graphicData>
+            </a:graphic>
+          </wp:inline>
+        </w:drawing>
+      </w:r>
+    </w:p>
+    <w:p>
+      <w:pPr>
+        <w:spacing w:after="160"/>
+      </w:pPr>
+      <w:r>
+        <w:rPr>
+          <w:rFonts w:ascii="Calibri" w:hAnsi="Calibri" w:eastAsia="Microsoft YaHei"/>
+          <w:b/>
+          <w:color w:val="1F4D78"/>
+          <w:sz w:val="24"/>
+        </w:rPr>
+        <w:t>图 17 10x10 Newmark pilot 摘要</w:t>
+      </w:r>
+    </w:p>
+    <w:p>
+      <w:pPr>
+        <w:spacing w:before="40" w:after="160"/>
+        <w:jc w:val="center"/>
+      </w:pPr>
+      <w:r>
+        <w:drawing>
+          <wp:inline xmlns:a="http://schemas.openxmlformats.org/drawingml/2006/main" xmlns:pic="http://schemas.openxmlformats.org/drawingml/2006/picture">
+            <wp:extent cx="6035040" cy="3073847"/>
+            <wp:docPr id="17" name="Picture 17"/>
+            <wp:cNvGraphicFramePr>
+              <a:graphicFrameLocks noChangeAspect="1"/>
+            </wp:cNvGraphicFramePr>
+            <a:graphic>
+              <a:graphicData uri="http://schemas.openxmlformats.org/drawingml/2006/picture">
+                <pic:pic>
+                  <pic:nvPicPr>
+                    <pic:cNvPr id="0" name="18_dynamic_summary_table.png"/>
+                    <pic:cNvPicPr/>
+                  </pic:nvPicPr>
+                  <pic:blipFill>
+                    <a:blip r:embed="rId25"/>
+                    <a:stretch>
+                      <a:fillRect/>
+                    </a:stretch>
+                  </pic:blipFill>
+                  <pic:spPr>
+                    <a:xfrm>
+                      <a:off x="0" y="0"/>
+                      <a:ext cx="6035040" cy="3073847"/>
+                    </a:xfrm>
+                    <a:prstGeom prst="rect"/>
+                  </pic:spPr>
+                </pic:pic>
+              </a:graphicData>
+            </a:graphic>
+          </wp:inline>
+        </w:drawing>
+      </w:r>
+    </w:p>
+    <w:p>
+      <w:pPr>
+        <w:spacing w:after="160"/>
+      </w:pPr>
+      <w:r>
+        <w:rPr>
+          <w:rFonts w:ascii="Calibri" w:hAnsi="Calibri" w:eastAsia="Microsoft YaHei"/>
+          <w:b/>
+          <w:color w:val="1F4D78"/>
+          <w:sz w:val="24"/>
+        </w:rPr>
+        <w:t>图 18 10x10 Newmark 中心挠度时程</w:t>
+      </w:r>
+    </w:p>
+    <w:p>
+      <w:pPr>
+        <w:spacing w:before="40" w:after="160"/>
+        <w:jc w:val="center"/>
+      </w:pPr>
+      <w:r>
+        <w:drawing>
+          <wp:inline xmlns:a="http://schemas.openxmlformats.org/drawingml/2006/main" xmlns:pic="http://schemas.openxmlformats.org/drawingml/2006/picture">
+            <wp:extent cx="6035040" cy="3394710"/>
+            <wp:docPr id="18" name="Picture 18"/>
+            <wp:cNvGraphicFramePr>
+              <a:graphicFrameLocks noChangeAspect="1"/>
+            </wp:cNvGraphicFramePr>
+            <a:graphic>
+              <a:graphicData uri="http://schemas.openxmlformats.org/drawingml/2006/picture">
+                <pic:pic>
+                  <pic:nvPicPr>
+                    <pic:cNvPr id="0" name="19_dynamic_center_timeseries.png"/>
+                    <pic:cNvPicPr/>
+                  </pic:nvPicPr>
+                  <pic:blipFill>
+                    <a:blip r:embed="rId26"/>
+                    <a:stretch>
+                      <a:fillRect/>
+                    </a:stretch>
+                  </pic:blipFill>
+                  <pic:spPr>
+                    <a:xfrm>
+                      <a:off x="0" y="0"/>
+                      <a:ext cx="6035040" cy="3394710"/>
+                    </a:xfrm>
+                    <a:prstGeom prst="rect"/>
+                  </pic:spPr>
+                </pic:pic>
+              </a:graphicData>
+            </a:graphic>
+          </wp:inline>
+        </w:drawing>
+      </w:r>
+    </w:p>
+    <w:p>
+      <w:pPr>
+        <w:spacing w:after="160"/>
+      </w:pPr>
+      <w:r>
+        <w:rPr>
+          <w:rFonts w:ascii="Calibri" w:hAnsi="Calibri" w:eastAsia="Microsoft YaHei"/>
+          <w:b/>
+          <w:color w:val="1F4D78"/>
+          <w:sz w:val="24"/>
+        </w:rPr>
+        <w:t>图 19 30x30 8 阶模态结果摘要</w:t>
+      </w:r>
+    </w:p>
+    <w:p>
+      <w:pPr>
+        <w:spacing w:before="40" w:after="160"/>
+        <w:jc w:val="center"/>
+      </w:pPr>
+      <w:r>
+        <w:drawing>
+          <wp:inline xmlns:a="http://schemas.openxmlformats.org/drawingml/2006/main" xmlns:pic="http://schemas.openxmlformats.org/drawingml/2006/picture">
+            <wp:extent cx="6035040" cy="3291108"/>
+            <wp:docPr id="19" name="Picture 19"/>
+            <wp:cNvGraphicFramePr>
+              <a:graphicFrameLocks noChangeAspect="1"/>
+            </wp:cNvGraphicFramePr>
+            <a:graphic>
+              <a:graphicData uri="http://schemas.openxmlformats.org/drawingml/2006/picture">
+                <pic:pic>
+                  <pic:nvPicPr>
+                    <pic:cNvPr id="0" name="22_modal30x30_summary_table.png"/>
+                    <pic:cNvPicPr/>
+                  </pic:nvPicPr>
+                  <pic:blipFill>
+                    <a:blip r:embed="rId27"/>
+                    <a:stretch>
+                      <a:fillRect/>
+                    </a:stretch>
+                  </pic:blipFill>
+                  <pic:spPr>
+                    <a:xfrm>
+                      <a:off x="0" y="0"/>
+                      <a:ext cx="6035040" cy="3291108"/>
+                    </a:xfrm>
+                    <a:prstGeom prst="rect"/>
+                  </pic:spPr>
+                </pic:pic>
+              </a:graphicData>
+            </a:graphic>
+          </wp:inline>
+        </w:drawing>
+      </w:r>
+    </w:p>
+    <w:p>
+      <w:pPr>
+        <w:spacing w:after="160"/>
+      </w:pPr>
+      <w:r>
+        <w:rPr>
+          <w:rFonts w:ascii="Calibri" w:hAnsi="Calibri" w:eastAsia="Microsoft YaHei"/>
+          <w:b/>
+          <w:color w:val="1F4D78"/>
+          <w:sz w:val="24"/>
+        </w:rPr>
+        <w:t>图 20 30x30 8 阶模态中心挠度时程</w:t>
+      </w:r>
+    </w:p>
+    <w:p>
+      <w:pPr>
+        <w:spacing w:before="40" w:after="160"/>
+        <w:jc w:val="center"/>
+      </w:pPr>
+      <w:r>
+        <w:drawing>
+          <wp:inline xmlns:a="http://schemas.openxmlformats.org/drawingml/2006/main" xmlns:pic="http://schemas.openxmlformats.org/drawingml/2006/picture">
+            <wp:extent cx="6035040" cy="3394710"/>
+            <wp:docPr id="20" name="Picture 20"/>
+            <wp:cNvGraphicFramePr>
+              <a:graphicFrameLocks noChangeAspect="1"/>
+            </wp:cNvGraphicFramePr>
+            <a:graphic>
+              <a:graphicData uri="http://schemas.openxmlformats.org/drawingml/2006/picture">
+                <pic:pic>
+                  <pic:nvPicPr>
+                    <pic:cNvPr id="0" name="23_modal30x30_center_timeseries.png"/>
+                    <pic:cNvPicPr/>
+                  </pic:nvPicPr>
+                  <pic:blipFill>
+                    <a:blip r:embed="rId28"/>
+                    <a:stretch>
+                      <a:fillRect/>
+                    </a:stretch>
+                  </pic:blipFill>
+                  <pic:spPr>
+                    <a:xfrm>
+                      <a:off x="0" y="0"/>
+                      <a:ext cx="6035040" cy="3394710"/>
+                    </a:xfrm>
+                    <a:prstGeom prst="rect"/>
+                  </pic:spPr>
+                </pic:pic>
+              </a:graphicData>
+            </a:graphic>
+          </wp:inline>
+        </w:drawing>
+      </w:r>
+    </w:p>
+    <w:p>
+      <w:pPr>
+        <w:spacing w:after="160"/>
+      </w:pPr>
+      <w:r>
+        <w:rPr>
+          <w:rFonts w:ascii="Calibri" w:hAnsi="Calibri" w:eastAsia="Microsoft YaHei"/>
+          <w:b/>
+          <w:color w:val="1F4D78"/>
+          <w:sz w:val="24"/>
+        </w:rPr>
+        <w:t>图 21 10x10 Newmark 与 30x30 模态对比</w:t>
+      </w:r>
+    </w:p>
+    <w:p>
+      <w:pPr>
+        <w:spacing w:before="40" w:after="160"/>
+        <w:jc w:val="center"/>
+      </w:pPr>
+      <w:r>
+        <w:drawing>
+          <wp:inline xmlns:a="http://schemas.openxmlformats.org/drawingml/2006/main" xmlns:pic="http://schemas.openxmlformats.org/drawingml/2006/picture">
+            <wp:extent cx="6035040" cy="3394710"/>
+            <wp:docPr id="21" name="Picture 21"/>
+            <wp:cNvGraphicFramePr>
+              <a:graphicFrameLocks noChangeAspect="1"/>
+            </wp:cNvGraphicFramePr>
+            <a:graphic>
+              <a:graphicData uri="http://schemas.openxmlformats.org/drawingml/2006/picture">
+                <pic:pic>
+                  <pic:nvPicPr>
+                    <pic:cNvPr id="0" name="27_10x10_vs_30x30_center.png"/>
+                    <pic:cNvPicPr/>
+                  </pic:nvPicPr>
+                  <pic:blipFill>
+                    <a:blip r:embed="rId29"/>
+                    <a:stretch>
+                      <a:fillRect/>
+                    </a:stretch>
+                  </pic:blipFill>
+                  <pic:spPr>
+                    <a:xfrm>
+                      <a:off x="0" y="0"/>
+                      <a:ext cx="6035040" cy="3394710"/>
+                    </a:xfrm>
+                    <a:prstGeom prst="rect"/>
+                  </pic:spPr>
+                </pic:pic>
+              </a:graphicData>
+            </a:graphic>
+          </wp:inline>
+        </w:drawing>
+      </w:r>
+    </w:p>
+    <w:p>
+      <w:r>
+        <w:br w:type="page"/>
+      </w:r>
+    </w:p>
+    <w:p>
+      <w:pPr>
+        <w:spacing w:before="160" w:after="160"/>
+      </w:pPr>
+      <w:r>
+        <w:rPr>
+          <w:rFonts w:ascii="Calibri" w:hAnsi="Calibri" w:eastAsia="Microsoft YaHei"/>
+          <w:b/>
+          <w:color w:val="2E74B5"/>
+          <w:sz w:val="32"/>
+        </w:rPr>
+        <w:t>9. 模态阶数敏感性</w:t>
+      </w:r>
+    </w:p>
+    <w:tbl>
+      <w:tblPr>
+        <w:tblStyle w:val="TableGrid"/>
+        <w:tblW w:type="auto" w:w="0"/>
+        <w:jc w:val="center"/>
+        <w:tblLook w:firstColumn="1" w:firstRow="1" w:lastColumn="0" w:lastRow="0" w:noHBand="0" w:noVBand="1" w:val="04A0"/>
+      </w:tblPr>
+      <w:tblGrid>
+        <w:gridCol w:w="1694"/>
+        <w:gridCol w:w="1694"/>
+        <w:gridCol w:w="1694"/>
+        <w:gridCol w:w="1694"/>
+        <w:gridCol w:w="1694"/>
+        <w:gridCol w:w="1694"/>
+      </w:tblGrid>
+      <w:tr>
+        <w:tc>
+          <w:tcPr>
+            <w:tcW w:type="dxa" w:w="1694"/>
+            <w:vAlign w:val="center"/>
+            <w:shd w:fill="F2F4F7"/>
+          </w:tcPr>
+          <w:p>
+            <w:pPr>
+              <w:spacing w:after="0"/>
+            </w:pPr>
+            <w:r/>
+            <w:r>
+              <w:rPr>
+                <w:rFonts w:ascii="Calibri" w:hAnsi="Calibri" w:eastAsia="Microsoft YaHei"/>
+                <w:b/>
+                <w:sz w:val="16"/>
+              </w:rPr>
+              <w:t>阶数</w:t>
+            </w:r>
+          </w:p>
+        </w:tc>
+        <w:tc>
+          <w:tcPr>
+            <w:tcW w:type="dxa" w:w="1694"/>
+            <w:vAlign w:val="center"/>
+            <w:shd w:fill="F2F4F7"/>
+          </w:tcPr>
+          <w:p>
+            <w:pPr>
+              <w:spacing w:after="0"/>
+            </w:pPr>
+            <w:r/>
+            <w:r>
+              <w:rPr>
+                <w:rFonts w:ascii="Calibri" w:hAnsi="Calibri" w:eastAsia="Microsoft YaHei"/>
+                <w:b/>
+                <w:sz w:val="16"/>
+              </w:rPr>
+              <w:t>静态捕获</w:t>
+            </w:r>
+          </w:p>
+        </w:tc>
+        <w:tc>
+          <w:tcPr>
+            <w:tcW w:type="dxa" w:w="1694"/>
+            <w:vAlign w:val="center"/>
+            <w:shd w:fill="F2F4F7"/>
+          </w:tcPr>
+          <w:p>
+            <w:pPr>
+              <w:spacing w:after="0"/>
+            </w:pPr>
+            <w:r/>
+            <w:r>
+              <w:rPr>
+                <w:rFonts w:ascii="Calibri" w:hAnsi="Calibri" w:eastAsia="Microsoft YaHei"/>
+                <w:b/>
+                <w:sz w:val="16"/>
+              </w:rPr>
+              <w:t>峰值 mm</w:t>
+            </w:r>
+          </w:p>
+        </w:tc>
+        <w:tc>
+          <w:tcPr>
+            <w:tcW w:type="dxa" w:w="1694"/>
+            <w:vAlign w:val="center"/>
+            <w:shd w:fill="F2F4F7"/>
+          </w:tcPr>
+          <w:p>
+            <w:pPr>
+              <w:spacing w:after="0"/>
+            </w:pPr>
+            <w:r/>
+            <w:r>
+              <w:rPr>
+                <w:rFonts w:ascii="Calibri" w:hAnsi="Calibri" w:eastAsia="Microsoft YaHei"/>
+                <w:b/>
+                <w:sz w:val="16"/>
+              </w:rPr>
+              <w:t>峰值时间 ms</w:t>
+            </w:r>
+          </w:p>
+        </w:tc>
+        <w:tc>
+          <w:tcPr>
+            <w:tcW w:type="dxa" w:w="1694"/>
+            <w:vAlign w:val="center"/>
+            <w:shd w:fill="F2F4F7"/>
+          </w:tcPr>
+          <w:p>
+            <w:pPr>
+              <w:spacing w:after="0"/>
+            </w:pPr>
+            <w:r/>
+            <w:r>
+              <w:rPr>
+                <w:rFonts w:ascii="Calibri" w:hAnsi="Calibri" w:eastAsia="Microsoft YaHei"/>
+                <w:b/>
+                <w:sz w:val="16"/>
+              </w:rPr>
+              <w:t>超调</w:t>
+            </w:r>
+          </w:p>
+        </w:tc>
+        <w:tc>
+          <w:tcPr>
+            <w:tcW w:type="dxa" w:w="1694"/>
+            <w:vAlign w:val="center"/>
+            <w:shd w:fill="F2F4F7"/>
+          </w:tcPr>
+          <w:p>
+            <w:pPr>
+              <w:spacing w:after="0"/>
+            </w:pPr>
+            <w:r/>
+            <w:r>
+              <w:rPr>
+                <w:rFonts w:ascii="Calibri" w:hAnsi="Calibri" w:eastAsia="Microsoft YaHei"/>
+                <w:b/>
+                <w:sz w:val="16"/>
+              </w:rPr>
+              <w:t>最大 θ 跨度 K</w:t>
+            </w:r>
+          </w:p>
+        </w:tc>
+      </w:tr>
+      <w:tr>
+        <w:tc>
+          <w:tcPr>
+            <w:tcW w:type="dxa" w:w="1694"/>
+            <w:vAlign w:val="center"/>
+          </w:tcPr>
+          <w:p>
+            <w:pPr>
+              <w:spacing w:after="0"/>
+            </w:pPr>
+            <w:r/>
+            <w:r>
+              <w:rPr>
+                <w:rFonts w:ascii="Calibri" w:hAnsi="Calibri" w:eastAsia="Microsoft YaHei"/>
+                <w:b w:val="0"/>
+                <w:sz w:val="16"/>
+              </w:rPr>
+              <w:t>4.0</w:t>
+            </w:r>
+          </w:p>
+        </w:tc>
+        <w:tc>
+          <w:tcPr>
+            <w:tcW w:type="dxa" w:w="1694"/>
+            <w:vAlign w:val="center"/>
+          </w:tcPr>
+          <w:p>
+            <w:pPr>
+              <w:spacing w:after="0"/>
+            </w:pPr>
+            <w:r/>
+            <w:r>
+              <w:rPr>
+                <w:rFonts w:ascii="Calibri" w:hAnsi="Calibri" w:eastAsia="Microsoft YaHei"/>
+                <w:b w:val="0"/>
+                <w:sz w:val="16"/>
+              </w:rPr>
+              <w:t>1.000349</w:t>
+            </w:r>
+          </w:p>
+        </w:tc>
+        <w:tc>
+          <w:tcPr>
+            <w:tcW w:type="dxa" w:w="1694"/>
+            <w:vAlign w:val="center"/>
+          </w:tcPr>
+          <w:p>
+            <w:pPr>
+              <w:spacing w:after="0"/>
+            </w:pPr>
+            <w:r/>
+            <w:r>
+              <w:rPr>
+                <w:rFonts w:ascii="Calibri" w:hAnsi="Calibri" w:eastAsia="Microsoft YaHei"/>
+                <w:b w:val="0"/>
+                <w:sz w:val="16"/>
+              </w:rPr>
+              <w:t>-4.428136</w:t>
+            </w:r>
+          </w:p>
+        </w:tc>
+        <w:tc>
+          <w:tcPr>
+            <w:tcW w:type="dxa" w:w="1694"/>
+            <w:vAlign w:val="center"/>
+          </w:tcPr>
+          <w:p>
+            <w:pPr>
+              <w:spacing w:after="0"/>
+            </w:pPr>
+            <w:r/>
+            <w:r>
+              <w:rPr>
+                <w:rFonts w:ascii="Calibri" w:hAnsi="Calibri" w:eastAsia="Microsoft YaHei"/>
+                <w:b w:val="0"/>
+                <w:sz w:val="16"/>
+              </w:rPr>
+              <w:t>9.5</w:t>
+            </w:r>
+          </w:p>
+        </w:tc>
+        <w:tc>
+          <w:tcPr>
+            <w:tcW w:type="dxa" w:w="1694"/>
+            <w:vAlign w:val="center"/>
+          </w:tcPr>
+          <w:p>
+            <w:pPr>
+              <w:spacing w:after="0"/>
+            </w:pPr>
+            <w:r/>
+            <w:r>
+              <w:rPr>
+                <w:rFonts w:ascii="Calibri" w:hAnsi="Calibri" w:eastAsia="Microsoft YaHei"/>
+                <w:b w:val="0"/>
+                <w:sz w:val="16"/>
+              </w:rPr>
+              <w:t>1.929725</w:t>
+            </w:r>
+          </w:p>
+        </w:tc>
+        <w:tc>
+          <w:tcPr>
+            <w:tcW w:type="dxa" w:w="1694"/>
+            <w:vAlign w:val="center"/>
+          </w:tcPr>
+          <w:p>
+            <w:pPr>
+              <w:spacing w:after="0"/>
+            </w:pPr>
+            <w:r/>
+            <w:r>
+              <w:rPr>
+                <w:rFonts w:ascii="Calibri" w:hAnsi="Calibri" w:eastAsia="Microsoft YaHei"/>
+                <w:b w:val="0"/>
+                <w:sz w:val="16"/>
+              </w:rPr>
+              <w:t>5.025591</w:t>
+            </w:r>
+          </w:p>
+        </w:tc>
+      </w:tr>
+      <w:tr>
+        <w:tc>
+          <w:tcPr>
+            <w:tcW w:type="dxa" w:w="1694"/>
+            <w:vAlign w:val="center"/>
+          </w:tcPr>
+          <w:p>
+            <w:pPr>
+              <w:spacing w:after="0"/>
+            </w:pPr>
+            <w:r/>
+            <w:r>
+              <w:rPr>
+                <w:rFonts w:ascii="Calibri" w:hAnsi="Calibri" w:eastAsia="Microsoft YaHei"/>
+                <w:b w:val="0"/>
+                <w:sz w:val="16"/>
+              </w:rPr>
+              <w:t>6.0</w:t>
+            </w:r>
+          </w:p>
+        </w:tc>
+        <w:tc>
+          <w:tcPr>
+            <w:tcW w:type="dxa" w:w="1694"/>
+            <w:vAlign w:val="center"/>
+          </w:tcPr>
+          <w:p>
+            <w:pPr>
+              <w:spacing w:after="0"/>
+            </w:pPr>
+            <w:r/>
+            <w:r>
+              <w:rPr>
+                <w:rFonts w:ascii="Calibri" w:hAnsi="Calibri" w:eastAsia="Microsoft YaHei"/>
+                <w:b w:val="0"/>
+                <w:sz w:val="16"/>
+              </w:rPr>
+              <w:t>1.000053</w:t>
+            </w:r>
+          </w:p>
+        </w:tc>
+        <w:tc>
+          <w:tcPr>
+            <w:tcW w:type="dxa" w:w="1694"/>
+            <w:vAlign w:val="center"/>
+          </w:tcPr>
+          <w:p>
+            <w:pPr>
+              <w:spacing w:after="0"/>
+            </w:pPr>
+            <w:r/>
+            <w:r>
+              <w:rPr>
+                <w:rFonts w:ascii="Calibri" w:hAnsi="Calibri" w:eastAsia="Microsoft YaHei"/>
+                <w:b w:val="0"/>
+                <w:sz w:val="16"/>
+              </w:rPr>
+              <w:t>-4.427098</w:t>
+            </w:r>
+          </w:p>
+        </w:tc>
+        <w:tc>
+          <w:tcPr>
+            <w:tcW w:type="dxa" w:w="1694"/>
+            <w:vAlign w:val="center"/>
+          </w:tcPr>
+          <w:p>
+            <w:pPr>
+              <w:spacing w:after="0"/>
+            </w:pPr>
+            <w:r/>
+            <w:r>
+              <w:rPr>
+                <w:rFonts w:ascii="Calibri" w:hAnsi="Calibri" w:eastAsia="Microsoft YaHei"/>
+                <w:b w:val="0"/>
+                <w:sz w:val="16"/>
+              </w:rPr>
+              <w:t>9.6</w:t>
+            </w:r>
+          </w:p>
+        </w:tc>
+        <w:tc>
+          <w:tcPr>
+            <w:tcW w:type="dxa" w:w="1694"/>
+            <w:vAlign w:val="center"/>
+          </w:tcPr>
+          <w:p>
+            <w:pPr>
+              <w:spacing w:after="0"/>
+            </w:pPr>
+            <w:r/>
+            <w:r>
+              <w:rPr>
+                <w:rFonts w:ascii="Calibri" w:hAnsi="Calibri" w:eastAsia="Microsoft YaHei"/>
+                <w:b w:val="0"/>
+                <w:sz w:val="16"/>
+              </w:rPr>
+              <w:t>1.929273</w:t>
+            </w:r>
+          </w:p>
+        </w:tc>
+        <w:tc>
+          <w:tcPr>
+            <w:tcW w:type="dxa" w:w="1694"/>
+            <w:vAlign w:val="center"/>
+          </w:tcPr>
+          <w:p>
+            <w:pPr>
+              <w:spacing w:after="0"/>
+            </w:pPr>
+            <w:r/>
+            <w:r>
+              <w:rPr>
+                <w:rFonts w:ascii="Calibri" w:hAnsi="Calibri" w:eastAsia="Microsoft YaHei"/>
+                <w:b w:val="0"/>
+                <w:sz w:val="16"/>
+              </w:rPr>
+              <w:t>5.027648</w:t>
+            </w:r>
+          </w:p>
+        </w:tc>
+      </w:tr>
+      <w:tr>
+        <w:tc>
+          <w:tcPr>
+            <w:tcW w:type="dxa" w:w="1694"/>
+            <w:vAlign w:val="center"/>
+          </w:tcPr>
+          <w:p>
+            <w:pPr>
+              <w:spacing w:after="0"/>
+            </w:pPr>
+            <w:r/>
+            <w:r>
+              <w:rPr>
+                <w:rFonts w:ascii="Calibri" w:hAnsi="Calibri" w:eastAsia="Microsoft YaHei"/>
+                <w:b w:val="0"/>
+                <w:sz w:val="16"/>
+              </w:rPr>
+              <w:t>8.0</w:t>
+            </w:r>
+          </w:p>
+        </w:tc>
+        <w:tc>
+          <w:tcPr>
+            <w:tcW w:type="dxa" w:w="1694"/>
+            <w:vAlign w:val="center"/>
+          </w:tcPr>
+          <w:p>
+            <w:pPr>
+              <w:spacing w:after="0"/>
+            </w:pPr>
+            <w:r/>
+            <w:r>
+              <w:rPr>
+                <w:rFonts w:ascii="Calibri" w:hAnsi="Calibri" w:eastAsia="Microsoft YaHei"/>
+                <w:b w:val="0"/>
+                <w:sz w:val="16"/>
+              </w:rPr>
+              <w:t>1.00037</w:t>
+            </w:r>
+          </w:p>
+        </w:tc>
+        <w:tc>
+          <w:tcPr>
+            <w:tcW w:type="dxa" w:w="1694"/>
+            <w:vAlign w:val="center"/>
+          </w:tcPr>
+          <w:p>
+            <w:pPr>
+              <w:spacing w:after="0"/>
+            </w:pPr>
+            <w:r/>
+            <w:r>
+              <w:rPr>
+                <w:rFonts w:ascii="Calibri" w:hAnsi="Calibri" w:eastAsia="Microsoft YaHei"/>
+                <w:b w:val="0"/>
+                <w:sz w:val="16"/>
+              </w:rPr>
+              <w:t>-4.427879</w:t>
+            </w:r>
+          </w:p>
+        </w:tc>
+        <w:tc>
+          <w:tcPr>
+            <w:tcW w:type="dxa" w:w="1694"/>
+            <w:vAlign w:val="center"/>
+          </w:tcPr>
+          <w:p>
+            <w:pPr>
+              <w:spacing w:after="0"/>
+            </w:pPr>
+            <w:r/>
+            <w:r>
+              <w:rPr>
+                <w:rFonts w:ascii="Calibri" w:hAnsi="Calibri" w:eastAsia="Microsoft YaHei"/>
+                <w:b w:val="0"/>
+                <w:sz w:val="16"/>
+              </w:rPr>
+              <w:t>9.5</w:t>
+            </w:r>
+          </w:p>
+        </w:tc>
+        <w:tc>
+          <w:tcPr>
+            <w:tcW w:type="dxa" w:w="1694"/>
+            <w:vAlign w:val="center"/>
+          </w:tcPr>
+          <w:p>
+            <w:pPr>
+              <w:spacing w:after="0"/>
+            </w:pPr>
+            <w:r/>
+            <w:r>
+              <w:rPr>
+                <w:rFonts w:ascii="Calibri" w:hAnsi="Calibri" w:eastAsia="Microsoft YaHei"/>
+                <w:b w:val="0"/>
+                <w:sz w:val="16"/>
+              </w:rPr>
+              <w:t>1.929613</w:t>
+            </w:r>
+          </w:p>
+        </w:tc>
+        <w:tc>
+          <w:tcPr>
+            <w:tcW w:type="dxa" w:w="1694"/>
+            <w:vAlign w:val="center"/>
+          </w:tcPr>
+          <w:p>
+            <w:pPr>
+              <w:spacing w:after="0"/>
+            </w:pPr>
+            <w:r/>
+            <w:r>
+              <w:rPr>
+                <w:rFonts w:ascii="Calibri" w:hAnsi="Calibri" w:eastAsia="Microsoft YaHei"/>
+                <w:b w:val="0"/>
+                <w:sz w:val="16"/>
+              </w:rPr>
+              <w:t>5.039809</w:t>
+            </w:r>
+          </w:p>
+        </w:tc>
+      </w:tr>
+      <w:tr>
+        <w:tc>
+          <w:tcPr>
+            <w:tcW w:type="dxa" w:w="1694"/>
+            <w:vAlign w:val="center"/>
+          </w:tcPr>
+          <w:p>
+            <w:pPr>
+              <w:spacing w:after="0"/>
+            </w:pPr>
+            <w:r/>
+            <w:r>
+              <w:rPr>
+                <w:rFonts w:ascii="Calibri" w:hAnsi="Calibri" w:eastAsia="Microsoft YaHei"/>
+                <w:b w:val="0"/>
+                <w:sz w:val="16"/>
+              </w:rPr>
+              <w:t>12.0</w:t>
+            </w:r>
+          </w:p>
+        </w:tc>
+        <w:tc>
+          <w:tcPr>
+            <w:tcW w:type="dxa" w:w="1694"/>
+            <w:vAlign w:val="center"/>
+          </w:tcPr>
+          <w:p>
+            <w:pPr>
+              <w:spacing w:after="0"/>
+            </w:pPr>
+            <w:r/>
+            <w:r>
+              <w:rPr>
+                <w:rFonts w:ascii="Calibri" w:hAnsi="Calibri" w:eastAsia="Microsoft YaHei"/>
+                <w:b w:val="0"/>
+                <w:sz w:val="16"/>
+              </w:rPr>
+              <w:t>1.000361</w:t>
+            </w:r>
+          </w:p>
+        </w:tc>
+        <w:tc>
+          <w:tcPr>
+            <w:tcW w:type="dxa" w:w="1694"/>
+            <w:vAlign w:val="center"/>
+          </w:tcPr>
+          <w:p>
+            <w:pPr>
+              <w:spacing w:after="0"/>
+            </w:pPr>
+            <w:r/>
+            <w:r>
+              <w:rPr>
+                <w:rFonts w:ascii="Calibri" w:hAnsi="Calibri" w:eastAsia="Microsoft YaHei"/>
+                <w:b w:val="0"/>
+                <w:sz w:val="16"/>
+              </w:rPr>
+              <w:t>-4.427848</w:t>
+            </w:r>
+          </w:p>
+        </w:tc>
+        <w:tc>
+          <w:tcPr>
+            <w:tcW w:type="dxa" w:w="1694"/>
+            <w:vAlign w:val="center"/>
+          </w:tcPr>
+          <w:p>
+            <w:pPr>
+              <w:spacing w:after="0"/>
+            </w:pPr>
+            <w:r/>
+            <w:r>
+              <w:rPr>
+                <w:rFonts w:ascii="Calibri" w:hAnsi="Calibri" w:eastAsia="Microsoft YaHei"/>
+                <w:b w:val="0"/>
+                <w:sz w:val="16"/>
+              </w:rPr>
+              <w:t>9.5</w:t>
+            </w:r>
+          </w:p>
+        </w:tc>
+        <w:tc>
+          <w:tcPr>
+            <w:tcW w:type="dxa" w:w="1694"/>
+            <w:vAlign w:val="center"/>
+          </w:tcPr>
+          <w:p>
+            <w:pPr>
+              <w:spacing w:after="0"/>
+            </w:pPr>
+            <w:r/>
+            <w:r>
+              <w:rPr>
+                <w:rFonts w:ascii="Calibri" w:hAnsi="Calibri" w:eastAsia="Microsoft YaHei"/>
+                <w:b w:val="0"/>
+                <w:sz w:val="16"/>
+              </w:rPr>
+              <w:t>1.929599</w:t>
+            </w:r>
+          </w:p>
+        </w:tc>
+        <w:tc>
+          <w:tcPr>
+            <w:tcW w:type="dxa" w:w="1694"/>
+            <w:vAlign w:val="center"/>
+          </w:tcPr>
+          <w:p>
+            <w:pPr>
+              <w:spacing w:after="0"/>
+            </w:pPr>
+            <w:r/>
+            <w:r>
+              <w:rPr>
+                <w:rFonts w:ascii="Calibri" w:hAnsi="Calibri" w:eastAsia="Microsoft YaHei"/>
+                <w:b w:val="0"/>
+                <w:sz w:val="16"/>
+              </w:rPr>
+              <w:t>5.03984</w:t>
+            </w:r>
+          </w:p>
+        </w:tc>
+      </w:tr>
+      <w:tr>
+        <w:tc>
+          <w:tcPr>
+            <w:tcW w:type="dxa" w:w="1694"/>
+            <w:vAlign w:val="center"/>
+          </w:tcPr>
+          <w:p>
+            <w:pPr>
+              <w:spacing w:after="0"/>
+            </w:pPr>
+            <w:r/>
+            <w:r>
+              <w:rPr>
+                <w:rFonts w:ascii="Calibri" w:hAnsi="Calibri" w:eastAsia="Microsoft YaHei"/>
+                <w:b w:val="0"/>
+                <w:sz w:val="16"/>
+              </w:rPr>
+              <w:t>16.0</w:t>
+            </w:r>
+          </w:p>
+        </w:tc>
+        <w:tc>
+          <w:tcPr>
+            <w:tcW w:type="dxa" w:w="1694"/>
+            <w:vAlign w:val="center"/>
+          </w:tcPr>
+          <w:p>
+            <w:pPr>
+              <w:spacing w:after="0"/>
+            </w:pPr>
+            <w:r/>
+            <w:r>
+              <w:rPr>
+                <w:rFonts w:ascii="Calibri" w:hAnsi="Calibri" w:eastAsia="Microsoft YaHei"/>
+                <w:b w:val="0"/>
+                <w:sz w:val="16"/>
+              </w:rPr>
+              <w:t>0.999965</w:t>
+            </w:r>
+          </w:p>
+        </w:tc>
+        <w:tc>
+          <w:tcPr>
+            <w:tcW w:type="dxa" w:w="1694"/>
+            <w:vAlign w:val="center"/>
+          </w:tcPr>
+          <w:p>
+            <w:pPr>
+              <w:spacing w:after="0"/>
+            </w:pPr>
+            <w:r/>
+            <w:r>
+              <w:rPr>
+                <w:rFonts w:ascii="Calibri" w:hAnsi="Calibri" w:eastAsia="Microsoft YaHei"/>
+                <w:b w:val="0"/>
+                <w:sz w:val="16"/>
+              </w:rPr>
+              <w:t>-4.426965</w:t>
+            </w:r>
+          </w:p>
+        </w:tc>
+        <w:tc>
+          <w:tcPr>
+            <w:tcW w:type="dxa" w:w="1694"/>
+            <w:vAlign w:val="center"/>
+          </w:tcPr>
+          <w:p>
+            <w:pPr>
+              <w:spacing w:after="0"/>
+            </w:pPr>
+            <w:r/>
+            <w:r>
+              <w:rPr>
+                <w:rFonts w:ascii="Calibri" w:hAnsi="Calibri" w:eastAsia="Microsoft YaHei"/>
+                <w:b w:val="0"/>
+                <w:sz w:val="16"/>
+              </w:rPr>
+              <w:t>9.6</w:t>
+            </w:r>
+          </w:p>
+        </w:tc>
+        <w:tc>
+          <w:tcPr>
+            <w:tcW w:type="dxa" w:w="1694"/>
+            <w:vAlign w:val="center"/>
+          </w:tcPr>
+          <w:p>
+            <w:pPr>
+              <w:spacing w:after="0"/>
+            </w:pPr>
+            <w:r/>
+            <w:r>
+              <w:rPr>
+                <w:rFonts w:ascii="Calibri" w:hAnsi="Calibri" w:eastAsia="Microsoft YaHei"/>
+                <w:b w:val="0"/>
+                <w:sz w:val="16"/>
+              </w:rPr>
+              <w:t>1.929214</w:t>
+            </w:r>
+          </w:p>
+        </w:tc>
+        <w:tc>
+          <w:tcPr>
+            <w:tcW w:type="dxa" w:w="1694"/>
+            <w:vAlign w:val="center"/>
+          </w:tcPr>
+          <w:p>
+            <w:pPr>
+              <w:spacing w:after="0"/>
+            </w:pPr>
+            <w:r/>
+            <w:r>
+              <w:rPr>
+                <w:rFonts w:ascii="Calibri" w:hAnsi="Calibri" w:eastAsia="Microsoft YaHei"/>
+                <w:b w:val="0"/>
+                <w:sz w:val="16"/>
+              </w:rPr>
+              <w:t>5.036322</w:t>
+            </w:r>
+          </w:p>
+        </w:tc>
+      </w:tr>
+    </w:tbl>
+    <w:p/>
+    <w:p>
+      <w:pPr>
+        <w:spacing w:after="160"/>
+      </w:pPr>
+      <w:r>
+        <w:rPr>
+          <w:rFonts w:ascii="Calibri" w:hAnsi="Calibri" w:eastAsia="Microsoft YaHei"/>
+          <w:b/>
+          <w:color w:val="1F4D78"/>
+          <w:sz w:val="24"/>
+        </w:rPr>
+        <w:t>图 22 30x30 模态阶数敏感性摘要</w:t>
+      </w:r>
+    </w:p>
+    <w:p>
+      <w:pPr>
+        <w:spacing w:before="40" w:after="160"/>
+        <w:jc w:val="center"/>
+      </w:pPr>
+      <w:r>
+        <w:drawing>
+          <wp:inline xmlns:a="http://schemas.openxmlformats.org/drawingml/2006/main" xmlns:pic="http://schemas.openxmlformats.org/drawingml/2006/picture">
+            <wp:extent cx="6035040" cy="2220895"/>
+            <wp:docPr id="22" name="Picture 22"/>
+            <wp:cNvGraphicFramePr>
+              <a:graphicFrameLocks noChangeAspect="1"/>
+            </wp:cNvGraphicFramePr>
+            <a:graphic>
+              <a:graphicData uri="http://schemas.openxmlformats.org/drawingml/2006/picture">
+                <pic:pic>
+                  <pic:nvPicPr>
+                    <pic:cNvPr id="0" name="28_modal_sensitivity_summary_table.png"/>
+                    <pic:cNvPicPr/>
+                  </pic:nvPicPr>
+                  <pic:blipFill>
+                    <a:blip r:embed="rId30"/>
+                    <a:stretch>
+                      <a:fillRect/>
+                    </a:stretch>
+                  </pic:blipFill>
+                  <pic:spPr>
+                    <a:xfrm>
+                      <a:off x="0" y="0"/>
+                      <a:ext cx="6035040" cy="2220895"/>
+                    </a:xfrm>
+                    <a:prstGeom prst="rect"/>
+                  </pic:spPr>
+                </pic:pic>
+              </a:graphicData>
+            </a:graphic>
+          </wp:inline>
+        </w:drawing>
+      </w:r>
+    </w:p>
+    <w:p>
+      <w:pPr>
+        <w:spacing w:after="160"/>
+      </w:pPr>
+      <w:r>
+        <w:rPr>
+          <w:rFonts w:ascii="Calibri" w:hAnsi="Calibri" w:eastAsia="Microsoft YaHei"/>
+          <w:b/>
+          <w:color w:val="1F4D78"/>
+          <w:sz w:val="24"/>
+        </w:rPr>
+        <w:t>图 23 静态捕获比例收敛</w:t>
+      </w:r>
+    </w:p>
+    <w:p>
+      <w:pPr>
+        <w:spacing w:before="40" w:after="160"/>
+        <w:jc w:val="center"/>
+      </w:pPr>
+      <w:r>
+        <w:drawing>
+          <wp:inline xmlns:a="http://schemas.openxmlformats.org/drawingml/2006/main" xmlns:pic="http://schemas.openxmlformats.org/drawingml/2006/picture">
+            <wp:extent cx="6035040" cy="3394710"/>
+            <wp:docPr id="23" name="Picture 23"/>
+            <wp:cNvGraphicFramePr>
+              <a:graphicFrameLocks noChangeAspect="1"/>
+            </wp:cNvGraphicFramePr>
+            <a:graphic>
+              <a:graphicData uri="http://schemas.openxmlformats.org/drawingml/2006/picture">
+                <pic:pic>
+                  <pic:nvPicPr>
+                    <pic:cNvPr id="0" name="29_capture_ratio_vs_modes.png"/>
+                    <pic:cNvPicPr/>
+                  </pic:nvPicPr>
+                  <pic:blipFill>
+                    <a:blip r:embed="rId31"/>
+                    <a:stretch>
+                      <a:fillRect/>
+                    </a:stretch>
+                  </pic:blipFill>
+                  <pic:spPr>
+                    <a:xfrm>
+                      <a:off x="0" y="0"/>
+                      <a:ext cx="6035040" cy="3394710"/>
+                    </a:xfrm>
+                    <a:prstGeom prst="rect"/>
+                  </pic:spPr>
+                </pic:pic>
+              </a:graphicData>
+            </a:graphic>
+          </wp:inline>
+        </w:drawing>
+      </w:r>
+    </w:p>
+    <w:p>
+      <w:pPr>
+        <w:spacing w:after="160"/>
+      </w:pPr>
+      <w:r>
+        <w:rPr>
+          <w:rFonts w:ascii="Calibri" w:hAnsi="Calibri" w:eastAsia="Microsoft YaHei"/>
+          <w:b/>
+          <w:color w:val="1F4D78"/>
+          <w:sz w:val="24"/>
+        </w:rPr>
+        <w:t>图 24 动力峰值随模态阶数变化</w:t>
+      </w:r>
+    </w:p>
+    <w:p>
+      <w:pPr>
+        <w:spacing w:before="40" w:after="160"/>
+        <w:jc w:val="center"/>
+      </w:pPr>
+      <w:r>
+        <w:drawing>
+          <wp:inline xmlns:a="http://schemas.openxmlformats.org/drawingml/2006/main" xmlns:pic="http://schemas.openxmlformats.org/drawingml/2006/picture">
+            <wp:extent cx="6035040" cy="3394710"/>
+            <wp:docPr id="24" name="Picture 24"/>
+            <wp:cNvGraphicFramePr>
+              <a:graphicFrameLocks noChangeAspect="1"/>
+            </wp:cNvGraphicFramePr>
+            <a:graphic>
+              <a:graphicData uri="http://schemas.openxmlformats.org/drawingml/2006/picture">
+                <pic:pic>
+                  <pic:nvPicPr>
+                    <pic:cNvPr id="0" name="30_peak_vs_modes.png"/>
+                    <pic:cNvPicPr/>
+                  </pic:nvPicPr>
+                  <pic:blipFill>
+                    <a:blip r:embed="rId32"/>
+                    <a:stretch>
+                      <a:fillRect/>
+                    </a:stretch>
+                  </pic:blipFill>
+                  <pic:spPr>
+                    <a:xfrm>
+                      <a:off x="0" y="0"/>
+                      <a:ext cx="6035040" cy="3394710"/>
+                    </a:xfrm>
+                    <a:prstGeom prst="rect"/>
+                  </pic:spPr>
+                </pic:pic>
+              </a:graphicData>
+            </a:graphic>
+          </wp:inline>
+        </w:drawing>
+      </w:r>
+    </w:p>
+    <w:p>
+      <w:pPr>
+        <w:spacing w:after="160"/>
+      </w:pPr>
+      <w:r>
+        <w:rPr>
+          <w:rFonts w:ascii="Calibri" w:hAnsi="Calibri" w:eastAsia="Microsoft YaHei"/>
+          <w:b/>
+          <w:color w:val="1F4D78"/>
+          <w:sz w:val="24"/>
+        </w:rPr>
+        <w:t>图 25 不同阶数中心挠度时程</w:t>
+      </w:r>
+    </w:p>
+    <w:p>
+      <w:pPr>
+        <w:spacing w:before="40" w:after="160"/>
+        <w:jc w:val="center"/>
+      </w:pPr>
+      <w:r>
+        <w:drawing>
+          <wp:inline xmlns:a="http://schemas.openxmlformats.org/drawingml/2006/main" xmlns:pic="http://schemas.openxmlformats.org/drawingml/2006/picture">
+            <wp:extent cx="6035040" cy="3394710"/>
+            <wp:docPr id="25" name="Picture 25"/>
+            <wp:cNvGraphicFramePr>
+              <a:graphicFrameLocks noChangeAspect="1"/>
+            </wp:cNvGraphicFramePr>
+            <a:graphic>
+              <a:graphicData uri="http://schemas.openxmlformats.org/drawingml/2006/picture">
+                <pic:pic>
+                  <pic:nvPicPr>
+                    <pic:cNvPr id="0" name="31_center_timeseries_by_modes.png"/>
+                    <pic:cNvPicPr/>
+                  </pic:nvPicPr>
+                  <pic:blipFill>
+                    <a:blip r:embed="rId33"/>
+                    <a:stretch>
+                      <a:fillRect/>
+                    </a:stretch>
+                  </pic:blipFill>
+                  <pic:spPr>
+                    <a:xfrm>
+                      <a:off x="0" y="0"/>
+                      <a:ext cx="6035040" cy="3394710"/>
+                    </a:xfrm>
+                    <a:prstGeom prst="rect"/>
+                  </pic:spPr>
+                </pic:pic>
+              </a:graphicData>
+            </a:graphic>
+          </wp:inline>
+        </w:drawing>
+      </w:r>
+    </w:p>
+    <w:p>
+      <w:pPr>
+        <w:spacing w:after="160"/>
+      </w:pPr>
+      <w:r>
+        <w:rPr>
+          <w:rFonts w:ascii="Calibri" w:hAnsi="Calibri" w:eastAsia="Microsoft YaHei"/>
+          <w:b/>
+          <w:color w:val="1F4D78"/>
+          <w:sz w:val="24"/>
+        </w:rPr>
+        <w:t>图 26 模态阶数收敛性判断</w:t>
+      </w:r>
+    </w:p>
+    <w:p>
+      <w:pPr>
+        <w:spacing w:before="40" w:after="160"/>
+        <w:jc w:val="center"/>
+      </w:pPr>
+      <w:r>
+        <w:drawing>
+          <wp:inline xmlns:a="http://schemas.openxmlformats.org/drawingml/2006/main" xmlns:pic="http://schemas.openxmlformats.org/drawingml/2006/picture">
+            <wp:extent cx="6035040" cy="2325502"/>
+            <wp:docPr id="26" name="Picture 26"/>
+            <wp:cNvGraphicFramePr>
+              <a:graphicFrameLocks noChangeAspect="1"/>
+            </wp:cNvGraphicFramePr>
+            <a:graphic>
+              <a:graphicData uri="http://schemas.openxmlformats.org/drawingml/2006/picture">
+                <pic:pic>
+                  <pic:nvPicPr>
+                    <pic:cNvPr id="0" name="35_convergence_assessment_table.png"/>
+                    <pic:cNvPicPr/>
+                  </pic:nvPicPr>
+                  <pic:blipFill>
+                    <a:blip r:embed="rId34"/>
+                    <a:stretch>
+                      <a:fillRect/>
+                    </a:stretch>
+                  </pic:blipFill>
+                  <pic:spPr>
+                    <a:xfrm>
+                      <a:off x="0" y="0"/>
+                      <a:ext cx="6035040" cy="2325502"/>
+                    </a:xfrm>
+                    <a:prstGeom prst="rect"/>
+                  </pic:spPr>
+                </pic:pic>
+              </a:graphicData>
+            </a:graphic>
+          </wp:inline>
+        </w:drawing>
+      </w:r>
+    </w:p>
+    <w:p>
+      <w:pPr>
+        <w:spacing w:before="160" w:after="160"/>
+      </w:pPr>
+      <w:r>
+        <w:rPr>
+          <w:rFonts w:ascii="Calibri" w:hAnsi="Calibri" w:eastAsia="Microsoft YaHei"/>
+          <w:b/>
+          <w:color w:val="2E74B5"/>
+          <w:sz w:val="32"/>
+        </w:rPr>
+        <w:t>10. 阻尼敏感性</w:t>
+      </w:r>
+    </w:p>
+    <w:tbl>
+      <w:tblPr>
+        <w:tblStyle w:val="TableGrid"/>
+        <w:tblW w:type="auto" w:w="0"/>
+        <w:jc w:val="center"/>
+        <w:tblLook w:firstColumn="1" w:firstRow="1" w:lastColumn="0" w:lastRow="0" w:noHBand="0" w:noVBand="1" w:val="04A0"/>
+      </w:tblPr>
+      <w:tblGrid>
+        <w:gridCol w:w="1694"/>
+        <w:gridCol w:w="1694"/>
+        <w:gridCol w:w="1694"/>
+        <w:gridCol w:w="1694"/>
+        <w:gridCol w:w="1694"/>
+        <w:gridCol w:w="1694"/>
+      </w:tblGrid>
+      <w:tr>
+        <w:tc>
+          <w:tcPr>
+            <w:tcW w:type="dxa" w:w="1694"/>
+            <w:vAlign w:val="center"/>
+            <w:shd w:fill="F2F4F7"/>
+          </w:tcPr>
+          <w:p>
+            <w:pPr>
+              <w:spacing w:after="0"/>
+            </w:pPr>
+            <w:r/>
+            <w:r>
+              <w:rPr>
+                <w:rFonts w:ascii="Calibri" w:hAnsi="Calibri" w:eastAsia="Microsoft YaHei"/>
+                <w:b/>
+                <w:sz w:val="16"/>
+              </w:rPr>
+              <w:t>阻尼比</w:t>
+            </w:r>
+          </w:p>
+        </w:tc>
+        <w:tc>
+          <w:tcPr>
+            <w:tcW w:type="dxa" w:w="1694"/>
+            <w:vAlign w:val="center"/>
+            <w:shd w:fill="F2F4F7"/>
+          </w:tcPr>
+          <w:p>
+            <w:pPr>
+              <w:spacing w:after="0"/>
+            </w:pPr>
+            <w:r/>
+            <w:r>
+              <w:rPr>
+                <w:rFonts w:ascii="Calibri" w:hAnsi="Calibri" w:eastAsia="Microsoft YaHei"/>
+                <w:b/>
+                <w:sz w:val="16"/>
+              </w:rPr>
+              <w:t>峰值 mm</w:t>
+            </w:r>
+          </w:p>
+        </w:tc>
+        <w:tc>
+          <w:tcPr>
+            <w:tcW w:type="dxa" w:w="1694"/>
+            <w:vAlign w:val="center"/>
+            <w:shd w:fill="F2F4F7"/>
+          </w:tcPr>
+          <w:p>
+            <w:pPr>
+              <w:spacing w:after="0"/>
+            </w:pPr>
+            <w:r/>
+            <w:r>
+              <w:rPr>
+                <w:rFonts w:ascii="Calibri" w:hAnsi="Calibri" w:eastAsia="Microsoft YaHei"/>
+                <w:b/>
+                <w:sz w:val="16"/>
+              </w:rPr>
+              <w:t>峰值时间 ms</w:t>
+            </w:r>
+          </w:p>
+        </w:tc>
+        <w:tc>
+          <w:tcPr>
+            <w:tcW w:type="dxa" w:w="1694"/>
+            <w:vAlign w:val="center"/>
+            <w:shd w:fill="F2F4F7"/>
+          </w:tcPr>
+          <w:p>
+            <w:pPr>
+              <w:spacing w:after="0"/>
+            </w:pPr>
+            <w:r/>
+            <w:r>
+              <w:rPr>
+                <w:rFonts w:ascii="Calibri" w:hAnsi="Calibri" w:eastAsia="Microsoft YaHei"/>
+                <w:b/>
+                <w:sz w:val="16"/>
+              </w:rPr>
+              <w:t>超调</w:t>
+            </w:r>
+          </w:p>
+        </w:tc>
+        <w:tc>
+          <w:tcPr>
+            <w:tcW w:type="dxa" w:w="1694"/>
+            <w:vAlign w:val="center"/>
+            <w:shd w:fill="F2F4F7"/>
+          </w:tcPr>
+          <w:p>
+            <w:pPr>
+              <w:spacing w:after="0"/>
+            </w:pPr>
+            <w:r/>
+            <w:r>
+              <w:rPr>
+                <w:rFonts w:ascii="Calibri" w:hAnsi="Calibri" w:eastAsia="Microsoft YaHei"/>
+                <w:b/>
+                <w:sz w:val="16"/>
+              </w:rPr>
+              <w:t>40 ms 位移 mm</w:t>
+            </w:r>
+          </w:p>
+        </w:tc>
+        <w:tc>
+          <w:tcPr>
+            <w:tcW w:type="dxa" w:w="1694"/>
+            <w:vAlign w:val="center"/>
+            <w:shd w:fill="F2F4F7"/>
+          </w:tcPr>
+          <w:p>
+            <w:pPr>
+              <w:spacing w:after="0"/>
+            </w:pPr>
+            <w:r/>
+            <w:r>
+              <w:rPr>
+                <w:rFonts w:ascii="Calibri" w:hAnsi="Calibri" w:eastAsia="Microsoft YaHei"/>
+                <w:b/>
+                <w:sz w:val="16"/>
+              </w:rPr>
+              <w:t>最大 θ 跨度 K</w:t>
+            </w:r>
+          </w:p>
+        </w:tc>
+      </w:tr>
+      <w:tr>
+        <w:tc>
+          <w:tcPr>
+            <w:tcW w:type="dxa" w:w="1694"/>
+            <w:vAlign w:val="center"/>
+          </w:tcPr>
+          <w:p>
+            <w:pPr>
+              <w:spacing w:after="0"/>
+            </w:pPr>
+            <w:r/>
+            <w:r>
+              <w:rPr>
+                <w:rFonts w:ascii="Calibri" w:hAnsi="Calibri" w:eastAsia="Microsoft YaHei"/>
+                <w:b w:val="0"/>
+                <w:sz w:val="16"/>
+              </w:rPr>
+              <w:t>0.0%</w:t>
+            </w:r>
+          </w:p>
+        </w:tc>
+        <w:tc>
+          <w:tcPr>
+            <w:tcW w:type="dxa" w:w="1694"/>
+            <w:vAlign w:val="center"/>
+          </w:tcPr>
+          <w:p>
+            <w:pPr>
+              <w:spacing w:after="0"/>
+            </w:pPr>
+            <w:r/>
+            <w:r>
+              <w:rPr>
+                <w:rFonts w:ascii="Calibri" w:hAnsi="Calibri" w:eastAsia="Microsoft YaHei"/>
+                <w:b w:val="0"/>
+                <w:sz w:val="16"/>
+              </w:rPr>
+              <w:t>-4.503943</w:t>
+            </w:r>
+          </w:p>
+        </w:tc>
+        <w:tc>
+          <w:tcPr>
+            <w:tcW w:type="dxa" w:w="1694"/>
+            <w:vAlign w:val="center"/>
+          </w:tcPr>
+          <w:p>
+            <w:pPr>
+              <w:spacing w:after="0"/>
+            </w:pPr>
+            <w:r/>
+            <w:r>
+              <w:rPr>
+                <w:rFonts w:ascii="Calibri" w:hAnsi="Calibri" w:eastAsia="Microsoft YaHei"/>
+                <w:b w:val="0"/>
+                <w:sz w:val="16"/>
+              </w:rPr>
+              <w:t>28.9</w:t>
+            </w:r>
+          </w:p>
+        </w:tc>
+        <w:tc>
+          <w:tcPr>
+            <w:tcW w:type="dxa" w:w="1694"/>
+            <w:vAlign w:val="center"/>
+          </w:tcPr>
+          <w:p>
+            <w:pPr>
+              <w:spacing w:after="0"/>
+            </w:pPr>
+            <w:r/>
+            <w:r>
+              <w:rPr>
+                <w:rFonts w:ascii="Calibri" w:hAnsi="Calibri" w:eastAsia="Microsoft YaHei"/>
+                <w:b w:val="0"/>
+                <w:sz w:val="16"/>
+              </w:rPr>
+              <w:t>1.96276</w:t>
+            </w:r>
+          </w:p>
+        </w:tc>
+        <w:tc>
+          <w:tcPr>
+            <w:tcW w:type="dxa" w:w="1694"/>
+            <w:vAlign w:val="center"/>
+          </w:tcPr>
+          <w:p>
+            <w:pPr>
+              <w:spacing w:after="0"/>
+            </w:pPr>
+            <w:r/>
+            <w:r>
+              <w:rPr>
+                <w:rFonts w:ascii="Calibri" w:hAnsi="Calibri" w:eastAsia="Microsoft YaHei"/>
+                <w:b w:val="0"/>
+                <w:sz w:val="16"/>
+              </w:rPr>
+              <w:t>-0.412865</w:t>
+            </w:r>
+          </w:p>
+        </w:tc>
+        <w:tc>
+          <w:tcPr>
+            <w:tcW w:type="dxa" w:w="1694"/>
+            <w:vAlign w:val="center"/>
+          </w:tcPr>
+          <w:p>
+            <w:pPr>
+              <w:spacing w:after="0"/>
+            </w:pPr>
+            <w:r/>
+            <w:r>
+              <w:rPr>
+                <w:rFonts w:ascii="Calibri" w:hAnsi="Calibri" w:eastAsia="Microsoft YaHei"/>
+                <w:b w:val="0"/>
+                <w:sz w:val="16"/>
+              </w:rPr>
+              <w:t>5.113388</w:t>
+            </w:r>
+          </w:p>
+        </w:tc>
+      </w:tr>
+      <w:tr>
+        <w:tc>
+          <w:tcPr>
+            <w:tcW w:type="dxa" w:w="1694"/>
+            <w:vAlign w:val="center"/>
+          </w:tcPr>
+          <w:p>
+            <w:pPr>
+              <w:spacing w:after="0"/>
+            </w:pPr>
+            <w:r/>
+            <w:r>
+              <w:rPr>
+                <w:rFonts w:ascii="Calibri" w:hAnsi="Calibri" w:eastAsia="Microsoft YaHei"/>
+                <w:b w:val="0"/>
+                <w:sz w:val="16"/>
+              </w:rPr>
+              <w:t>0.5%</w:t>
+            </w:r>
+          </w:p>
+        </w:tc>
+        <w:tc>
+          <w:tcPr>
+            <w:tcW w:type="dxa" w:w="1694"/>
+            <w:vAlign w:val="center"/>
+          </w:tcPr>
+          <w:p>
+            <w:pPr>
+              <w:spacing w:after="0"/>
+            </w:pPr>
+            <w:r/>
+            <w:r>
+              <w:rPr>
+                <w:rFonts w:ascii="Calibri" w:hAnsi="Calibri" w:eastAsia="Microsoft YaHei"/>
+                <w:b w:val="0"/>
+                <w:sz w:val="16"/>
+              </w:rPr>
+              <w:t>-4.444669</w:t>
+            </w:r>
+          </w:p>
+        </w:tc>
+        <w:tc>
+          <w:tcPr>
+            <w:tcW w:type="dxa" w:w="1694"/>
+            <w:vAlign w:val="center"/>
+          </w:tcPr>
+          <w:p>
+            <w:pPr>
+              <w:spacing w:after="0"/>
+            </w:pPr>
+            <w:r/>
+            <w:r>
+              <w:rPr>
+                <w:rFonts w:ascii="Calibri" w:hAnsi="Calibri" w:eastAsia="Microsoft YaHei"/>
+                <w:b w:val="0"/>
+                <w:sz w:val="16"/>
+              </w:rPr>
+              <w:t>9.6</w:t>
+            </w:r>
+          </w:p>
+        </w:tc>
+        <w:tc>
+          <w:tcPr>
+            <w:tcW w:type="dxa" w:w="1694"/>
+            <w:vAlign w:val="center"/>
+          </w:tcPr>
+          <w:p>
+            <w:pPr>
+              <w:spacing w:after="0"/>
+            </w:pPr>
+            <w:r/>
+            <w:r>
+              <w:rPr>
+                <w:rFonts w:ascii="Calibri" w:hAnsi="Calibri" w:eastAsia="Microsoft YaHei"/>
+                <w:b w:val="0"/>
+                <w:sz w:val="16"/>
+              </w:rPr>
+              <w:t>1.93693</w:t>
+            </w:r>
+          </w:p>
+        </w:tc>
+        <w:tc>
+          <w:tcPr>
+            <w:tcW w:type="dxa" w:w="1694"/>
+            <w:vAlign w:val="center"/>
+          </w:tcPr>
+          <w:p>
+            <w:pPr>
+              <w:spacing w:after="0"/>
+            </w:pPr>
+            <w:r/>
+            <w:r>
+              <w:rPr>
+                <w:rFonts w:ascii="Calibri" w:hAnsi="Calibri" w:eastAsia="Microsoft YaHei"/>
+                <w:b w:val="0"/>
+                <w:sz w:val="16"/>
+              </w:rPr>
+              <w:t>-0.520488</w:t>
+            </w:r>
+          </w:p>
+        </w:tc>
+        <w:tc>
+          <w:tcPr>
+            <w:tcW w:type="dxa" w:w="1694"/>
+            <w:vAlign w:val="center"/>
+          </w:tcPr>
+          <w:p>
+            <w:pPr>
+              <w:spacing w:after="0"/>
+            </w:pPr>
+            <w:r/>
+            <w:r>
+              <w:rPr>
+                <w:rFonts w:ascii="Calibri" w:hAnsi="Calibri" w:eastAsia="Microsoft YaHei"/>
+                <w:b w:val="0"/>
+                <w:sz w:val="16"/>
+              </w:rPr>
+              <w:t>5.064735</w:t>
+            </w:r>
+          </w:p>
+        </w:tc>
+      </w:tr>
+      <w:tr>
+        <w:tc>
+          <w:tcPr>
+            <w:tcW w:type="dxa" w:w="1694"/>
+            <w:vAlign w:val="center"/>
+          </w:tcPr>
+          <w:p>
+            <w:pPr>
+              <w:spacing w:after="0"/>
+            </w:pPr>
+            <w:r/>
+            <w:r>
+              <w:rPr>
+                <w:rFonts w:ascii="Calibri" w:hAnsi="Calibri" w:eastAsia="Microsoft YaHei"/>
+                <w:b w:val="0"/>
+                <w:sz w:val="16"/>
+              </w:rPr>
+              <w:t>0.8%</w:t>
+            </w:r>
+          </w:p>
+        </w:tc>
+        <w:tc>
+          <w:tcPr>
+            <w:tcW w:type="dxa" w:w="1694"/>
+            <w:vAlign w:val="center"/>
+          </w:tcPr>
+          <w:p>
+            <w:pPr>
+              <w:spacing w:after="0"/>
+            </w:pPr>
+            <w:r/>
+            <w:r>
+              <w:rPr>
+                <w:rFonts w:ascii="Calibri" w:hAnsi="Calibri" w:eastAsia="Microsoft YaHei"/>
+                <w:b w:val="0"/>
+                <w:sz w:val="16"/>
+              </w:rPr>
+              <w:t>-4.426965</w:t>
+            </w:r>
+          </w:p>
+        </w:tc>
+        <w:tc>
+          <w:tcPr>
+            <w:tcW w:type="dxa" w:w="1694"/>
+            <w:vAlign w:val="center"/>
+          </w:tcPr>
+          <w:p>
+            <w:pPr>
+              <w:spacing w:after="0"/>
+            </w:pPr>
+            <w:r/>
+            <w:r>
+              <w:rPr>
+                <w:rFonts w:ascii="Calibri" w:hAnsi="Calibri" w:eastAsia="Microsoft YaHei"/>
+                <w:b w:val="0"/>
+                <w:sz w:val="16"/>
+              </w:rPr>
+              <w:t>9.6</w:t>
+            </w:r>
+          </w:p>
+        </w:tc>
+        <w:tc>
+          <w:tcPr>
+            <w:tcW w:type="dxa" w:w="1694"/>
+            <w:vAlign w:val="center"/>
+          </w:tcPr>
+          <w:p>
+            <w:pPr>
+              <w:spacing w:after="0"/>
+            </w:pPr>
+            <w:r/>
+            <w:r>
+              <w:rPr>
+                <w:rFonts w:ascii="Calibri" w:hAnsi="Calibri" w:eastAsia="Microsoft YaHei"/>
+                <w:b w:val="0"/>
+                <w:sz w:val="16"/>
+              </w:rPr>
+              <w:t>1.929214</w:t>
+            </w:r>
+          </w:p>
+        </w:tc>
+        <w:tc>
+          <w:tcPr>
+            <w:tcW w:type="dxa" w:w="1694"/>
+            <w:vAlign w:val="center"/>
+          </w:tcPr>
+          <w:p>
+            <w:pPr>
+              <w:spacing w:after="0"/>
+            </w:pPr>
+            <w:r/>
+            <w:r>
+              <w:rPr>
+                <w:rFonts w:ascii="Calibri" w:hAnsi="Calibri" w:eastAsia="Microsoft YaHei"/>
+                <w:b w:val="0"/>
+                <w:sz w:val="16"/>
+              </w:rPr>
+              <w:t>-0.582984</w:t>
+            </w:r>
+          </w:p>
+        </w:tc>
+        <w:tc>
+          <w:tcPr>
+            <w:tcW w:type="dxa" w:w="1694"/>
+            <w:vAlign w:val="center"/>
+          </w:tcPr>
+          <w:p>
+            <w:pPr>
+              <w:spacing w:after="0"/>
+            </w:pPr>
+            <w:r/>
+            <w:r>
+              <w:rPr>
+                <w:rFonts w:ascii="Calibri" w:hAnsi="Calibri" w:eastAsia="Microsoft YaHei"/>
+                <w:b w:val="0"/>
+                <w:sz w:val="16"/>
+              </w:rPr>
+              <w:t>5.036322</w:t>
+            </w:r>
+          </w:p>
+        </w:tc>
+      </w:tr>
+      <w:tr>
+        <w:tc>
+          <w:tcPr>
+            <w:tcW w:type="dxa" w:w="1694"/>
+            <w:vAlign w:val="center"/>
+          </w:tcPr>
+          <w:p>
+            <w:pPr>
+              <w:spacing w:after="0"/>
+            </w:pPr>
+            <w:r/>
+            <w:r>
+              <w:rPr>
+                <w:rFonts w:ascii="Calibri" w:hAnsi="Calibri" w:eastAsia="Microsoft YaHei"/>
+                <w:b w:val="0"/>
+                <w:sz w:val="16"/>
+              </w:rPr>
+              <w:t>1.5%</w:t>
+            </w:r>
+          </w:p>
+        </w:tc>
+        <w:tc>
+          <w:tcPr>
+            <w:tcW w:type="dxa" w:w="1694"/>
+            <w:vAlign w:val="center"/>
+          </w:tcPr>
+          <w:p>
+            <w:pPr>
+              <w:spacing w:after="0"/>
+            </w:pPr>
+            <w:r/>
+            <w:r>
+              <w:rPr>
+                <w:rFonts w:ascii="Calibri" w:hAnsi="Calibri" w:eastAsia="Microsoft YaHei"/>
+                <w:b w:val="0"/>
+                <w:sz w:val="16"/>
+              </w:rPr>
+              <w:t>-4.38578</w:t>
+            </w:r>
+          </w:p>
+        </w:tc>
+        <w:tc>
+          <w:tcPr>
+            <w:tcW w:type="dxa" w:w="1694"/>
+            <w:vAlign w:val="center"/>
+          </w:tcPr>
+          <w:p>
+            <w:pPr>
+              <w:spacing w:after="0"/>
+            </w:pPr>
+            <w:r/>
+            <w:r>
+              <w:rPr>
+                <w:rFonts w:ascii="Calibri" w:hAnsi="Calibri" w:eastAsia="Microsoft YaHei"/>
+                <w:b w:val="0"/>
+                <w:sz w:val="16"/>
+              </w:rPr>
+              <w:t>9.6</w:t>
+            </w:r>
+          </w:p>
+        </w:tc>
+        <w:tc>
+          <w:tcPr>
+            <w:tcW w:type="dxa" w:w="1694"/>
+            <w:vAlign w:val="center"/>
+          </w:tcPr>
+          <w:p>
+            <w:pPr>
+              <w:spacing w:after="0"/>
+            </w:pPr>
+            <w:r/>
+            <w:r>
+              <w:rPr>
+                <w:rFonts w:ascii="Calibri" w:hAnsi="Calibri" w:eastAsia="Microsoft YaHei"/>
+                <w:b w:val="0"/>
+                <w:sz w:val="16"/>
+              </w:rPr>
+              <w:t>1.911267</w:t>
+            </w:r>
+          </w:p>
+        </w:tc>
+        <w:tc>
+          <w:tcPr>
+            <w:tcW w:type="dxa" w:w="1694"/>
+            <w:vAlign w:val="center"/>
+          </w:tcPr>
+          <w:p>
+            <w:pPr>
+              <w:spacing w:after="0"/>
+            </w:pPr>
+            <w:r/>
+            <w:r>
+              <w:rPr>
+                <w:rFonts w:ascii="Calibri" w:hAnsi="Calibri" w:eastAsia="Microsoft YaHei"/>
+                <w:b w:val="0"/>
+                <w:sz w:val="16"/>
+              </w:rPr>
+              <w:t>-0.721649</w:t>
+            </w:r>
+          </w:p>
+        </w:tc>
+        <w:tc>
+          <w:tcPr>
+            <w:tcW w:type="dxa" w:w="1694"/>
+            <w:vAlign w:val="center"/>
+          </w:tcPr>
+          <w:p>
+            <w:pPr>
+              <w:spacing w:after="0"/>
+            </w:pPr>
+            <w:r/>
+            <w:r>
+              <w:rPr>
+                <w:rFonts w:ascii="Calibri" w:hAnsi="Calibri" w:eastAsia="Microsoft YaHei"/>
+                <w:b w:val="0"/>
+                <w:sz w:val="16"/>
+              </w:rPr>
+              <w:t>4.972045</w:t>
+            </w:r>
+          </w:p>
+        </w:tc>
+      </w:tr>
+    </w:tbl>
+    <w:p/>
+    <w:p>
+      <w:pPr>
+        <w:spacing w:after="160"/>
+      </w:pPr>
+      <w:r>
+        <w:rPr>
+          <w:rFonts w:ascii="Calibri" w:hAnsi="Calibri" w:eastAsia="Microsoft YaHei"/>
+          <w:b/>
+          <w:color w:val="1F4D78"/>
+          <w:sz w:val="24"/>
+        </w:rPr>
+        <w:t>图 27 30x30 模态阻尼敏感性摘要</w:t>
+      </w:r>
+    </w:p>
+    <w:p>
+      <w:pPr>
+        <w:spacing w:before="40" w:after="160"/>
+        <w:jc w:val="center"/>
+      </w:pPr>
+      <w:r>
+        <w:drawing>
+          <wp:inline xmlns:a="http://schemas.openxmlformats.org/drawingml/2006/main" xmlns:pic="http://schemas.openxmlformats.org/drawingml/2006/picture">
+            <wp:extent cx="6035040" cy="2003633"/>
+            <wp:docPr id="27" name="Picture 27"/>
+            <wp:cNvGraphicFramePr>
+              <a:graphicFrameLocks noChangeAspect="1"/>
+            </wp:cNvGraphicFramePr>
+            <a:graphic>
+              <a:graphicData uri="http://schemas.openxmlformats.org/drawingml/2006/picture">
+                <pic:pic>
+                  <pic:nvPicPr>
+                    <pic:cNvPr id="0" name="36_damping_summary_table.png"/>
+                    <pic:cNvPicPr/>
+                  </pic:nvPicPr>
+                  <pic:blipFill>
+                    <a:blip r:embed="rId35"/>
+                    <a:stretch>
+                      <a:fillRect/>
+                    </a:stretch>
+                  </pic:blipFill>
+                  <pic:spPr>
+                    <a:xfrm>
+                      <a:off x="0" y="0"/>
+                      <a:ext cx="6035040" cy="2003633"/>
+                    </a:xfrm>
+                    <a:prstGeom prst="rect"/>
+                  </pic:spPr>
+                </pic:pic>
+              </a:graphicData>
+            </a:graphic>
+          </wp:inline>
+        </w:drawing>
+      </w:r>
+    </w:p>
+    <w:p>
+      <w:pPr>
+        <w:spacing w:after="160"/>
+      </w:pPr>
+      <w:r>
+        <w:rPr>
+          <w:rFonts w:ascii="Calibri" w:hAnsi="Calibri" w:eastAsia="Microsoft YaHei"/>
+          <w:b/>
+          <w:color w:val="1F4D78"/>
+          <w:sz w:val="24"/>
+        </w:rPr>
+        <w:t>图 28 动力峰值随阻尼比变化</w:t>
+      </w:r>
+    </w:p>
+    <w:p>
+      <w:pPr>
+        <w:spacing w:before="40" w:after="160"/>
+        <w:jc w:val="center"/>
+      </w:pPr>
+      <w:r>
+        <w:drawing>
+          <wp:inline xmlns:a="http://schemas.openxmlformats.org/drawingml/2006/main" xmlns:pic="http://schemas.openxmlformats.org/drawingml/2006/picture">
+            <wp:extent cx="6035040" cy="3394710"/>
+            <wp:docPr id="28" name="Picture 28"/>
+            <wp:cNvGraphicFramePr>
+              <a:graphicFrameLocks noChangeAspect="1"/>
+            </wp:cNvGraphicFramePr>
+            <a:graphic>
+              <a:graphicData uri="http://schemas.openxmlformats.org/drawingml/2006/picture">
+                <pic:pic>
+                  <pic:nvPicPr>
+                    <pic:cNvPr id="0" name="37_peak_vs_damping.png"/>
+                    <pic:cNvPicPr/>
+                  </pic:nvPicPr>
+                  <pic:blipFill>
+                    <a:blip r:embed="rId36"/>
+                    <a:stretch>
+                      <a:fillRect/>
+                    </a:stretch>
+                  </pic:blipFill>
+                  <pic:spPr>
+                    <a:xfrm>
+                      <a:off x="0" y="0"/>
+                      <a:ext cx="6035040" cy="3394710"/>
+                    </a:xfrm>
+                    <a:prstGeom prst="rect"/>
+                  </pic:spPr>
+                </pic:pic>
+              </a:graphicData>
+            </a:graphic>
+          </wp:inline>
+        </w:drawing>
+      </w:r>
+    </w:p>
+    <w:p>
+      <w:pPr>
+        <w:spacing w:after="160"/>
+      </w:pPr>
+      <w:r>
+        <w:rPr>
+          <w:rFonts w:ascii="Calibri" w:hAnsi="Calibri" w:eastAsia="Microsoft YaHei"/>
+          <w:b/>
+          <w:color w:val="1F4D78"/>
+          <w:sz w:val="24"/>
+        </w:rPr>
+        <w:t>图 29 不同阻尼比中心挠度时程</w:t>
+      </w:r>
+    </w:p>
+    <w:p>
+      <w:pPr>
+        <w:spacing w:before="40" w:after="160"/>
+        <w:jc w:val="center"/>
+      </w:pPr>
+      <w:r>
+        <w:drawing>
+          <wp:inline xmlns:a="http://schemas.openxmlformats.org/drawingml/2006/main" xmlns:pic="http://schemas.openxmlformats.org/drawingml/2006/picture">
+            <wp:extent cx="6035040" cy="3394710"/>
+            <wp:docPr id="29" name="Picture 29"/>
+            <wp:cNvGraphicFramePr>
+              <a:graphicFrameLocks noChangeAspect="1"/>
+            </wp:cNvGraphicFramePr>
+            <a:graphic>
+              <a:graphicData uri="http://schemas.openxmlformats.org/drawingml/2006/picture">
+                <pic:pic>
+                  <pic:nvPicPr>
+                    <pic:cNvPr id="0" name="39_center_timeseries_by_damping.png"/>
+                    <pic:cNvPicPr/>
+                  </pic:nvPicPr>
+                  <pic:blipFill>
+                    <a:blip r:embed="rId37"/>
+                    <a:stretch>
+                      <a:fillRect/>
+                    </a:stretch>
+                  </pic:blipFill>
+                  <pic:spPr>
+                    <a:xfrm>
+                      <a:off x="0" y="0"/>
+                      <a:ext cx="6035040" cy="3394710"/>
+                    </a:xfrm>
+                    <a:prstGeom prst="rect"/>
+                  </pic:spPr>
+                </pic:pic>
+              </a:graphicData>
+            </a:graphic>
+          </wp:inline>
+        </w:drawing>
+      </w:r>
+    </w:p>
+    <w:p>
+      <w:pPr>
+        <w:spacing w:after="160"/>
+      </w:pPr>
+      <w:r>
+        <w:rPr>
+          <w:rFonts w:ascii="Calibri" w:hAnsi="Calibri" w:eastAsia="Microsoft YaHei"/>
+          <w:b/>
+          <w:color w:val="1F4D78"/>
+          <w:sz w:val="24"/>
+        </w:rPr>
+        <w:t>图 30 阻尼敏感性判断</w:t>
+      </w:r>
+    </w:p>
+    <w:p>
+      <w:pPr>
+        <w:spacing w:before="40" w:after="160"/>
+        <w:jc w:val="center"/>
+      </w:pPr>
+      <w:r>
+        <w:drawing>
+          <wp:inline xmlns:a="http://schemas.openxmlformats.org/drawingml/2006/main" xmlns:pic="http://schemas.openxmlformats.org/drawingml/2006/picture">
+            <wp:extent cx="6035040" cy="2003633"/>
+            <wp:docPr id="30" name="Picture 30"/>
+            <wp:cNvGraphicFramePr>
+              <a:graphicFrameLocks noChangeAspect="1"/>
+            </wp:cNvGraphicFramePr>
+            <a:graphic>
+              <a:graphicData uri="http://schemas.openxmlformats.org/drawingml/2006/picture">
+                <pic:pic>
+                  <pic:nvPicPr>
+                    <pic:cNvPr id="0" name="41_damping_assessment_table.png"/>
+                    <pic:cNvPicPr/>
+                  </pic:nvPicPr>
+                  <pic:blipFill>
+                    <a:blip r:embed="rId38"/>
+                    <a:stretch>
+                      <a:fillRect/>
+                    </a:stretch>
+                  </pic:blipFill>
+                  <pic:spPr>
+                    <a:xfrm>
+                      <a:off x="0" y="0"/>
+                      <a:ext cx="6035040" cy="2003633"/>
+                    </a:xfrm>
+                    <a:prstGeom prst="rect"/>
+                  </pic:spPr>
+                </pic:pic>
+              </a:graphicData>
+            </a:graphic>
+          </wp:inline>
+        </w:drawing>
+      </w:r>
+    </w:p>
+    <w:p>
+      <w:pPr>
+        <w:spacing w:before="160" w:after="160"/>
+      </w:pPr>
+      <w:r>
+        <w:rPr>
+          <w:rFonts w:ascii="Calibri" w:hAnsi="Calibri" w:eastAsia="Microsoft YaHei"/>
+          <w:b/>
+          <w:color w:val="2E74B5"/>
+          <w:sz w:val="32"/>
+        </w:rPr>
+        <w:t>11. 下一步</w:t>
       </w:r>
     </w:p>
     <w:tbl>
@@ -4508,7 +7264,7 @@
                 <w:b w:val="0"/>
                 <w:sz w:val="16"/>
               </w:rPr>
-              <w:t>动力代表算例</w:t>
+              <w:t>长时程 Newmark 对照</w:t>
             </w:r>
           </w:p>
         </w:tc>
@@ -4528,7 +7284,7 @@
                 <w:b w:val="0"/>
                 <w:sz w:val="16"/>
               </w:rPr>
-              <w:t>未完成；已有 Newmark 函数与历史脚本</w:t>
+              <w:t>30x30 全量 Newmark 交互运行过慢</w:t>
             </w:r>
           </w:p>
         </w:tc>
@@ -4548,7 +7304,7 @@
                 <w:b w:val="0"/>
                 <w:sz w:val="16"/>
               </w:rPr>
-              <w:t>封装统一入口，输出时程和峰值</w:t>
+              <w:t>可作为夜间长任务补 1 个对照窗</w:t>
             </w:r>
           </w:p>
         </w:tc>

</xml_diff>

<commit_message>
feat(report): add modal damping progress materials
</commit_message>
<xml_diff>
--- a/reports/2026-05-22-progress/FG_MEET_progress_report_2026-05-22.docx
+++ b/reports/2026-05-22-progress/FG_MEET_progress_report_2026-05-22.docx
@@ -21,7 +21,7 @@
         <w:jc w:val="center"/>
       </w:pPr>
       <w:r>
-        <w:t>模型目标、方法路线、问题排查、正确/错误结果与最终验证证据 | 2026-05-22</w:t>
+        <w:t>模型目标、方法路线、问题排查、正确/错误结果、动力补充与 PDF 版汇报 | 2026-05-22/23</w:t>
       </w:r>
     </w:p>
     <w:p/>
@@ -101,7 +101,7 @@
       <w:r>
         <w:drawing>
           <wp:inline xmlns:a="http://schemas.openxmlformats.org/drawingml/2006/main" xmlns:pic="http://schemas.openxmlformats.org/drawingml/2006/picture">
-            <wp:extent cx="6035040" cy="2792212"/>
+            <wp:extent cx="6035040" cy="3661258"/>
             <wp:docPr id="2" name="Picture 2"/>
             <wp:cNvGraphicFramePr>
               <a:graphicFrameLocks noChangeAspect="1"/>
@@ -122,7 +122,7 @@
                   <pic:spPr>
                     <a:xfrm>
                       <a:off x="0" y="0"/>
-                      <a:ext cx="6035040" cy="2792212"/>
+                      <a:ext cx="6035040" cy="3661258"/>
                     </a:xfrm>
                     <a:prstGeom prst="rect"/>
                   </pic:spPr>
@@ -467,7 +467,7 @@
       <w:r>
         <w:drawing>
           <wp:inline xmlns:a="http://schemas.openxmlformats.org/drawingml/2006/main" xmlns:pic="http://schemas.openxmlformats.org/drawingml/2006/picture">
-            <wp:extent cx="6035040" cy="2684819"/>
+            <wp:extent cx="6035040" cy="2893724"/>
             <wp:docPr id="4" name="Picture 4"/>
             <wp:cNvGraphicFramePr>
               <a:graphicFrameLocks noChangeAspect="1"/>
@@ -488,7 +488,7 @@
                   <pic:spPr>
                     <a:xfrm>
                       <a:off x="0" y="0"/>
-                      <a:ext cx="6035040" cy="2684819"/>
+                      <a:ext cx="6035040" cy="2893724"/>
                     </a:xfrm>
                     <a:prstGeom prst="rect"/>
                   </pic:spPr>
@@ -4411,7 +4411,2763 @@
           <w:color w:val="2E74B5"/>
           <w:sz w:val="32"/>
         </w:rPr>
-        <w:t>8. 下一步</w:t>
+        <w:t>8. 动力代表算例与 30x30 模态结果</w:t>
+      </w:r>
+    </w:p>
+    <w:tbl>
+      <w:tblPr>
+        <w:tblStyle w:val="TableGrid"/>
+        <w:tblW w:type="auto" w:w="0"/>
+        <w:jc w:val="center"/>
+        <w:tblLook w:firstColumn="1" w:firstRow="1" w:lastColumn="0" w:lastRow="0" w:noHBand="0" w:noVBand="1" w:val="04A0"/>
+      </w:tblPr>
+      <w:tblGrid>
+        <w:gridCol w:w="1694"/>
+        <w:gridCol w:w="1694"/>
+        <w:gridCol w:w="1694"/>
+        <w:gridCol w:w="1694"/>
+        <w:gridCol w:w="1694"/>
+        <w:gridCol w:w="1694"/>
+      </w:tblGrid>
+      <w:tr>
+        <w:tc>
+          <w:tcPr>
+            <w:tcW w:type="dxa" w:w="1694"/>
+            <w:vAlign w:val="center"/>
+            <w:shd w:fill="F2F4F7"/>
+          </w:tcPr>
+          <w:p>
+            <w:pPr>
+              <w:spacing w:after="0"/>
+            </w:pPr>
+            <w:r/>
+            <w:r>
+              <w:rPr>
+                <w:rFonts w:ascii="Calibri" w:hAnsi="Calibri" w:eastAsia="Microsoft YaHei"/>
+                <w:b/>
+                <w:sz w:val="16"/>
+              </w:rPr>
+              <w:t>方法</w:t>
+            </w:r>
+          </w:p>
+        </w:tc>
+        <w:tc>
+          <w:tcPr>
+            <w:tcW w:type="dxa" w:w="1694"/>
+            <w:vAlign w:val="center"/>
+            <w:shd w:fill="F2F4F7"/>
+          </w:tcPr>
+          <w:p>
+            <w:pPr>
+              <w:spacing w:after="0"/>
+            </w:pPr>
+            <w:r/>
+            <w:r>
+              <w:rPr>
+                <w:rFonts w:ascii="Calibri" w:hAnsi="Calibri" w:eastAsia="Microsoft YaHei"/>
+                <w:b/>
+                <w:sz w:val="16"/>
+              </w:rPr>
+              <w:t>静态中心 mm</w:t>
+            </w:r>
+          </w:p>
+        </w:tc>
+        <w:tc>
+          <w:tcPr>
+            <w:tcW w:type="dxa" w:w="1694"/>
+            <w:vAlign w:val="center"/>
+            <w:shd w:fill="F2F4F7"/>
+          </w:tcPr>
+          <w:p>
+            <w:pPr>
+              <w:spacing w:after="0"/>
+            </w:pPr>
+            <w:r/>
+            <w:r>
+              <w:rPr>
+                <w:rFonts w:ascii="Calibri" w:hAnsi="Calibri" w:eastAsia="Microsoft YaHei"/>
+                <w:b/>
+                <w:sz w:val="16"/>
+              </w:rPr>
+              <w:t>动力峰值 mm</w:t>
+            </w:r>
+          </w:p>
+        </w:tc>
+        <w:tc>
+          <w:tcPr>
+            <w:tcW w:type="dxa" w:w="1694"/>
+            <w:vAlign w:val="center"/>
+            <w:shd w:fill="F2F4F7"/>
+          </w:tcPr>
+          <w:p>
+            <w:pPr>
+              <w:spacing w:after="0"/>
+            </w:pPr>
+            <w:r/>
+            <w:r>
+              <w:rPr>
+                <w:rFonts w:ascii="Calibri" w:hAnsi="Calibri" w:eastAsia="Microsoft YaHei"/>
+                <w:b/>
+                <w:sz w:val="16"/>
+              </w:rPr>
+              <w:t>峰值时间 ms</w:t>
+            </w:r>
+          </w:p>
+        </w:tc>
+        <w:tc>
+          <w:tcPr>
+            <w:tcW w:type="dxa" w:w="1694"/>
+            <w:vAlign w:val="center"/>
+            <w:shd w:fill="F2F4F7"/>
+          </w:tcPr>
+          <w:p>
+            <w:pPr>
+              <w:spacing w:after="0"/>
+            </w:pPr>
+            <w:r/>
+            <w:r>
+              <w:rPr>
+                <w:rFonts w:ascii="Calibri" w:hAnsi="Calibri" w:eastAsia="Microsoft YaHei"/>
+                <w:b/>
+                <w:sz w:val="16"/>
+              </w:rPr>
+              <w:t>一阶频率 Hz</w:t>
+            </w:r>
+          </w:p>
+        </w:tc>
+        <w:tc>
+          <w:tcPr>
+            <w:tcW w:type="dxa" w:w="1694"/>
+            <w:vAlign w:val="center"/>
+            <w:shd w:fill="F2F4F7"/>
+          </w:tcPr>
+          <w:p>
+            <w:pPr>
+              <w:spacing w:after="0"/>
+            </w:pPr>
+            <w:r/>
+            <w:r>
+              <w:rPr>
+                <w:rFonts w:ascii="Calibri" w:hAnsi="Calibri" w:eastAsia="Microsoft YaHei"/>
+                <w:b/>
+                <w:sz w:val="16"/>
+              </w:rPr>
+              <w:t>最大 θ 跨度 K</w:t>
+            </w:r>
+          </w:p>
+        </w:tc>
+      </w:tr>
+      <w:tr>
+        <w:tc>
+          <w:tcPr>
+            <w:tcW w:type="dxa" w:w="1694"/>
+            <w:vAlign w:val="center"/>
+          </w:tcPr>
+          <w:p>
+            <w:pPr>
+              <w:spacing w:after="0"/>
+            </w:pPr>
+            <w:r/>
+            <w:r>
+              <w:rPr>
+                <w:rFonts w:ascii="Calibri" w:hAnsi="Calibri" w:eastAsia="Microsoft YaHei"/>
+                <w:b w:val="0"/>
+                <w:sz w:val="16"/>
+              </w:rPr>
+              <w:t>10x10 Newmark pilot</w:t>
+            </w:r>
+          </w:p>
+        </w:tc>
+        <w:tc>
+          <w:tcPr>
+            <w:tcW w:type="dxa" w:w="1694"/>
+            <w:vAlign w:val="center"/>
+          </w:tcPr>
+          <w:p>
+            <w:pPr>
+              <w:spacing w:after="0"/>
+            </w:pPr>
+            <w:r/>
+            <w:r>
+              <w:rPr>
+                <w:rFonts w:ascii="Calibri" w:hAnsi="Calibri" w:eastAsia="Microsoft YaHei"/>
+                <w:b w:val="0"/>
+                <w:sz w:val="16"/>
+              </w:rPr>
+              <w:t>-2.1284</w:t>
+            </w:r>
+          </w:p>
+        </w:tc>
+        <w:tc>
+          <w:tcPr>
+            <w:tcW w:type="dxa" w:w="1694"/>
+            <w:vAlign w:val="center"/>
+          </w:tcPr>
+          <w:p>
+            <w:pPr>
+              <w:spacing w:after="0"/>
+            </w:pPr>
+            <w:r/>
+            <w:r>
+              <w:rPr>
+                <w:rFonts w:ascii="Calibri" w:hAnsi="Calibri" w:eastAsia="Microsoft YaHei"/>
+                <w:b w:val="0"/>
+                <w:sz w:val="16"/>
+              </w:rPr>
+              <w:t>-4.4995</w:t>
+            </w:r>
+          </w:p>
+        </w:tc>
+        <w:tc>
+          <w:tcPr>
+            <w:tcW w:type="dxa" w:w="1694"/>
+            <w:vAlign w:val="center"/>
+          </w:tcPr>
+          <w:p>
+            <w:pPr>
+              <w:spacing w:after="0"/>
+            </w:pPr>
+            <w:r/>
+            <w:r>
+              <w:rPr>
+                <w:rFonts w:ascii="Calibri" w:hAnsi="Calibri" w:eastAsia="Microsoft YaHei"/>
+                <w:b w:val="0"/>
+                <w:sz w:val="16"/>
+              </w:rPr>
+              <w:t>28.90</w:t>
+            </w:r>
+          </w:p>
+        </w:tc>
+        <w:tc>
+          <w:tcPr>
+            <w:tcW w:type="dxa" w:w="1694"/>
+            <w:vAlign w:val="center"/>
+          </w:tcPr>
+          <w:p>
+            <w:pPr>
+              <w:spacing w:after="0"/>
+            </w:pPr>
+            <w:r/>
+            <w:r>
+              <w:rPr>
+                <w:rFonts w:ascii="Calibri" w:hAnsi="Calibri" w:eastAsia="Microsoft YaHei"/>
+                <w:b w:val="0"/>
+                <w:sz w:val="16"/>
+              </w:rPr>
+              <w:t>52.20</w:t>
+            </w:r>
+          </w:p>
+        </w:tc>
+        <w:tc>
+          <w:tcPr>
+            <w:tcW w:type="dxa" w:w="1694"/>
+            <w:vAlign w:val="center"/>
+          </w:tcPr>
+          <w:p>
+            <w:pPr>
+              <w:spacing w:after="0"/>
+            </w:pPr>
+            <w:r/>
+            <w:r>
+              <w:rPr>
+                <w:rFonts w:ascii="Calibri" w:hAnsi="Calibri" w:eastAsia="Microsoft YaHei"/>
+                <w:b w:val="0"/>
+                <w:sz w:val="16"/>
+              </w:rPr>
+              <w:t>5.1311</w:t>
+            </w:r>
+          </w:p>
+        </w:tc>
+      </w:tr>
+      <w:tr>
+        <w:tc>
+          <w:tcPr>
+            <w:tcW w:type="dxa" w:w="1694"/>
+            <w:vAlign w:val="center"/>
+          </w:tcPr>
+          <w:p>
+            <w:pPr>
+              <w:spacing w:after="0"/>
+            </w:pPr>
+            <w:r/>
+            <w:r>
+              <w:rPr>
+                <w:rFonts w:ascii="Calibri" w:hAnsi="Calibri" w:eastAsia="Microsoft YaHei"/>
+                <w:b w:val="0"/>
+                <w:sz w:val="16"/>
+              </w:rPr>
+              <w:t>30x30 8 阶模态</w:t>
+            </w:r>
+          </w:p>
+        </w:tc>
+        <w:tc>
+          <w:tcPr>
+            <w:tcW w:type="dxa" w:w="1694"/>
+            <w:vAlign w:val="center"/>
+          </w:tcPr>
+          <w:p>
+            <w:pPr>
+              <w:spacing w:after="0"/>
+            </w:pPr>
+            <w:r/>
+            <w:r>
+              <w:rPr>
+                <w:rFonts w:ascii="Calibri" w:hAnsi="Calibri" w:eastAsia="Microsoft YaHei"/>
+                <w:b w:val="0"/>
+                <w:sz w:val="16"/>
+              </w:rPr>
+              <w:t>-2.2947</w:t>
+            </w:r>
+          </w:p>
+        </w:tc>
+        <w:tc>
+          <w:tcPr>
+            <w:tcW w:type="dxa" w:w="1694"/>
+            <w:vAlign w:val="center"/>
+          </w:tcPr>
+          <w:p>
+            <w:pPr>
+              <w:spacing w:after="0"/>
+            </w:pPr>
+            <w:r/>
+            <w:r>
+              <w:rPr>
+                <w:rFonts w:ascii="Calibri" w:hAnsi="Calibri" w:eastAsia="Microsoft YaHei"/>
+                <w:b w:val="0"/>
+                <w:sz w:val="16"/>
+              </w:rPr>
+              <w:t>-4.4279</w:t>
+            </w:r>
+          </w:p>
+        </w:tc>
+        <w:tc>
+          <w:tcPr>
+            <w:tcW w:type="dxa" w:w="1694"/>
+            <w:vAlign w:val="center"/>
+          </w:tcPr>
+          <w:p>
+            <w:pPr>
+              <w:spacing w:after="0"/>
+            </w:pPr>
+            <w:r/>
+            <w:r>
+              <w:rPr>
+                <w:rFonts w:ascii="Calibri" w:hAnsi="Calibri" w:eastAsia="Microsoft YaHei"/>
+                <w:b w:val="0"/>
+                <w:sz w:val="16"/>
+              </w:rPr>
+              <w:t>9.50</w:t>
+            </w:r>
+          </w:p>
+        </w:tc>
+        <w:tc>
+          <w:tcPr>
+            <w:tcW w:type="dxa" w:w="1694"/>
+            <w:vAlign w:val="center"/>
+          </w:tcPr>
+          <w:p>
+            <w:pPr>
+              <w:spacing w:after="0"/>
+            </w:pPr>
+            <w:r/>
+            <w:r>
+              <w:rPr>
+                <w:rFonts w:ascii="Calibri" w:hAnsi="Calibri" w:eastAsia="Microsoft YaHei"/>
+                <w:b w:val="0"/>
+                <w:sz w:val="16"/>
+              </w:rPr>
+              <w:t>52.20</w:t>
+            </w:r>
+          </w:p>
+        </w:tc>
+        <w:tc>
+          <w:tcPr>
+            <w:tcW w:type="dxa" w:w="1694"/>
+            <w:vAlign w:val="center"/>
+          </w:tcPr>
+          <w:p>
+            <w:pPr>
+              <w:spacing w:after="0"/>
+            </w:pPr>
+            <w:r/>
+            <w:r>
+              <w:rPr>
+                <w:rFonts w:ascii="Calibri" w:hAnsi="Calibri" w:eastAsia="Microsoft YaHei"/>
+                <w:b w:val="0"/>
+                <w:sz w:val="16"/>
+              </w:rPr>
+              <w:t>5.0398</w:t>
+            </w:r>
+          </w:p>
+        </w:tc>
+      </w:tr>
+      <w:tr>
+        <w:tc>
+          <w:tcPr>
+            <w:tcW w:type="dxa" w:w="1694"/>
+            <w:vAlign w:val="center"/>
+          </w:tcPr>
+          <w:p>
+            <w:pPr>
+              <w:spacing w:after="0"/>
+            </w:pPr>
+            <w:r/>
+            <w:r>
+              <w:rPr>
+                <w:rFonts w:ascii="Calibri" w:hAnsi="Calibri" w:eastAsia="Microsoft YaHei"/>
+                <w:b w:val="0"/>
+                <w:sz w:val="16"/>
+              </w:rPr>
+              <w:t>30x30 16 阶模态</w:t>
+            </w:r>
+          </w:p>
+        </w:tc>
+        <w:tc>
+          <w:tcPr>
+            <w:tcW w:type="dxa" w:w="1694"/>
+            <w:vAlign w:val="center"/>
+          </w:tcPr>
+          <w:p>
+            <w:pPr>
+              <w:spacing w:after="0"/>
+            </w:pPr>
+            <w:r/>
+            <w:r>
+              <w:rPr>
+                <w:rFonts w:ascii="Calibri" w:hAnsi="Calibri" w:eastAsia="Microsoft YaHei"/>
+                <w:b w:val="0"/>
+                <w:sz w:val="16"/>
+              </w:rPr>
+              <w:t>-2.2947</w:t>
+            </w:r>
+          </w:p>
+        </w:tc>
+        <w:tc>
+          <w:tcPr>
+            <w:tcW w:type="dxa" w:w="1694"/>
+            <w:vAlign w:val="center"/>
+          </w:tcPr>
+          <w:p>
+            <w:pPr>
+              <w:spacing w:after="0"/>
+            </w:pPr>
+            <w:r/>
+            <w:r>
+              <w:rPr>
+                <w:rFonts w:ascii="Calibri" w:hAnsi="Calibri" w:eastAsia="Microsoft YaHei"/>
+                <w:b w:val="0"/>
+                <w:sz w:val="16"/>
+              </w:rPr>
+              <w:t>-4.4270</w:t>
+            </w:r>
+          </w:p>
+        </w:tc>
+        <w:tc>
+          <w:tcPr>
+            <w:tcW w:type="dxa" w:w="1694"/>
+            <w:vAlign w:val="center"/>
+          </w:tcPr>
+          <w:p>
+            <w:pPr>
+              <w:spacing w:after="0"/>
+            </w:pPr>
+            <w:r/>
+            <w:r>
+              <w:rPr>
+                <w:rFonts w:ascii="Calibri" w:hAnsi="Calibri" w:eastAsia="Microsoft YaHei"/>
+                <w:b w:val="0"/>
+                <w:sz w:val="16"/>
+              </w:rPr>
+              <w:t>9.60</w:t>
+            </w:r>
+          </w:p>
+        </w:tc>
+        <w:tc>
+          <w:tcPr>
+            <w:tcW w:type="dxa" w:w="1694"/>
+            <w:vAlign w:val="center"/>
+          </w:tcPr>
+          <w:p>
+            <w:pPr>
+              <w:spacing w:after="0"/>
+            </w:pPr>
+            <w:r/>
+            <w:r>
+              <w:rPr>
+                <w:rFonts w:ascii="Calibri" w:hAnsi="Calibri" w:eastAsia="Microsoft YaHei"/>
+                <w:b w:val="0"/>
+                <w:sz w:val="16"/>
+              </w:rPr>
+              <w:t>52.20</w:t>
+            </w:r>
+          </w:p>
+        </w:tc>
+        <w:tc>
+          <w:tcPr>
+            <w:tcW w:type="dxa" w:w="1694"/>
+            <w:vAlign w:val="center"/>
+          </w:tcPr>
+          <w:p>
+            <w:pPr>
+              <w:spacing w:after="0"/>
+            </w:pPr>
+            <w:r/>
+            <w:r>
+              <w:rPr>
+                <w:rFonts w:ascii="Calibri" w:hAnsi="Calibri" w:eastAsia="Microsoft YaHei"/>
+                <w:b w:val="0"/>
+                <w:sz w:val="16"/>
+              </w:rPr>
+              <w:t>5.0363</w:t>
+            </w:r>
+          </w:p>
+        </w:tc>
+      </w:tr>
+    </w:tbl>
+    <w:p/>
+    <w:p>
+      <w:pPr>
+        <w:spacing w:after="160"/>
+      </w:pPr>
+      <w:r>
+        <w:rPr>
+          <w:rFonts w:ascii="Calibri" w:hAnsi="Calibri" w:eastAsia="Microsoft YaHei"/>
+          <w:b/>
+          <w:color w:val="1F4D78"/>
+          <w:sz w:val="24"/>
+        </w:rPr>
+        <w:t>图 16 动力结果总览</w:t>
+      </w:r>
+    </w:p>
+    <w:p>
+      <w:pPr>
+        <w:spacing w:before="40" w:after="160"/>
+        <w:jc w:val="center"/>
+      </w:pPr>
+      <w:r>
+        <w:drawing>
+          <wp:inline xmlns:a="http://schemas.openxmlformats.org/drawingml/2006/main" xmlns:pic="http://schemas.openxmlformats.org/drawingml/2006/picture">
+            <wp:extent cx="6035040" cy="1705905"/>
+            <wp:docPr id="16" name="Picture 16"/>
+            <wp:cNvGraphicFramePr>
+              <a:graphicFrameLocks noChangeAspect="1"/>
+            </wp:cNvGraphicFramePr>
+            <a:graphic>
+              <a:graphicData uri="http://schemas.openxmlformats.org/drawingml/2006/picture">
+                <pic:pic>
+                  <pic:nvPicPr>
+                    <pic:cNvPr id="0" name="16_dynamic_overview_table.png"/>
+                    <pic:cNvPicPr/>
+                  </pic:nvPicPr>
+                  <pic:blipFill>
+                    <a:blip r:embed="rId24"/>
+                    <a:stretch>
+                      <a:fillRect/>
+                    </a:stretch>
+                  </pic:blipFill>
+                  <pic:spPr>
+                    <a:xfrm>
+                      <a:off x="0" y="0"/>
+                      <a:ext cx="6035040" cy="1705905"/>
+                    </a:xfrm>
+                    <a:prstGeom prst="rect"/>
+                  </pic:spPr>
+                </pic:pic>
+              </a:graphicData>
+            </a:graphic>
+          </wp:inline>
+        </w:drawing>
+      </w:r>
+    </w:p>
+    <w:p>
+      <w:pPr>
+        <w:spacing w:after="160"/>
+      </w:pPr>
+      <w:r>
+        <w:rPr>
+          <w:rFonts w:ascii="Calibri" w:hAnsi="Calibri" w:eastAsia="Microsoft YaHei"/>
+          <w:b/>
+          <w:color w:val="1F4D78"/>
+          <w:sz w:val="24"/>
+        </w:rPr>
+        <w:t>图 17 10x10 Newmark pilot 摘要</w:t>
+      </w:r>
+    </w:p>
+    <w:p>
+      <w:pPr>
+        <w:spacing w:before="40" w:after="160"/>
+        <w:jc w:val="center"/>
+      </w:pPr>
+      <w:r>
+        <w:drawing>
+          <wp:inline xmlns:a="http://schemas.openxmlformats.org/drawingml/2006/main" xmlns:pic="http://schemas.openxmlformats.org/drawingml/2006/picture">
+            <wp:extent cx="6035040" cy="3073847"/>
+            <wp:docPr id="17" name="Picture 17"/>
+            <wp:cNvGraphicFramePr>
+              <a:graphicFrameLocks noChangeAspect="1"/>
+            </wp:cNvGraphicFramePr>
+            <a:graphic>
+              <a:graphicData uri="http://schemas.openxmlformats.org/drawingml/2006/picture">
+                <pic:pic>
+                  <pic:nvPicPr>
+                    <pic:cNvPr id="0" name="18_dynamic_summary_table.png"/>
+                    <pic:cNvPicPr/>
+                  </pic:nvPicPr>
+                  <pic:blipFill>
+                    <a:blip r:embed="rId25"/>
+                    <a:stretch>
+                      <a:fillRect/>
+                    </a:stretch>
+                  </pic:blipFill>
+                  <pic:spPr>
+                    <a:xfrm>
+                      <a:off x="0" y="0"/>
+                      <a:ext cx="6035040" cy="3073847"/>
+                    </a:xfrm>
+                    <a:prstGeom prst="rect"/>
+                  </pic:spPr>
+                </pic:pic>
+              </a:graphicData>
+            </a:graphic>
+          </wp:inline>
+        </w:drawing>
+      </w:r>
+    </w:p>
+    <w:p>
+      <w:pPr>
+        <w:spacing w:after="160"/>
+      </w:pPr>
+      <w:r>
+        <w:rPr>
+          <w:rFonts w:ascii="Calibri" w:hAnsi="Calibri" w:eastAsia="Microsoft YaHei"/>
+          <w:b/>
+          <w:color w:val="1F4D78"/>
+          <w:sz w:val="24"/>
+        </w:rPr>
+        <w:t>图 18 10x10 Newmark 中心挠度时程</w:t>
+      </w:r>
+    </w:p>
+    <w:p>
+      <w:pPr>
+        <w:spacing w:before="40" w:after="160"/>
+        <w:jc w:val="center"/>
+      </w:pPr>
+      <w:r>
+        <w:drawing>
+          <wp:inline xmlns:a="http://schemas.openxmlformats.org/drawingml/2006/main" xmlns:pic="http://schemas.openxmlformats.org/drawingml/2006/picture">
+            <wp:extent cx="6035040" cy="3394710"/>
+            <wp:docPr id="18" name="Picture 18"/>
+            <wp:cNvGraphicFramePr>
+              <a:graphicFrameLocks noChangeAspect="1"/>
+            </wp:cNvGraphicFramePr>
+            <a:graphic>
+              <a:graphicData uri="http://schemas.openxmlformats.org/drawingml/2006/picture">
+                <pic:pic>
+                  <pic:nvPicPr>
+                    <pic:cNvPr id="0" name="19_dynamic_center_timeseries.png"/>
+                    <pic:cNvPicPr/>
+                  </pic:nvPicPr>
+                  <pic:blipFill>
+                    <a:blip r:embed="rId26"/>
+                    <a:stretch>
+                      <a:fillRect/>
+                    </a:stretch>
+                  </pic:blipFill>
+                  <pic:spPr>
+                    <a:xfrm>
+                      <a:off x="0" y="0"/>
+                      <a:ext cx="6035040" cy="3394710"/>
+                    </a:xfrm>
+                    <a:prstGeom prst="rect"/>
+                  </pic:spPr>
+                </pic:pic>
+              </a:graphicData>
+            </a:graphic>
+          </wp:inline>
+        </w:drawing>
+      </w:r>
+    </w:p>
+    <w:p>
+      <w:pPr>
+        <w:spacing w:after="160"/>
+      </w:pPr>
+      <w:r>
+        <w:rPr>
+          <w:rFonts w:ascii="Calibri" w:hAnsi="Calibri" w:eastAsia="Microsoft YaHei"/>
+          <w:b/>
+          <w:color w:val="1F4D78"/>
+          <w:sz w:val="24"/>
+        </w:rPr>
+        <w:t>图 19 30x30 8 阶模态结果摘要</w:t>
+      </w:r>
+    </w:p>
+    <w:p>
+      <w:pPr>
+        <w:spacing w:before="40" w:after="160"/>
+        <w:jc w:val="center"/>
+      </w:pPr>
+      <w:r>
+        <w:drawing>
+          <wp:inline xmlns:a="http://schemas.openxmlformats.org/drawingml/2006/main" xmlns:pic="http://schemas.openxmlformats.org/drawingml/2006/picture">
+            <wp:extent cx="6035040" cy="3291108"/>
+            <wp:docPr id="19" name="Picture 19"/>
+            <wp:cNvGraphicFramePr>
+              <a:graphicFrameLocks noChangeAspect="1"/>
+            </wp:cNvGraphicFramePr>
+            <a:graphic>
+              <a:graphicData uri="http://schemas.openxmlformats.org/drawingml/2006/picture">
+                <pic:pic>
+                  <pic:nvPicPr>
+                    <pic:cNvPr id="0" name="22_modal30x30_summary_table.png"/>
+                    <pic:cNvPicPr/>
+                  </pic:nvPicPr>
+                  <pic:blipFill>
+                    <a:blip r:embed="rId27"/>
+                    <a:stretch>
+                      <a:fillRect/>
+                    </a:stretch>
+                  </pic:blipFill>
+                  <pic:spPr>
+                    <a:xfrm>
+                      <a:off x="0" y="0"/>
+                      <a:ext cx="6035040" cy="3291108"/>
+                    </a:xfrm>
+                    <a:prstGeom prst="rect"/>
+                  </pic:spPr>
+                </pic:pic>
+              </a:graphicData>
+            </a:graphic>
+          </wp:inline>
+        </w:drawing>
+      </w:r>
+    </w:p>
+    <w:p>
+      <w:pPr>
+        <w:spacing w:after="160"/>
+      </w:pPr>
+      <w:r>
+        <w:rPr>
+          <w:rFonts w:ascii="Calibri" w:hAnsi="Calibri" w:eastAsia="Microsoft YaHei"/>
+          <w:b/>
+          <w:color w:val="1F4D78"/>
+          <w:sz w:val="24"/>
+        </w:rPr>
+        <w:t>图 20 30x30 8 阶模态中心挠度时程</w:t>
+      </w:r>
+    </w:p>
+    <w:p>
+      <w:pPr>
+        <w:spacing w:before="40" w:after="160"/>
+        <w:jc w:val="center"/>
+      </w:pPr>
+      <w:r>
+        <w:drawing>
+          <wp:inline xmlns:a="http://schemas.openxmlformats.org/drawingml/2006/main" xmlns:pic="http://schemas.openxmlformats.org/drawingml/2006/picture">
+            <wp:extent cx="6035040" cy="3394710"/>
+            <wp:docPr id="20" name="Picture 20"/>
+            <wp:cNvGraphicFramePr>
+              <a:graphicFrameLocks noChangeAspect="1"/>
+            </wp:cNvGraphicFramePr>
+            <a:graphic>
+              <a:graphicData uri="http://schemas.openxmlformats.org/drawingml/2006/picture">
+                <pic:pic>
+                  <pic:nvPicPr>
+                    <pic:cNvPr id="0" name="23_modal30x30_center_timeseries.png"/>
+                    <pic:cNvPicPr/>
+                  </pic:nvPicPr>
+                  <pic:blipFill>
+                    <a:blip r:embed="rId28"/>
+                    <a:stretch>
+                      <a:fillRect/>
+                    </a:stretch>
+                  </pic:blipFill>
+                  <pic:spPr>
+                    <a:xfrm>
+                      <a:off x="0" y="0"/>
+                      <a:ext cx="6035040" cy="3394710"/>
+                    </a:xfrm>
+                    <a:prstGeom prst="rect"/>
+                  </pic:spPr>
+                </pic:pic>
+              </a:graphicData>
+            </a:graphic>
+          </wp:inline>
+        </w:drawing>
+      </w:r>
+    </w:p>
+    <w:p>
+      <w:pPr>
+        <w:spacing w:after="160"/>
+      </w:pPr>
+      <w:r>
+        <w:rPr>
+          <w:rFonts w:ascii="Calibri" w:hAnsi="Calibri" w:eastAsia="Microsoft YaHei"/>
+          <w:b/>
+          <w:color w:val="1F4D78"/>
+          <w:sz w:val="24"/>
+        </w:rPr>
+        <w:t>图 21 10x10 Newmark 与 30x30 模态对比</w:t>
+      </w:r>
+    </w:p>
+    <w:p>
+      <w:pPr>
+        <w:spacing w:before="40" w:after="160"/>
+        <w:jc w:val="center"/>
+      </w:pPr>
+      <w:r>
+        <w:drawing>
+          <wp:inline xmlns:a="http://schemas.openxmlformats.org/drawingml/2006/main" xmlns:pic="http://schemas.openxmlformats.org/drawingml/2006/picture">
+            <wp:extent cx="6035040" cy="3394710"/>
+            <wp:docPr id="21" name="Picture 21"/>
+            <wp:cNvGraphicFramePr>
+              <a:graphicFrameLocks noChangeAspect="1"/>
+            </wp:cNvGraphicFramePr>
+            <a:graphic>
+              <a:graphicData uri="http://schemas.openxmlformats.org/drawingml/2006/picture">
+                <pic:pic>
+                  <pic:nvPicPr>
+                    <pic:cNvPr id="0" name="27_10x10_vs_30x30_center.png"/>
+                    <pic:cNvPicPr/>
+                  </pic:nvPicPr>
+                  <pic:blipFill>
+                    <a:blip r:embed="rId29"/>
+                    <a:stretch>
+                      <a:fillRect/>
+                    </a:stretch>
+                  </pic:blipFill>
+                  <pic:spPr>
+                    <a:xfrm>
+                      <a:off x="0" y="0"/>
+                      <a:ext cx="6035040" cy="3394710"/>
+                    </a:xfrm>
+                    <a:prstGeom prst="rect"/>
+                  </pic:spPr>
+                </pic:pic>
+              </a:graphicData>
+            </a:graphic>
+          </wp:inline>
+        </w:drawing>
+      </w:r>
+    </w:p>
+    <w:p>
+      <w:r>
+        <w:br w:type="page"/>
+      </w:r>
+    </w:p>
+    <w:p>
+      <w:pPr>
+        <w:spacing w:before="160" w:after="160"/>
+      </w:pPr>
+      <w:r>
+        <w:rPr>
+          <w:rFonts w:ascii="Calibri" w:hAnsi="Calibri" w:eastAsia="Microsoft YaHei"/>
+          <w:b/>
+          <w:color w:val="2E74B5"/>
+          <w:sz w:val="32"/>
+        </w:rPr>
+        <w:t>9. 模态阶数敏感性</w:t>
+      </w:r>
+    </w:p>
+    <w:tbl>
+      <w:tblPr>
+        <w:tblStyle w:val="TableGrid"/>
+        <w:tblW w:type="auto" w:w="0"/>
+        <w:jc w:val="center"/>
+        <w:tblLook w:firstColumn="1" w:firstRow="1" w:lastColumn="0" w:lastRow="0" w:noHBand="0" w:noVBand="1" w:val="04A0"/>
+      </w:tblPr>
+      <w:tblGrid>
+        <w:gridCol w:w="1694"/>
+        <w:gridCol w:w="1694"/>
+        <w:gridCol w:w="1694"/>
+        <w:gridCol w:w="1694"/>
+        <w:gridCol w:w="1694"/>
+        <w:gridCol w:w="1694"/>
+      </w:tblGrid>
+      <w:tr>
+        <w:tc>
+          <w:tcPr>
+            <w:tcW w:type="dxa" w:w="1694"/>
+            <w:vAlign w:val="center"/>
+            <w:shd w:fill="F2F4F7"/>
+          </w:tcPr>
+          <w:p>
+            <w:pPr>
+              <w:spacing w:after="0"/>
+            </w:pPr>
+            <w:r/>
+            <w:r>
+              <w:rPr>
+                <w:rFonts w:ascii="Calibri" w:hAnsi="Calibri" w:eastAsia="Microsoft YaHei"/>
+                <w:b/>
+                <w:sz w:val="16"/>
+              </w:rPr>
+              <w:t>阶数</w:t>
+            </w:r>
+          </w:p>
+        </w:tc>
+        <w:tc>
+          <w:tcPr>
+            <w:tcW w:type="dxa" w:w="1694"/>
+            <w:vAlign w:val="center"/>
+            <w:shd w:fill="F2F4F7"/>
+          </w:tcPr>
+          <w:p>
+            <w:pPr>
+              <w:spacing w:after="0"/>
+            </w:pPr>
+            <w:r/>
+            <w:r>
+              <w:rPr>
+                <w:rFonts w:ascii="Calibri" w:hAnsi="Calibri" w:eastAsia="Microsoft YaHei"/>
+                <w:b/>
+                <w:sz w:val="16"/>
+              </w:rPr>
+              <w:t>静态捕获</w:t>
+            </w:r>
+          </w:p>
+        </w:tc>
+        <w:tc>
+          <w:tcPr>
+            <w:tcW w:type="dxa" w:w="1694"/>
+            <w:vAlign w:val="center"/>
+            <w:shd w:fill="F2F4F7"/>
+          </w:tcPr>
+          <w:p>
+            <w:pPr>
+              <w:spacing w:after="0"/>
+            </w:pPr>
+            <w:r/>
+            <w:r>
+              <w:rPr>
+                <w:rFonts w:ascii="Calibri" w:hAnsi="Calibri" w:eastAsia="Microsoft YaHei"/>
+                <w:b/>
+                <w:sz w:val="16"/>
+              </w:rPr>
+              <w:t>峰值 mm</w:t>
+            </w:r>
+          </w:p>
+        </w:tc>
+        <w:tc>
+          <w:tcPr>
+            <w:tcW w:type="dxa" w:w="1694"/>
+            <w:vAlign w:val="center"/>
+            <w:shd w:fill="F2F4F7"/>
+          </w:tcPr>
+          <w:p>
+            <w:pPr>
+              <w:spacing w:after="0"/>
+            </w:pPr>
+            <w:r/>
+            <w:r>
+              <w:rPr>
+                <w:rFonts w:ascii="Calibri" w:hAnsi="Calibri" w:eastAsia="Microsoft YaHei"/>
+                <w:b/>
+                <w:sz w:val="16"/>
+              </w:rPr>
+              <w:t>峰值时间 ms</w:t>
+            </w:r>
+          </w:p>
+        </w:tc>
+        <w:tc>
+          <w:tcPr>
+            <w:tcW w:type="dxa" w:w="1694"/>
+            <w:vAlign w:val="center"/>
+            <w:shd w:fill="F2F4F7"/>
+          </w:tcPr>
+          <w:p>
+            <w:pPr>
+              <w:spacing w:after="0"/>
+            </w:pPr>
+            <w:r/>
+            <w:r>
+              <w:rPr>
+                <w:rFonts w:ascii="Calibri" w:hAnsi="Calibri" w:eastAsia="Microsoft YaHei"/>
+                <w:b/>
+                <w:sz w:val="16"/>
+              </w:rPr>
+              <w:t>超调</w:t>
+            </w:r>
+          </w:p>
+        </w:tc>
+        <w:tc>
+          <w:tcPr>
+            <w:tcW w:type="dxa" w:w="1694"/>
+            <w:vAlign w:val="center"/>
+            <w:shd w:fill="F2F4F7"/>
+          </w:tcPr>
+          <w:p>
+            <w:pPr>
+              <w:spacing w:after="0"/>
+            </w:pPr>
+            <w:r/>
+            <w:r>
+              <w:rPr>
+                <w:rFonts w:ascii="Calibri" w:hAnsi="Calibri" w:eastAsia="Microsoft YaHei"/>
+                <w:b/>
+                <w:sz w:val="16"/>
+              </w:rPr>
+              <w:t>最大 θ 跨度 K</w:t>
+            </w:r>
+          </w:p>
+        </w:tc>
+      </w:tr>
+      <w:tr>
+        <w:tc>
+          <w:tcPr>
+            <w:tcW w:type="dxa" w:w="1694"/>
+            <w:vAlign w:val="center"/>
+          </w:tcPr>
+          <w:p>
+            <w:pPr>
+              <w:spacing w:after="0"/>
+            </w:pPr>
+            <w:r/>
+            <w:r>
+              <w:rPr>
+                <w:rFonts w:ascii="Calibri" w:hAnsi="Calibri" w:eastAsia="Microsoft YaHei"/>
+                <w:b w:val="0"/>
+                <w:sz w:val="16"/>
+              </w:rPr>
+              <w:t>4.0</w:t>
+            </w:r>
+          </w:p>
+        </w:tc>
+        <w:tc>
+          <w:tcPr>
+            <w:tcW w:type="dxa" w:w="1694"/>
+            <w:vAlign w:val="center"/>
+          </w:tcPr>
+          <w:p>
+            <w:pPr>
+              <w:spacing w:after="0"/>
+            </w:pPr>
+            <w:r/>
+            <w:r>
+              <w:rPr>
+                <w:rFonts w:ascii="Calibri" w:hAnsi="Calibri" w:eastAsia="Microsoft YaHei"/>
+                <w:b w:val="0"/>
+                <w:sz w:val="16"/>
+              </w:rPr>
+              <w:t>1.000349</w:t>
+            </w:r>
+          </w:p>
+        </w:tc>
+        <w:tc>
+          <w:tcPr>
+            <w:tcW w:type="dxa" w:w="1694"/>
+            <w:vAlign w:val="center"/>
+          </w:tcPr>
+          <w:p>
+            <w:pPr>
+              <w:spacing w:after="0"/>
+            </w:pPr>
+            <w:r/>
+            <w:r>
+              <w:rPr>
+                <w:rFonts w:ascii="Calibri" w:hAnsi="Calibri" w:eastAsia="Microsoft YaHei"/>
+                <w:b w:val="0"/>
+                <w:sz w:val="16"/>
+              </w:rPr>
+              <w:t>-4.428136</w:t>
+            </w:r>
+          </w:p>
+        </w:tc>
+        <w:tc>
+          <w:tcPr>
+            <w:tcW w:type="dxa" w:w="1694"/>
+            <w:vAlign w:val="center"/>
+          </w:tcPr>
+          <w:p>
+            <w:pPr>
+              <w:spacing w:after="0"/>
+            </w:pPr>
+            <w:r/>
+            <w:r>
+              <w:rPr>
+                <w:rFonts w:ascii="Calibri" w:hAnsi="Calibri" w:eastAsia="Microsoft YaHei"/>
+                <w:b w:val="0"/>
+                <w:sz w:val="16"/>
+              </w:rPr>
+              <w:t>9.5</w:t>
+            </w:r>
+          </w:p>
+        </w:tc>
+        <w:tc>
+          <w:tcPr>
+            <w:tcW w:type="dxa" w:w="1694"/>
+            <w:vAlign w:val="center"/>
+          </w:tcPr>
+          <w:p>
+            <w:pPr>
+              <w:spacing w:after="0"/>
+            </w:pPr>
+            <w:r/>
+            <w:r>
+              <w:rPr>
+                <w:rFonts w:ascii="Calibri" w:hAnsi="Calibri" w:eastAsia="Microsoft YaHei"/>
+                <w:b w:val="0"/>
+                <w:sz w:val="16"/>
+              </w:rPr>
+              <w:t>1.929725</w:t>
+            </w:r>
+          </w:p>
+        </w:tc>
+        <w:tc>
+          <w:tcPr>
+            <w:tcW w:type="dxa" w:w="1694"/>
+            <w:vAlign w:val="center"/>
+          </w:tcPr>
+          <w:p>
+            <w:pPr>
+              <w:spacing w:after="0"/>
+            </w:pPr>
+            <w:r/>
+            <w:r>
+              <w:rPr>
+                <w:rFonts w:ascii="Calibri" w:hAnsi="Calibri" w:eastAsia="Microsoft YaHei"/>
+                <w:b w:val="0"/>
+                <w:sz w:val="16"/>
+              </w:rPr>
+              <w:t>5.025591</w:t>
+            </w:r>
+          </w:p>
+        </w:tc>
+      </w:tr>
+      <w:tr>
+        <w:tc>
+          <w:tcPr>
+            <w:tcW w:type="dxa" w:w="1694"/>
+            <w:vAlign w:val="center"/>
+          </w:tcPr>
+          <w:p>
+            <w:pPr>
+              <w:spacing w:after="0"/>
+            </w:pPr>
+            <w:r/>
+            <w:r>
+              <w:rPr>
+                <w:rFonts w:ascii="Calibri" w:hAnsi="Calibri" w:eastAsia="Microsoft YaHei"/>
+                <w:b w:val="0"/>
+                <w:sz w:val="16"/>
+              </w:rPr>
+              <w:t>6.0</w:t>
+            </w:r>
+          </w:p>
+        </w:tc>
+        <w:tc>
+          <w:tcPr>
+            <w:tcW w:type="dxa" w:w="1694"/>
+            <w:vAlign w:val="center"/>
+          </w:tcPr>
+          <w:p>
+            <w:pPr>
+              <w:spacing w:after="0"/>
+            </w:pPr>
+            <w:r/>
+            <w:r>
+              <w:rPr>
+                <w:rFonts w:ascii="Calibri" w:hAnsi="Calibri" w:eastAsia="Microsoft YaHei"/>
+                <w:b w:val="0"/>
+                <w:sz w:val="16"/>
+              </w:rPr>
+              <w:t>1.000053</w:t>
+            </w:r>
+          </w:p>
+        </w:tc>
+        <w:tc>
+          <w:tcPr>
+            <w:tcW w:type="dxa" w:w="1694"/>
+            <w:vAlign w:val="center"/>
+          </w:tcPr>
+          <w:p>
+            <w:pPr>
+              <w:spacing w:after="0"/>
+            </w:pPr>
+            <w:r/>
+            <w:r>
+              <w:rPr>
+                <w:rFonts w:ascii="Calibri" w:hAnsi="Calibri" w:eastAsia="Microsoft YaHei"/>
+                <w:b w:val="0"/>
+                <w:sz w:val="16"/>
+              </w:rPr>
+              <w:t>-4.427098</w:t>
+            </w:r>
+          </w:p>
+        </w:tc>
+        <w:tc>
+          <w:tcPr>
+            <w:tcW w:type="dxa" w:w="1694"/>
+            <w:vAlign w:val="center"/>
+          </w:tcPr>
+          <w:p>
+            <w:pPr>
+              <w:spacing w:after="0"/>
+            </w:pPr>
+            <w:r/>
+            <w:r>
+              <w:rPr>
+                <w:rFonts w:ascii="Calibri" w:hAnsi="Calibri" w:eastAsia="Microsoft YaHei"/>
+                <w:b w:val="0"/>
+                <w:sz w:val="16"/>
+              </w:rPr>
+              <w:t>9.6</w:t>
+            </w:r>
+          </w:p>
+        </w:tc>
+        <w:tc>
+          <w:tcPr>
+            <w:tcW w:type="dxa" w:w="1694"/>
+            <w:vAlign w:val="center"/>
+          </w:tcPr>
+          <w:p>
+            <w:pPr>
+              <w:spacing w:after="0"/>
+            </w:pPr>
+            <w:r/>
+            <w:r>
+              <w:rPr>
+                <w:rFonts w:ascii="Calibri" w:hAnsi="Calibri" w:eastAsia="Microsoft YaHei"/>
+                <w:b w:val="0"/>
+                <w:sz w:val="16"/>
+              </w:rPr>
+              <w:t>1.929273</w:t>
+            </w:r>
+          </w:p>
+        </w:tc>
+        <w:tc>
+          <w:tcPr>
+            <w:tcW w:type="dxa" w:w="1694"/>
+            <w:vAlign w:val="center"/>
+          </w:tcPr>
+          <w:p>
+            <w:pPr>
+              <w:spacing w:after="0"/>
+            </w:pPr>
+            <w:r/>
+            <w:r>
+              <w:rPr>
+                <w:rFonts w:ascii="Calibri" w:hAnsi="Calibri" w:eastAsia="Microsoft YaHei"/>
+                <w:b w:val="0"/>
+                <w:sz w:val="16"/>
+              </w:rPr>
+              <w:t>5.027648</w:t>
+            </w:r>
+          </w:p>
+        </w:tc>
+      </w:tr>
+      <w:tr>
+        <w:tc>
+          <w:tcPr>
+            <w:tcW w:type="dxa" w:w="1694"/>
+            <w:vAlign w:val="center"/>
+          </w:tcPr>
+          <w:p>
+            <w:pPr>
+              <w:spacing w:after="0"/>
+            </w:pPr>
+            <w:r/>
+            <w:r>
+              <w:rPr>
+                <w:rFonts w:ascii="Calibri" w:hAnsi="Calibri" w:eastAsia="Microsoft YaHei"/>
+                <w:b w:val="0"/>
+                <w:sz w:val="16"/>
+              </w:rPr>
+              <w:t>8.0</w:t>
+            </w:r>
+          </w:p>
+        </w:tc>
+        <w:tc>
+          <w:tcPr>
+            <w:tcW w:type="dxa" w:w="1694"/>
+            <w:vAlign w:val="center"/>
+          </w:tcPr>
+          <w:p>
+            <w:pPr>
+              <w:spacing w:after="0"/>
+            </w:pPr>
+            <w:r/>
+            <w:r>
+              <w:rPr>
+                <w:rFonts w:ascii="Calibri" w:hAnsi="Calibri" w:eastAsia="Microsoft YaHei"/>
+                <w:b w:val="0"/>
+                <w:sz w:val="16"/>
+              </w:rPr>
+              <w:t>1.00037</w:t>
+            </w:r>
+          </w:p>
+        </w:tc>
+        <w:tc>
+          <w:tcPr>
+            <w:tcW w:type="dxa" w:w="1694"/>
+            <w:vAlign w:val="center"/>
+          </w:tcPr>
+          <w:p>
+            <w:pPr>
+              <w:spacing w:after="0"/>
+            </w:pPr>
+            <w:r/>
+            <w:r>
+              <w:rPr>
+                <w:rFonts w:ascii="Calibri" w:hAnsi="Calibri" w:eastAsia="Microsoft YaHei"/>
+                <w:b w:val="0"/>
+                <w:sz w:val="16"/>
+              </w:rPr>
+              <w:t>-4.427879</w:t>
+            </w:r>
+          </w:p>
+        </w:tc>
+        <w:tc>
+          <w:tcPr>
+            <w:tcW w:type="dxa" w:w="1694"/>
+            <w:vAlign w:val="center"/>
+          </w:tcPr>
+          <w:p>
+            <w:pPr>
+              <w:spacing w:after="0"/>
+            </w:pPr>
+            <w:r/>
+            <w:r>
+              <w:rPr>
+                <w:rFonts w:ascii="Calibri" w:hAnsi="Calibri" w:eastAsia="Microsoft YaHei"/>
+                <w:b w:val="0"/>
+                <w:sz w:val="16"/>
+              </w:rPr>
+              <w:t>9.5</w:t>
+            </w:r>
+          </w:p>
+        </w:tc>
+        <w:tc>
+          <w:tcPr>
+            <w:tcW w:type="dxa" w:w="1694"/>
+            <w:vAlign w:val="center"/>
+          </w:tcPr>
+          <w:p>
+            <w:pPr>
+              <w:spacing w:after="0"/>
+            </w:pPr>
+            <w:r/>
+            <w:r>
+              <w:rPr>
+                <w:rFonts w:ascii="Calibri" w:hAnsi="Calibri" w:eastAsia="Microsoft YaHei"/>
+                <w:b w:val="0"/>
+                <w:sz w:val="16"/>
+              </w:rPr>
+              <w:t>1.929613</w:t>
+            </w:r>
+          </w:p>
+        </w:tc>
+        <w:tc>
+          <w:tcPr>
+            <w:tcW w:type="dxa" w:w="1694"/>
+            <w:vAlign w:val="center"/>
+          </w:tcPr>
+          <w:p>
+            <w:pPr>
+              <w:spacing w:after="0"/>
+            </w:pPr>
+            <w:r/>
+            <w:r>
+              <w:rPr>
+                <w:rFonts w:ascii="Calibri" w:hAnsi="Calibri" w:eastAsia="Microsoft YaHei"/>
+                <w:b w:val="0"/>
+                <w:sz w:val="16"/>
+              </w:rPr>
+              <w:t>5.039809</w:t>
+            </w:r>
+          </w:p>
+        </w:tc>
+      </w:tr>
+      <w:tr>
+        <w:tc>
+          <w:tcPr>
+            <w:tcW w:type="dxa" w:w="1694"/>
+            <w:vAlign w:val="center"/>
+          </w:tcPr>
+          <w:p>
+            <w:pPr>
+              <w:spacing w:after="0"/>
+            </w:pPr>
+            <w:r/>
+            <w:r>
+              <w:rPr>
+                <w:rFonts w:ascii="Calibri" w:hAnsi="Calibri" w:eastAsia="Microsoft YaHei"/>
+                <w:b w:val="0"/>
+                <w:sz w:val="16"/>
+              </w:rPr>
+              <w:t>12.0</w:t>
+            </w:r>
+          </w:p>
+        </w:tc>
+        <w:tc>
+          <w:tcPr>
+            <w:tcW w:type="dxa" w:w="1694"/>
+            <w:vAlign w:val="center"/>
+          </w:tcPr>
+          <w:p>
+            <w:pPr>
+              <w:spacing w:after="0"/>
+            </w:pPr>
+            <w:r/>
+            <w:r>
+              <w:rPr>
+                <w:rFonts w:ascii="Calibri" w:hAnsi="Calibri" w:eastAsia="Microsoft YaHei"/>
+                <w:b w:val="0"/>
+                <w:sz w:val="16"/>
+              </w:rPr>
+              <w:t>1.000361</w:t>
+            </w:r>
+          </w:p>
+        </w:tc>
+        <w:tc>
+          <w:tcPr>
+            <w:tcW w:type="dxa" w:w="1694"/>
+            <w:vAlign w:val="center"/>
+          </w:tcPr>
+          <w:p>
+            <w:pPr>
+              <w:spacing w:after="0"/>
+            </w:pPr>
+            <w:r/>
+            <w:r>
+              <w:rPr>
+                <w:rFonts w:ascii="Calibri" w:hAnsi="Calibri" w:eastAsia="Microsoft YaHei"/>
+                <w:b w:val="0"/>
+                <w:sz w:val="16"/>
+              </w:rPr>
+              <w:t>-4.427848</w:t>
+            </w:r>
+          </w:p>
+        </w:tc>
+        <w:tc>
+          <w:tcPr>
+            <w:tcW w:type="dxa" w:w="1694"/>
+            <w:vAlign w:val="center"/>
+          </w:tcPr>
+          <w:p>
+            <w:pPr>
+              <w:spacing w:after="0"/>
+            </w:pPr>
+            <w:r/>
+            <w:r>
+              <w:rPr>
+                <w:rFonts w:ascii="Calibri" w:hAnsi="Calibri" w:eastAsia="Microsoft YaHei"/>
+                <w:b w:val="0"/>
+                <w:sz w:val="16"/>
+              </w:rPr>
+              <w:t>9.5</w:t>
+            </w:r>
+          </w:p>
+        </w:tc>
+        <w:tc>
+          <w:tcPr>
+            <w:tcW w:type="dxa" w:w="1694"/>
+            <w:vAlign w:val="center"/>
+          </w:tcPr>
+          <w:p>
+            <w:pPr>
+              <w:spacing w:after="0"/>
+            </w:pPr>
+            <w:r/>
+            <w:r>
+              <w:rPr>
+                <w:rFonts w:ascii="Calibri" w:hAnsi="Calibri" w:eastAsia="Microsoft YaHei"/>
+                <w:b w:val="0"/>
+                <w:sz w:val="16"/>
+              </w:rPr>
+              <w:t>1.929599</w:t>
+            </w:r>
+          </w:p>
+        </w:tc>
+        <w:tc>
+          <w:tcPr>
+            <w:tcW w:type="dxa" w:w="1694"/>
+            <w:vAlign w:val="center"/>
+          </w:tcPr>
+          <w:p>
+            <w:pPr>
+              <w:spacing w:after="0"/>
+            </w:pPr>
+            <w:r/>
+            <w:r>
+              <w:rPr>
+                <w:rFonts w:ascii="Calibri" w:hAnsi="Calibri" w:eastAsia="Microsoft YaHei"/>
+                <w:b w:val="0"/>
+                <w:sz w:val="16"/>
+              </w:rPr>
+              <w:t>5.03984</w:t>
+            </w:r>
+          </w:p>
+        </w:tc>
+      </w:tr>
+      <w:tr>
+        <w:tc>
+          <w:tcPr>
+            <w:tcW w:type="dxa" w:w="1694"/>
+            <w:vAlign w:val="center"/>
+          </w:tcPr>
+          <w:p>
+            <w:pPr>
+              <w:spacing w:after="0"/>
+            </w:pPr>
+            <w:r/>
+            <w:r>
+              <w:rPr>
+                <w:rFonts w:ascii="Calibri" w:hAnsi="Calibri" w:eastAsia="Microsoft YaHei"/>
+                <w:b w:val="0"/>
+                <w:sz w:val="16"/>
+              </w:rPr>
+              <w:t>16.0</w:t>
+            </w:r>
+          </w:p>
+        </w:tc>
+        <w:tc>
+          <w:tcPr>
+            <w:tcW w:type="dxa" w:w="1694"/>
+            <w:vAlign w:val="center"/>
+          </w:tcPr>
+          <w:p>
+            <w:pPr>
+              <w:spacing w:after="0"/>
+            </w:pPr>
+            <w:r/>
+            <w:r>
+              <w:rPr>
+                <w:rFonts w:ascii="Calibri" w:hAnsi="Calibri" w:eastAsia="Microsoft YaHei"/>
+                <w:b w:val="0"/>
+                <w:sz w:val="16"/>
+              </w:rPr>
+              <w:t>0.999965</w:t>
+            </w:r>
+          </w:p>
+        </w:tc>
+        <w:tc>
+          <w:tcPr>
+            <w:tcW w:type="dxa" w:w="1694"/>
+            <w:vAlign w:val="center"/>
+          </w:tcPr>
+          <w:p>
+            <w:pPr>
+              <w:spacing w:after="0"/>
+            </w:pPr>
+            <w:r/>
+            <w:r>
+              <w:rPr>
+                <w:rFonts w:ascii="Calibri" w:hAnsi="Calibri" w:eastAsia="Microsoft YaHei"/>
+                <w:b w:val="0"/>
+                <w:sz w:val="16"/>
+              </w:rPr>
+              <w:t>-4.426965</w:t>
+            </w:r>
+          </w:p>
+        </w:tc>
+        <w:tc>
+          <w:tcPr>
+            <w:tcW w:type="dxa" w:w="1694"/>
+            <w:vAlign w:val="center"/>
+          </w:tcPr>
+          <w:p>
+            <w:pPr>
+              <w:spacing w:after="0"/>
+            </w:pPr>
+            <w:r/>
+            <w:r>
+              <w:rPr>
+                <w:rFonts w:ascii="Calibri" w:hAnsi="Calibri" w:eastAsia="Microsoft YaHei"/>
+                <w:b w:val="0"/>
+                <w:sz w:val="16"/>
+              </w:rPr>
+              <w:t>9.6</w:t>
+            </w:r>
+          </w:p>
+        </w:tc>
+        <w:tc>
+          <w:tcPr>
+            <w:tcW w:type="dxa" w:w="1694"/>
+            <w:vAlign w:val="center"/>
+          </w:tcPr>
+          <w:p>
+            <w:pPr>
+              <w:spacing w:after="0"/>
+            </w:pPr>
+            <w:r/>
+            <w:r>
+              <w:rPr>
+                <w:rFonts w:ascii="Calibri" w:hAnsi="Calibri" w:eastAsia="Microsoft YaHei"/>
+                <w:b w:val="0"/>
+                <w:sz w:val="16"/>
+              </w:rPr>
+              <w:t>1.929214</w:t>
+            </w:r>
+          </w:p>
+        </w:tc>
+        <w:tc>
+          <w:tcPr>
+            <w:tcW w:type="dxa" w:w="1694"/>
+            <w:vAlign w:val="center"/>
+          </w:tcPr>
+          <w:p>
+            <w:pPr>
+              <w:spacing w:after="0"/>
+            </w:pPr>
+            <w:r/>
+            <w:r>
+              <w:rPr>
+                <w:rFonts w:ascii="Calibri" w:hAnsi="Calibri" w:eastAsia="Microsoft YaHei"/>
+                <w:b w:val="0"/>
+                <w:sz w:val="16"/>
+              </w:rPr>
+              <w:t>5.036322</w:t>
+            </w:r>
+          </w:p>
+        </w:tc>
+      </w:tr>
+    </w:tbl>
+    <w:p/>
+    <w:p>
+      <w:pPr>
+        <w:spacing w:after="160"/>
+      </w:pPr>
+      <w:r>
+        <w:rPr>
+          <w:rFonts w:ascii="Calibri" w:hAnsi="Calibri" w:eastAsia="Microsoft YaHei"/>
+          <w:b/>
+          <w:color w:val="1F4D78"/>
+          <w:sz w:val="24"/>
+        </w:rPr>
+        <w:t>图 22 30x30 模态阶数敏感性摘要</w:t>
+      </w:r>
+    </w:p>
+    <w:p>
+      <w:pPr>
+        <w:spacing w:before="40" w:after="160"/>
+        <w:jc w:val="center"/>
+      </w:pPr>
+      <w:r>
+        <w:drawing>
+          <wp:inline xmlns:a="http://schemas.openxmlformats.org/drawingml/2006/main" xmlns:pic="http://schemas.openxmlformats.org/drawingml/2006/picture">
+            <wp:extent cx="6035040" cy="2220895"/>
+            <wp:docPr id="22" name="Picture 22"/>
+            <wp:cNvGraphicFramePr>
+              <a:graphicFrameLocks noChangeAspect="1"/>
+            </wp:cNvGraphicFramePr>
+            <a:graphic>
+              <a:graphicData uri="http://schemas.openxmlformats.org/drawingml/2006/picture">
+                <pic:pic>
+                  <pic:nvPicPr>
+                    <pic:cNvPr id="0" name="28_modal_sensitivity_summary_table.png"/>
+                    <pic:cNvPicPr/>
+                  </pic:nvPicPr>
+                  <pic:blipFill>
+                    <a:blip r:embed="rId30"/>
+                    <a:stretch>
+                      <a:fillRect/>
+                    </a:stretch>
+                  </pic:blipFill>
+                  <pic:spPr>
+                    <a:xfrm>
+                      <a:off x="0" y="0"/>
+                      <a:ext cx="6035040" cy="2220895"/>
+                    </a:xfrm>
+                    <a:prstGeom prst="rect"/>
+                  </pic:spPr>
+                </pic:pic>
+              </a:graphicData>
+            </a:graphic>
+          </wp:inline>
+        </w:drawing>
+      </w:r>
+    </w:p>
+    <w:p>
+      <w:pPr>
+        <w:spacing w:after="160"/>
+      </w:pPr>
+      <w:r>
+        <w:rPr>
+          <w:rFonts w:ascii="Calibri" w:hAnsi="Calibri" w:eastAsia="Microsoft YaHei"/>
+          <w:b/>
+          <w:color w:val="1F4D78"/>
+          <w:sz w:val="24"/>
+        </w:rPr>
+        <w:t>图 23 静态捕获比例收敛</w:t>
+      </w:r>
+    </w:p>
+    <w:p>
+      <w:pPr>
+        <w:spacing w:before="40" w:after="160"/>
+        <w:jc w:val="center"/>
+      </w:pPr>
+      <w:r>
+        <w:drawing>
+          <wp:inline xmlns:a="http://schemas.openxmlformats.org/drawingml/2006/main" xmlns:pic="http://schemas.openxmlformats.org/drawingml/2006/picture">
+            <wp:extent cx="6035040" cy="3394710"/>
+            <wp:docPr id="23" name="Picture 23"/>
+            <wp:cNvGraphicFramePr>
+              <a:graphicFrameLocks noChangeAspect="1"/>
+            </wp:cNvGraphicFramePr>
+            <a:graphic>
+              <a:graphicData uri="http://schemas.openxmlformats.org/drawingml/2006/picture">
+                <pic:pic>
+                  <pic:nvPicPr>
+                    <pic:cNvPr id="0" name="29_capture_ratio_vs_modes.png"/>
+                    <pic:cNvPicPr/>
+                  </pic:nvPicPr>
+                  <pic:blipFill>
+                    <a:blip r:embed="rId31"/>
+                    <a:stretch>
+                      <a:fillRect/>
+                    </a:stretch>
+                  </pic:blipFill>
+                  <pic:spPr>
+                    <a:xfrm>
+                      <a:off x="0" y="0"/>
+                      <a:ext cx="6035040" cy="3394710"/>
+                    </a:xfrm>
+                    <a:prstGeom prst="rect"/>
+                  </pic:spPr>
+                </pic:pic>
+              </a:graphicData>
+            </a:graphic>
+          </wp:inline>
+        </w:drawing>
+      </w:r>
+    </w:p>
+    <w:p>
+      <w:pPr>
+        <w:spacing w:after="160"/>
+      </w:pPr>
+      <w:r>
+        <w:rPr>
+          <w:rFonts w:ascii="Calibri" w:hAnsi="Calibri" w:eastAsia="Microsoft YaHei"/>
+          <w:b/>
+          <w:color w:val="1F4D78"/>
+          <w:sz w:val="24"/>
+        </w:rPr>
+        <w:t>图 24 动力峰值随模态阶数变化</w:t>
+      </w:r>
+    </w:p>
+    <w:p>
+      <w:pPr>
+        <w:spacing w:before="40" w:after="160"/>
+        <w:jc w:val="center"/>
+      </w:pPr>
+      <w:r>
+        <w:drawing>
+          <wp:inline xmlns:a="http://schemas.openxmlformats.org/drawingml/2006/main" xmlns:pic="http://schemas.openxmlformats.org/drawingml/2006/picture">
+            <wp:extent cx="6035040" cy="3394710"/>
+            <wp:docPr id="24" name="Picture 24"/>
+            <wp:cNvGraphicFramePr>
+              <a:graphicFrameLocks noChangeAspect="1"/>
+            </wp:cNvGraphicFramePr>
+            <a:graphic>
+              <a:graphicData uri="http://schemas.openxmlformats.org/drawingml/2006/picture">
+                <pic:pic>
+                  <pic:nvPicPr>
+                    <pic:cNvPr id="0" name="30_peak_vs_modes.png"/>
+                    <pic:cNvPicPr/>
+                  </pic:nvPicPr>
+                  <pic:blipFill>
+                    <a:blip r:embed="rId32"/>
+                    <a:stretch>
+                      <a:fillRect/>
+                    </a:stretch>
+                  </pic:blipFill>
+                  <pic:spPr>
+                    <a:xfrm>
+                      <a:off x="0" y="0"/>
+                      <a:ext cx="6035040" cy="3394710"/>
+                    </a:xfrm>
+                    <a:prstGeom prst="rect"/>
+                  </pic:spPr>
+                </pic:pic>
+              </a:graphicData>
+            </a:graphic>
+          </wp:inline>
+        </w:drawing>
+      </w:r>
+    </w:p>
+    <w:p>
+      <w:pPr>
+        <w:spacing w:after="160"/>
+      </w:pPr>
+      <w:r>
+        <w:rPr>
+          <w:rFonts w:ascii="Calibri" w:hAnsi="Calibri" w:eastAsia="Microsoft YaHei"/>
+          <w:b/>
+          <w:color w:val="1F4D78"/>
+          <w:sz w:val="24"/>
+        </w:rPr>
+        <w:t>图 25 不同阶数中心挠度时程</w:t>
+      </w:r>
+    </w:p>
+    <w:p>
+      <w:pPr>
+        <w:spacing w:before="40" w:after="160"/>
+        <w:jc w:val="center"/>
+      </w:pPr>
+      <w:r>
+        <w:drawing>
+          <wp:inline xmlns:a="http://schemas.openxmlformats.org/drawingml/2006/main" xmlns:pic="http://schemas.openxmlformats.org/drawingml/2006/picture">
+            <wp:extent cx="6035040" cy="3394710"/>
+            <wp:docPr id="25" name="Picture 25"/>
+            <wp:cNvGraphicFramePr>
+              <a:graphicFrameLocks noChangeAspect="1"/>
+            </wp:cNvGraphicFramePr>
+            <a:graphic>
+              <a:graphicData uri="http://schemas.openxmlformats.org/drawingml/2006/picture">
+                <pic:pic>
+                  <pic:nvPicPr>
+                    <pic:cNvPr id="0" name="31_center_timeseries_by_modes.png"/>
+                    <pic:cNvPicPr/>
+                  </pic:nvPicPr>
+                  <pic:blipFill>
+                    <a:blip r:embed="rId33"/>
+                    <a:stretch>
+                      <a:fillRect/>
+                    </a:stretch>
+                  </pic:blipFill>
+                  <pic:spPr>
+                    <a:xfrm>
+                      <a:off x="0" y="0"/>
+                      <a:ext cx="6035040" cy="3394710"/>
+                    </a:xfrm>
+                    <a:prstGeom prst="rect"/>
+                  </pic:spPr>
+                </pic:pic>
+              </a:graphicData>
+            </a:graphic>
+          </wp:inline>
+        </w:drawing>
+      </w:r>
+    </w:p>
+    <w:p>
+      <w:pPr>
+        <w:spacing w:after="160"/>
+      </w:pPr>
+      <w:r>
+        <w:rPr>
+          <w:rFonts w:ascii="Calibri" w:hAnsi="Calibri" w:eastAsia="Microsoft YaHei"/>
+          <w:b/>
+          <w:color w:val="1F4D78"/>
+          <w:sz w:val="24"/>
+        </w:rPr>
+        <w:t>图 26 模态阶数收敛性判断</w:t>
+      </w:r>
+    </w:p>
+    <w:p>
+      <w:pPr>
+        <w:spacing w:before="40" w:after="160"/>
+        <w:jc w:val="center"/>
+      </w:pPr>
+      <w:r>
+        <w:drawing>
+          <wp:inline xmlns:a="http://schemas.openxmlformats.org/drawingml/2006/main" xmlns:pic="http://schemas.openxmlformats.org/drawingml/2006/picture">
+            <wp:extent cx="6035040" cy="2325502"/>
+            <wp:docPr id="26" name="Picture 26"/>
+            <wp:cNvGraphicFramePr>
+              <a:graphicFrameLocks noChangeAspect="1"/>
+            </wp:cNvGraphicFramePr>
+            <a:graphic>
+              <a:graphicData uri="http://schemas.openxmlformats.org/drawingml/2006/picture">
+                <pic:pic>
+                  <pic:nvPicPr>
+                    <pic:cNvPr id="0" name="35_convergence_assessment_table.png"/>
+                    <pic:cNvPicPr/>
+                  </pic:nvPicPr>
+                  <pic:blipFill>
+                    <a:blip r:embed="rId34"/>
+                    <a:stretch>
+                      <a:fillRect/>
+                    </a:stretch>
+                  </pic:blipFill>
+                  <pic:spPr>
+                    <a:xfrm>
+                      <a:off x="0" y="0"/>
+                      <a:ext cx="6035040" cy="2325502"/>
+                    </a:xfrm>
+                    <a:prstGeom prst="rect"/>
+                  </pic:spPr>
+                </pic:pic>
+              </a:graphicData>
+            </a:graphic>
+          </wp:inline>
+        </w:drawing>
+      </w:r>
+    </w:p>
+    <w:p>
+      <w:pPr>
+        <w:spacing w:before="160" w:after="160"/>
+      </w:pPr>
+      <w:r>
+        <w:rPr>
+          <w:rFonts w:ascii="Calibri" w:hAnsi="Calibri" w:eastAsia="Microsoft YaHei"/>
+          <w:b/>
+          <w:color w:val="2E74B5"/>
+          <w:sz w:val="32"/>
+        </w:rPr>
+        <w:t>10. 阻尼敏感性</w:t>
+      </w:r>
+    </w:p>
+    <w:tbl>
+      <w:tblPr>
+        <w:tblStyle w:val="TableGrid"/>
+        <w:tblW w:type="auto" w:w="0"/>
+        <w:jc w:val="center"/>
+        <w:tblLook w:firstColumn="1" w:firstRow="1" w:lastColumn="0" w:lastRow="0" w:noHBand="0" w:noVBand="1" w:val="04A0"/>
+      </w:tblPr>
+      <w:tblGrid>
+        <w:gridCol w:w="1694"/>
+        <w:gridCol w:w="1694"/>
+        <w:gridCol w:w="1694"/>
+        <w:gridCol w:w="1694"/>
+        <w:gridCol w:w="1694"/>
+        <w:gridCol w:w="1694"/>
+      </w:tblGrid>
+      <w:tr>
+        <w:tc>
+          <w:tcPr>
+            <w:tcW w:type="dxa" w:w="1694"/>
+            <w:vAlign w:val="center"/>
+            <w:shd w:fill="F2F4F7"/>
+          </w:tcPr>
+          <w:p>
+            <w:pPr>
+              <w:spacing w:after="0"/>
+            </w:pPr>
+            <w:r/>
+            <w:r>
+              <w:rPr>
+                <w:rFonts w:ascii="Calibri" w:hAnsi="Calibri" w:eastAsia="Microsoft YaHei"/>
+                <w:b/>
+                <w:sz w:val="16"/>
+              </w:rPr>
+              <w:t>阻尼比</w:t>
+            </w:r>
+          </w:p>
+        </w:tc>
+        <w:tc>
+          <w:tcPr>
+            <w:tcW w:type="dxa" w:w="1694"/>
+            <w:vAlign w:val="center"/>
+            <w:shd w:fill="F2F4F7"/>
+          </w:tcPr>
+          <w:p>
+            <w:pPr>
+              <w:spacing w:after="0"/>
+            </w:pPr>
+            <w:r/>
+            <w:r>
+              <w:rPr>
+                <w:rFonts w:ascii="Calibri" w:hAnsi="Calibri" w:eastAsia="Microsoft YaHei"/>
+                <w:b/>
+                <w:sz w:val="16"/>
+              </w:rPr>
+              <w:t>峰值 mm</w:t>
+            </w:r>
+          </w:p>
+        </w:tc>
+        <w:tc>
+          <w:tcPr>
+            <w:tcW w:type="dxa" w:w="1694"/>
+            <w:vAlign w:val="center"/>
+            <w:shd w:fill="F2F4F7"/>
+          </w:tcPr>
+          <w:p>
+            <w:pPr>
+              <w:spacing w:after="0"/>
+            </w:pPr>
+            <w:r/>
+            <w:r>
+              <w:rPr>
+                <w:rFonts w:ascii="Calibri" w:hAnsi="Calibri" w:eastAsia="Microsoft YaHei"/>
+                <w:b/>
+                <w:sz w:val="16"/>
+              </w:rPr>
+              <w:t>峰值时间 ms</w:t>
+            </w:r>
+          </w:p>
+        </w:tc>
+        <w:tc>
+          <w:tcPr>
+            <w:tcW w:type="dxa" w:w="1694"/>
+            <w:vAlign w:val="center"/>
+            <w:shd w:fill="F2F4F7"/>
+          </w:tcPr>
+          <w:p>
+            <w:pPr>
+              <w:spacing w:after="0"/>
+            </w:pPr>
+            <w:r/>
+            <w:r>
+              <w:rPr>
+                <w:rFonts w:ascii="Calibri" w:hAnsi="Calibri" w:eastAsia="Microsoft YaHei"/>
+                <w:b/>
+                <w:sz w:val="16"/>
+              </w:rPr>
+              <w:t>超调</w:t>
+            </w:r>
+          </w:p>
+        </w:tc>
+        <w:tc>
+          <w:tcPr>
+            <w:tcW w:type="dxa" w:w="1694"/>
+            <w:vAlign w:val="center"/>
+            <w:shd w:fill="F2F4F7"/>
+          </w:tcPr>
+          <w:p>
+            <w:pPr>
+              <w:spacing w:after="0"/>
+            </w:pPr>
+            <w:r/>
+            <w:r>
+              <w:rPr>
+                <w:rFonts w:ascii="Calibri" w:hAnsi="Calibri" w:eastAsia="Microsoft YaHei"/>
+                <w:b/>
+                <w:sz w:val="16"/>
+              </w:rPr>
+              <w:t>40 ms 位移 mm</w:t>
+            </w:r>
+          </w:p>
+        </w:tc>
+        <w:tc>
+          <w:tcPr>
+            <w:tcW w:type="dxa" w:w="1694"/>
+            <w:vAlign w:val="center"/>
+            <w:shd w:fill="F2F4F7"/>
+          </w:tcPr>
+          <w:p>
+            <w:pPr>
+              <w:spacing w:after="0"/>
+            </w:pPr>
+            <w:r/>
+            <w:r>
+              <w:rPr>
+                <w:rFonts w:ascii="Calibri" w:hAnsi="Calibri" w:eastAsia="Microsoft YaHei"/>
+                <w:b/>
+                <w:sz w:val="16"/>
+              </w:rPr>
+              <w:t>最大 θ 跨度 K</w:t>
+            </w:r>
+          </w:p>
+        </w:tc>
+      </w:tr>
+      <w:tr>
+        <w:tc>
+          <w:tcPr>
+            <w:tcW w:type="dxa" w:w="1694"/>
+            <w:vAlign w:val="center"/>
+          </w:tcPr>
+          <w:p>
+            <w:pPr>
+              <w:spacing w:after="0"/>
+            </w:pPr>
+            <w:r/>
+            <w:r>
+              <w:rPr>
+                <w:rFonts w:ascii="Calibri" w:hAnsi="Calibri" w:eastAsia="Microsoft YaHei"/>
+                <w:b w:val="0"/>
+                <w:sz w:val="16"/>
+              </w:rPr>
+              <w:t>0.0%</w:t>
+            </w:r>
+          </w:p>
+        </w:tc>
+        <w:tc>
+          <w:tcPr>
+            <w:tcW w:type="dxa" w:w="1694"/>
+            <w:vAlign w:val="center"/>
+          </w:tcPr>
+          <w:p>
+            <w:pPr>
+              <w:spacing w:after="0"/>
+            </w:pPr>
+            <w:r/>
+            <w:r>
+              <w:rPr>
+                <w:rFonts w:ascii="Calibri" w:hAnsi="Calibri" w:eastAsia="Microsoft YaHei"/>
+                <w:b w:val="0"/>
+                <w:sz w:val="16"/>
+              </w:rPr>
+              <w:t>-4.503943</w:t>
+            </w:r>
+          </w:p>
+        </w:tc>
+        <w:tc>
+          <w:tcPr>
+            <w:tcW w:type="dxa" w:w="1694"/>
+            <w:vAlign w:val="center"/>
+          </w:tcPr>
+          <w:p>
+            <w:pPr>
+              <w:spacing w:after="0"/>
+            </w:pPr>
+            <w:r/>
+            <w:r>
+              <w:rPr>
+                <w:rFonts w:ascii="Calibri" w:hAnsi="Calibri" w:eastAsia="Microsoft YaHei"/>
+                <w:b w:val="0"/>
+                <w:sz w:val="16"/>
+              </w:rPr>
+              <w:t>28.9</w:t>
+            </w:r>
+          </w:p>
+        </w:tc>
+        <w:tc>
+          <w:tcPr>
+            <w:tcW w:type="dxa" w:w="1694"/>
+            <w:vAlign w:val="center"/>
+          </w:tcPr>
+          <w:p>
+            <w:pPr>
+              <w:spacing w:after="0"/>
+            </w:pPr>
+            <w:r/>
+            <w:r>
+              <w:rPr>
+                <w:rFonts w:ascii="Calibri" w:hAnsi="Calibri" w:eastAsia="Microsoft YaHei"/>
+                <w:b w:val="0"/>
+                <w:sz w:val="16"/>
+              </w:rPr>
+              <w:t>1.96276</w:t>
+            </w:r>
+          </w:p>
+        </w:tc>
+        <w:tc>
+          <w:tcPr>
+            <w:tcW w:type="dxa" w:w="1694"/>
+            <w:vAlign w:val="center"/>
+          </w:tcPr>
+          <w:p>
+            <w:pPr>
+              <w:spacing w:after="0"/>
+            </w:pPr>
+            <w:r/>
+            <w:r>
+              <w:rPr>
+                <w:rFonts w:ascii="Calibri" w:hAnsi="Calibri" w:eastAsia="Microsoft YaHei"/>
+                <w:b w:val="0"/>
+                <w:sz w:val="16"/>
+              </w:rPr>
+              <w:t>-0.412865</w:t>
+            </w:r>
+          </w:p>
+        </w:tc>
+        <w:tc>
+          <w:tcPr>
+            <w:tcW w:type="dxa" w:w="1694"/>
+            <w:vAlign w:val="center"/>
+          </w:tcPr>
+          <w:p>
+            <w:pPr>
+              <w:spacing w:after="0"/>
+            </w:pPr>
+            <w:r/>
+            <w:r>
+              <w:rPr>
+                <w:rFonts w:ascii="Calibri" w:hAnsi="Calibri" w:eastAsia="Microsoft YaHei"/>
+                <w:b w:val="0"/>
+                <w:sz w:val="16"/>
+              </w:rPr>
+              <w:t>5.113388</w:t>
+            </w:r>
+          </w:p>
+        </w:tc>
+      </w:tr>
+      <w:tr>
+        <w:tc>
+          <w:tcPr>
+            <w:tcW w:type="dxa" w:w="1694"/>
+            <w:vAlign w:val="center"/>
+          </w:tcPr>
+          <w:p>
+            <w:pPr>
+              <w:spacing w:after="0"/>
+            </w:pPr>
+            <w:r/>
+            <w:r>
+              <w:rPr>
+                <w:rFonts w:ascii="Calibri" w:hAnsi="Calibri" w:eastAsia="Microsoft YaHei"/>
+                <w:b w:val="0"/>
+                <w:sz w:val="16"/>
+              </w:rPr>
+              <w:t>0.5%</w:t>
+            </w:r>
+          </w:p>
+        </w:tc>
+        <w:tc>
+          <w:tcPr>
+            <w:tcW w:type="dxa" w:w="1694"/>
+            <w:vAlign w:val="center"/>
+          </w:tcPr>
+          <w:p>
+            <w:pPr>
+              <w:spacing w:after="0"/>
+            </w:pPr>
+            <w:r/>
+            <w:r>
+              <w:rPr>
+                <w:rFonts w:ascii="Calibri" w:hAnsi="Calibri" w:eastAsia="Microsoft YaHei"/>
+                <w:b w:val="0"/>
+                <w:sz w:val="16"/>
+              </w:rPr>
+              <w:t>-4.444669</w:t>
+            </w:r>
+          </w:p>
+        </w:tc>
+        <w:tc>
+          <w:tcPr>
+            <w:tcW w:type="dxa" w:w="1694"/>
+            <w:vAlign w:val="center"/>
+          </w:tcPr>
+          <w:p>
+            <w:pPr>
+              <w:spacing w:after="0"/>
+            </w:pPr>
+            <w:r/>
+            <w:r>
+              <w:rPr>
+                <w:rFonts w:ascii="Calibri" w:hAnsi="Calibri" w:eastAsia="Microsoft YaHei"/>
+                <w:b w:val="0"/>
+                <w:sz w:val="16"/>
+              </w:rPr>
+              <w:t>9.6</w:t>
+            </w:r>
+          </w:p>
+        </w:tc>
+        <w:tc>
+          <w:tcPr>
+            <w:tcW w:type="dxa" w:w="1694"/>
+            <w:vAlign w:val="center"/>
+          </w:tcPr>
+          <w:p>
+            <w:pPr>
+              <w:spacing w:after="0"/>
+            </w:pPr>
+            <w:r/>
+            <w:r>
+              <w:rPr>
+                <w:rFonts w:ascii="Calibri" w:hAnsi="Calibri" w:eastAsia="Microsoft YaHei"/>
+                <w:b w:val="0"/>
+                <w:sz w:val="16"/>
+              </w:rPr>
+              <w:t>1.93693</w:t>
+            </w:r>
+          </w:p>
+        </w:tc>
+        <w:tc>
+          <w:tcPr>
+            <w:tcW w:type="dxa" w:w="1694"/>
+            <w:vAlign w:val="center"/>
+          </w:tcPr>
+          <w:p>
+            <w:pPr>
+              <w:spacing w:after="0"/>
+            </w:pPr>
+            <w:r/>
+            <w:r>
+              <w:rPr>
+                <w:rFonts w:ascii="Calibri" w:hAnsi="Calibri" w:eastAsia="Microsoft YaHei"/>
+                <w:b w:val="0"/>
+                <w:sz w:val="16"/>
+              </w:rPr>
+              <w:t>-0.520488</w:t>
+            </w:r>
+          </w:p>
+        </w:tc>
+        <w:tc>
+          <w:tcPr>
+            <w:tcW w:type="dxa" w:w="1694"/>
+            <w:vAlign w:val="center"/>
+          </w:tcPr>
+          <w:p>
+            <w:pPr>
+              <w:spacing w:after="0"/>
+            </w:pPr>
+            <w:r/>
+            <w:r>
+              <w:rPr>
+                <w:rFonts w:ascii="Calibri" w:hAnsi="Calibri" w:eastAsia="Microsoft YaHei"/>
+                <w:b w:val="0"/>
+                <w:sz w:val="16"/>
+              </w:rPr>
+              <w:t>5.064735</w:t>
+            </w:r>
+          </w:p>
+        </w:tc>
+      </w:tr>
+      <w:tr>
+        <w:tc>
+          <w:tcPr>
+            <w:tcW w:type="dxa" w:w="1694"/>
+            <w:vAlign w:val="center"/>
+          </w:tcPr>
+          <w:p>
+            <w:pPr>
+              <w:spacing w:after="0"/>
+            </w:pPr>
+            <w:r/>
+            <w:r>
+              <w:rPr>
+                <w:rFonts w:ascii="Calibri" w:hAnsi="Calibri" w:eastAsia="Microsoft YaHei"/>
+                <w:b w:val="0"/>
+                <w:sz w:val="16"/>
+              </w:rPr>
+              <w:t>0.8%</w:t>
+            </w:r>
+          </w:p>
+        </w:tc>
+        <w:tc>
+          <w:tcPr>
+            <w:tcW w:type="dxa" w:w="1694"/>
+            <w:vAlign w:val="center"/>
+          </w:tcPr>
+          <w:p>
+            <w:pPr>
+              <w:spacing w:after="0"/>
+            </w:pPr>
+            <w:r/>
+            <w:r>
+              <w:rPr>
+                <w:rFonts w:ascii="Calibri" w:hAnsi="Calibri" w:eastAsia="Microsoft YaHei"/>
+                <w:b w:val="0"/>
+                <w:sz w:val="16"/>
+              </w:rPr>
+              <w:t>-4.426965</w:t>
+            </w:r>
+          </w:p>
+        </w:tc>
+        <w:tc>
+          <w:tcPr>
+            <w:tcW w:type="dxa" w:w="1694"/>
+            <w:vAlign w:val="center"/>
+          </w:tcPr>
+          <w:p>
+            <w:pPr>
+              <w:spacing w:after="0"/>
+            </w:pPr>
+            <w:r/>
+            <w:r>
+              <w:rPr>
+                <w:rFonts w:ascii="Calibri" w:hAnsi="Calibri" w:eastAsia="Microsoft YaHei"/>
+                <w:b w:val="0"/>
+                <w:sz w:val="16"/>
+              </w:rPr>
+              <w:t>9.6</w:t>
+            </w:r>
+          </w:p>
+        </w:tc>
+        <w:tc>
+          <w:tcPr>
+            <w:tcW w:type="dxa" w:w="1694"/>
+            <w:vAlign w:val="center"/>
+          </w:tcPr>
+          <w:p>
+            <w:pPr>
+              <w:spacing w:after="0"/>
+            </w:pPr>
+            <w:r/>
+            <w:r>
+              <w:rPr>
+                <w:rFonts w:ascii="Calibri" w:hAnsi="Calibri" w:eastAsia="Microsoft YaHei"/>
+                <w:b w:val="0"/>
+                <w:sz w:val="16"/>
+              </w:rPr>
+              <w:t>1.929214</w:t>
+            </w:r>
+          </w:p>
+        </w:tc>
+        <w:tc>
+          <w:tcPr>
+            <w:tcW w:type="dxa" w:w="1694"/>
+            <w:vAlign w:val="center"/>
+          </w:tcPr>
+          <w:p>
+            <w:pPr>
+              <w:spacing w:after="0"/>
+            </w:pPr>
+            <w:r/>
+            <w:r>
+              <w:rPr>
+                <w:rFonts w:ascii="Calibri" w:hAnsi="Calibri" w:eastAsia="Microsoft YaHei"/>
+                <w:b w:val="0"/>
+                <w:sz w:val="16"/>
+              </w:rPr>
+              <w:t>-0.582984</w:t>
+            </w:r>
+          </w:p>
+        </w:tc>
+        <w:tc>
+          <w:tcPr>
+            <w:tcW w:type="dxa" w:w="1694"/>
+            <w:vAlign w:val="center"/>
+          </w:tcPr>
+          <w:p>
+            <w:pPr>
+              <w:spacing w:after="0"/>
+            </w:pPr>
+            <w:r/>
+            <w:r>
+              <w:rPr>
+                <w:rFonts w:ascii="Calibri" w:hAnsi="Calibri" w:eastAsia="Microsoft YaHei"/>
+                <w:b w:val="0"/>
+                <w:sz w:val="16"/>
+              </w:rPr>
+              <w:t>5.036322</w:t>
+            </w:r>
+          </w:p>
+        </w:tc>
+      </w:tr>
+      <w:tr>
+        <w:tc>
+          <w:tcPr>
+            <w:tcW w:type="dxa" w:w="1694"/>
+            <w:vAlign w:val="center"/>
+          </w:tcPr>
+          <w:p>
+            <w:pPr>
+              <w:spacing w:after="0"/>
+            </w:pPr>
+            <w:r/>
+            <w:r>
+              <w:rPr>
+                <w:rFonts w:ascii="Calibri" w:hAnsi="Calibri" w:eastAsia="Microsoft YaHei"/>
+                <w:b w:val="0"/>
+                <w:sz w:val="16"/>
+              </w:rPr>
+              <w:t>1.5%</w:t>
+            </w:r>
+          </w:p>
+        </w:tc>
+        <w:tc>
+          <w:tcPr>
+            <w:tcW w:type="dxa" w:w="1694"/>
+            <w:vAlign w:val="center"/>
+          </w:tcPr>
+          <w:p>
+            <w:pPr>
+              <w:spacing w:after="0"/>
+            </w:pPr>
+            <w:r/>
+            <w:r>
+              <w:rPr>
+                <w:rFonts w:ascii="Calibri" w:hAnsi="Calibri" w:eastAsia="Microsoft YaHei"/>
+                <w:b w:val="0"/>
+                <w:sz w:val="16"/>
+              </w:rPr>
+              <w:t>-4.38578</w:t>
+            </w:r>
+          </w:p>
+        </w:tc>
+        <w:tc>
+          <w:tcPr>
+            <w:tcW w:type="dxa" w:w="1694"/>
+            <w:vAlign w:val="center"/>
+          </w:tcPr>
+          <w:p>
+            <w:pPr>
+              <w:spacing w:after="0"/>
+            </w:pPr>
+            <w:r/>
+            <w:r>
+              <w:rPr>
+                <w:rFonts w:ascii="Calibri" w:hAnsi="Calibri" w:eastAsia="Microsoft YaHei"/>
+                <w:b w:val="0"/>
+                <w:sz w:val="16"/>
+              </w:rPr>
+              <w:t>9.6</w:t>
+            </w:r>
+          </w:p>
+        </w:tc>
+        <w:tc>
+          <w:tcPr>
+            <w:tcW w:type="dxa" w:w="1694"/>
+            <w:vAlign w:val="center"/>
+          </w:tcPr>
+          <w:p>
+            <w:pPr>
+              <w:spacing w:after="0"/>
+            </w:pPr>
+            <w:r/>
+            <w:r>
+              <w:rPr>
+                <w:rFonts w:ascii="Calibri" w:hAnsi="Calibri" w:eastAsia="Microsoft YaHei"/>
+                <w:b w:val="0"/>
+                <w:sz w:val="16"/>
+              </w:rPr>
+              <w:t>1.911267</w:t>
+            </w:r>
+          </w:p>
+        </w:tc>
+        <w:tc>
+          <w:tcPr>
+            <w:tcW w:type="dxa" w:w="1694"/>
+            <w:vAlign w:val="center"/>
+          </w:tcPr>
+          <w:p>
+            <w:pPr>
+              <w:spacing w:after="0"/>
+            </w:pPr>
+            <w:r/>
+            <w:r>
+              <w:rPr>
+                <w:rFonts w:ascii="Calibri" w:hAnsi="Calibri" w:eastAsia="Microsoft YaHei"/>
+                <w:b w:val="0"/>
+                <w:sz w:val="16"/>
+              </w:rPr>
+              <w:t>-0.721649</w:t>
+            </w:r>
+          </w:p>
+        </w:tc>
+        <w:tc>
+          <w:tcPr>
+            <w:tcW w:type="dxa" w:w="1694"/>
+            <w:vAlign w:val="center"/>
+          </w:tcPr>
+          <w:p>
+            <w:pPr>
+              <w:spacing w:after="0"/>
+            </w:pPr>
+            <w:r/>
+            <w:r>
+              <w:rPr>
+                <w:rFonts w:ascii="Calibri" w:hAnsi="Calibri" w:eastAsia="Microsoft YaHei"/>
+                <w:b w:val="0"/>
+                <w:sz w:val="16"/>
+              </w:rPr>
+              <w:t>4.972045</w:t>
+            </w:r>
+          </w:p>
+        </w:tc>
+      </w:tr>
+    </w:tbl>
+    <w:p/>
+    <w:p>
+      <w:pPr>
+        <w:spacing w:after="160"/>
+      </w:pPr>
+      <w:r>
+        <w:rPr>
+          <w:rFonts w:ascii="Calibri" w:hAnsi="Calibri" w:eastAsia="Microsoft YaHei"/>
+          <w:b/>
+          <w:color w:val="1F4D78"/>
+          <w:sz w:val="24"/>
+        </w:rPr>
+        <w:t>图 27 30x30 模态阻尼敏感性摘要</w:t>
+      </w:r>
+    </w:p>
+    <w:p>
+      <w:pPr>
+        <w:spacing w:before="40" w:after="160"/>
+        <w:jc w:val="center"/>
+      </w:pPr>
+      <w:r>
+        <w:drawing>
+          <wp:inline xmlns:a="http://schemas.openxmlformats.org/drawingml/2006/main" xmlns:pic="http://schemas.openxmlformats.org/drawingml/2006/picture">
+            <wp:extent cx="6035040" cy="2003633"/>
+            <wp:docPr id="27" name="Picture 27"/>
+            <wp:cNvGraphicFramePr>
+              <a:graphicFrameLocks noChangeAspect="1"/>
+            </wp:cNvGraphicFramePr>
+            <a:graphic>
+              <a:graphicData uri="http://schemas.openxmlformats.org/drawingml/2006/picture">
+                <pic:pic>
+                  <pic:nvPicPr>
+                    <pic:cNvPr id="0" name="36_damping_summary_table.png"/>
+                    <pic:cNvPicPr/>
+                  </pic:nvPicPr>
+                  <pic:blipFill>
+                    <a:blip r:embed="rId35"/>
+                    <a:stretch>
+                      <a:fillRect/>
+                    </a:stretch>
+                  </pic:blipFill>
+                  <pic:spPr>
+                    <a:xfrm>
+                      <a:off x="0" y="0"/>
+                      <a:ext cx="6035040" cy="2003633"/>
+                    </a:xfrm>
+                    <a:prstGeom prst="rect"/>
+                  </pic:spPr>
+                </pic:pic>
+              </a:graphicData>
+            </a:graphic>
+          </wp:inline>
+        </w:drawing>
+      </w:r>
+    </w:p>
+    <w:p>
+      <w:pPr>
+        <w:spacing w:after="160"/>
+      </w:pPr>
+      <w:r>
+        <w:rPr>
+          <w:rFonts w:ascii="Calibri" w:hAnsi="Calibri" w:eastAsia="Microsoft YaHei"/>
+          <w:b/>
+          <w:color w:val="1F4D78"/>
+          <w:sz w:val="24"/>
+        </w:rPr>
+        <w:t>图 28 动力峰值随阻尼比变化</w:t>
+      </w:r>
+    </w:p>
+    <w:p>
+      <w:pPr>
+        <w:spacing w:before="40" w:after="160"/>
+        <w:jc w:val="center"/>
+      </w:pPr>
+      <w:r>
+        <w:drawing>
+          <wp:inline xmlns:a="http://schemas.openxmlformats.org/drawingml/2006/main" xmlns:pic="http://schemas.openxmlformats.org/drawingml/2006/picture">
+            <wp:extent cx="6035040" cy="3394710"/>
+            <wp:docPr id="28" name="Picture 28"/>
+            <wp:cNvGraphicFramePr>
+              <a:graphicFrameLocks noChangeAspect="1"/>
+            </wp:cNvGraphicFramePr>
+            <a:graphic>
+              <a:graphicData uri="http://schemas.openxmlformats.org/drawingml/2006/picture">
+                <pic:pic>
+                  <pic:nvPicPr>
+                    <pic:cNvPr id="0" name="37_peak_vs_damping.png"/>
+                    <pic:cNvPicPr/>
+                  </pic:nvPicPr>
+                  <pic:blipFill>
+                    <a:blip r:embed="rId36"/>
+                    <a:stretch>
+                      <a:fillRect/>
+                    </a:stretch>
+                  </pic:blipFill>
+                  <pic:spPr>
+                    <a:xfrm>
+                      <a:off x="0" y="0"/>
+                      <a:ext cx="6035040" cy="3394710"/>
+                    </a:xfrm>
+                    <a:prstGeom prst="rect"/>
+                  </pic:spPr>
+                </pic:pic>
+              </a:graphicData>
+            </a:graphic>
+          </wp:inline>
+        </w:drawing>
+      </w:r>
+    </w:p>
+    <w:p>
+      <w:pPr>
+        <w:spacing w:after="160"/>
+      </w:pPr>
+      <w:r>
+        <w:rPr>
+          <w:rFonts w:ascii="Calibri" w:hAnsi="Calibri" w:eastAsia="Microsoft YaHei"/>
+          <w:b/>
+          <w:color w:val="1F4D78"/>
+          <w:sz w:val="24"/>
+        </w:rPr>
+        <w:t>图 29 不同阻尼比中心挠度时程</w:t>
+      </w:r>
+    </w:p>
+    <w:p>
+      <w:pPr>
+        <w:spacing w:before="40" w:after="160"/>
+        <w:jc w:val="center"/>
+      </w:pPr>
+      <w:r>
+        <w:drawing>
+          <wp:inline xmlns:a="http://schemas.openxmlformats.org/drawingml/2006/main" xmlns:pic="http://schemas.openxmlformats.org/drawingml/2006/picture">
+            <wp:extent cx="6035040" cy="3394710"/>
+            <wp:docPr id="29" name="Picture 29"/>
+            <wp:cNvGraphicFramePr>
+              <a:graphicFrameLocks noChangeAspect="1"/>
+            </wp:cNvGraphicFramePr>
+            <a:graphic>
+              <a:graphicData uri="http://schemas.openxmlformats.org/drawingml/2006/picture">
+                <pic:pic>
+                  <pic:nvPicPr>
+                    <pic:cNvPr id="0" name="39_center_timeseries_by_damping.png"/>
+                    <pic:cNvPicPr/>
+                  </pic:nvPicPr>
+                  <pic:blipFill>
+                    <a:blip r:embed="rId37"/>
+                    <a:stretch>
+                      <a:fillRect/>
+                    </a:stretch>
+                  </pic:blipFill>
+                  <pic:spPr>
+                    <a:xfrm>
+                      <a:off x="0" y="0"/>
+                      <a:ext cx="6035040" cy="3394710"/>
+                    </a:xfrm>
+                    <a:prstGeom prst="rect"/>
+                  </pic:spPr>
+                </pic:pic>
+              </a:graphicData>
+            </a:graphic>
+          </wp:inline>
+        </w:drawing>
+      </w:r>
+    </w:p>
+    <w:p>
+      <w:pPr>
+        <w:spacing w:after="160"/>
+      </w:pPr>
+      <w:r>
+        <w:rPr>
+          <w:rFonts w:ascii="Calibri" w:hAnsi="Calibri" w:eastAsia="Microsoft YaHei"/>
+          <w:b/>
+          <w:color w:val="1F4D78"/>
+          <w:sz w:val="24"/>
+        </w:rPr>
+        <w:t>图 30 阻尼敏感性判断</w:t>
+      </w:r>
+    </w:p>
+    <w:p>
+      <w:pPr>
+        <w:spacing w:before="40" w:after="160"/>
+        <w:jc w:val="center"/>
+      </w:pPr>
+      <w:r>
+        <w:drawing>
+          <wp:inline xmlns:a="http://schemas.openxmlformats.org/drawingml/2006/main" xmlns:pic="http://schemas.openxmlformats.org/drawingml/2006/picture">
+            <wp:extent cx="6035040" cy="2003633"/>
+            <wp:docPr id="30" name="Picture 30"/>
+            <wp:cNvGraphicFramePr>
+              <a:graphicFrameLocks noChangeAspect="1"/>
+            </wp:cNvGraphicFramePr>
+            <a:graphic>
+              <a:graphicData uri="http://schemas.openxmlformats.org/drawingml/2006/picture">
+                <pic:pic>
+                  <pic:nvPicPr>
+                    <pic:cNvPr id="0" name="41_damping_assessment_table.png"/>
+                    <pic:cNvPicPr/>
+                  </pic:nvPicPr>
+                  <pic:blipFill>
+                    <a:blip r:embed="rId38"/>
+                    <a:stretch>
+                      <a:fillRect/>
+                    </a:stretch>
+                  </pic:blipFill>
+                  <pic:spPr>
+                    <a:xfrm>
+                      <a:off x="0" y="0"/>
+                      <a:ext cx="6035040" cy="2003633"/>
+                    </a:xfrm>
+                    <a:prstGeom prst="rect"/>
+                  </pic:spPr>
+                </pic:pic>
+              </a:graphicData>
+            </a:graphic>
+          </wp:inline>
+        </w:drawing>
+      </w:r>
+    </w:p>
+    <w:p>
+      <w:pPr>
+        <w:spacing w:before="160" w:after="160"/>
+      </w:pPr>
+      <w:r>
+        <w:rPr>
+          <w:rFonts w:ascii="Calibri" w:hAnsi="Calibri" w:eastAsia="Microsoft YaHei"/>
+          <w:b/>
+          <w:color w:val="2E74B5"/>
+          <w:sz w:val="32"/>
+        </w:rPr>
+        <w:t>11. 下一步</w:t>
       </w:r>
     </w:p>
     <w:tbl>
@@ -4508,7 +7264,7 @@
                 <w:b w:val="0"/>
                 <w:sz w:val="16"/>
               </w:rPr>
-              <w:t>动力代表算例</w:t>
+              <w:t>长时程 Newmark 对照</w:t>
             </w:r>
           </w:p>
         </w:tc>
@@ -4528,7 +7284,7 @@
                 <w:b w:val="0"/>
                 <w:sz w:val="16"/>
               </w:rPr>
-              <w:t>未完成；已有 Newmark 函数与历史脚本</w:t>
+              <w:t>30x30 全量 Newmark 交互运行过慢</w:t>
             </w:r>
           </w:p>
         </w:tc>
@@ -4548,7 +7304,7 @@
                 <w:b w:val="0"/>
                 <w:sz w:val="16"/>
               </w:rPr>
-              <w:t>封装统一入口，输出时程和峰值</w:t>
+              <w:t>可作为夜间长任务补 1 个对照窗</w:t>
             </w:r>
           </w:p>
         </w:tc>

</xml_diff>